<commit_message>
Atualizacao do Documento de requisitos e adicao dos padroes de codificacao, padroes do Git e gitIgnore
</commit_message>
<xml_diff>
--- a/docs/documento_requisitos/Documento de Requisitos - PitScore.docx
+++ b/docs/documento_requisitos/Documento de Requisitos - PitScore.docx
@@ -604,12 +604,12 @@
             </w:tabs>
             <w:rPr/>
           </w:pPr>
-          <w:hyperlink w:anchor="__RefHeading___Toc16068_4016492415" w:tooltip="Entidade Seleção (CRUD Simples)">
+          <w:hyperlink w:anchor="__RefHeading___Toc16068_4016492415" w:tooltip="Entidade Estádio (CRUD Simples)">
             <w:r>
               <w:rPr>
                 <w:rStyle w:val="IndexLink"/>
               </w:rPr>
-              <w:t>Entidade Seleção (CRUD Simples)</w:t>
+              <w:t>Entidade Estádio (CRUD Simples)</w:t>
               <w:tab/>
               <w:t>2</w:t>
             </w:r>
@@ -631,7 +631,7 @@
               </w:rPr>
               <w:t>Entidade Jogador</w:t>
               <w:tab/>
-              <w:t>3</w:t>
+              <w:t>4</w:t>
             </w:r>
           </w:hyperlink>
         </w:p>
@@ -651,7 +651,7 @@
               </w:rPr>
               <w:t>Entidade Partida (CRUD Complexo)</w:t>
               <w:tab/>
-              <w:t>4</w:t>
+              <w:t>5</w:t>
             </w:r>
           </w:hyperlink>
         </w:p>
@@ -671,7 +671,7 @@
               </w:rPr>
               <w:t>Acompanhamento da Copa</w:t>
               <w:tab/>
-              <w:t>5</w:t>
+              <w:t>7</w:t>
             </w:r>
           </w:hyperlink>
         </w:p>
@@ -691,7 +691,7 @@
               </w:rPr>
               <w:t>Dados da Partida</w:t>
               <w:tab/>
-              <w:t>6</w:t>
+              <w:t>8</w:t>
             </w:r>
           </w:hyperlink>
         </w:p>
@@ -711,7 +711,7 @@
               </w:rPr>
               <w:t>Simulador</w:t>
               <w:tab/>
-              <w:t>7</w:t>
+              <w:t>9</w:t>
             </w:r>
           </w:hyperlink>
         </w:p>
@@ -731,7 +731,7 @@
               </w:rPr>
               <w:t>Requisitos não funcionais</w:t>
               <w:tab/>
-              <w:t>9</w:t>
+              <w:t>11</w:t>
             </w:r>
           </w:hyperlink>
         </w:p>
@@ -751,7 +751,7 @@
               </w:rPr>
               <w:t>Usabilidade</w:t>
               <w:tab/>
-              <w:t>9</w:t>
+              <w:t>11</w:t>
             </w:r>
           </w:hyperlink>
         </w:p>
@@ -771,7 +771,7 @@
               </w:rPr>
               <w:t>Confiabilidade</w:t>
               <w:tab/>
-              <w:t>9</w:t>
+              <w:t>11</w:t>
             </w:r>
           </w:hyperlink>
         </w:p>
@@ -791,7 +791,7 @@
               </w:rPr>
               <w:t>Desempenho</w:t>
               <w:tab/>
-              <w:t>9</w:t>
+              <w:t>11</w:t>
             </w:r>
           </w:hyperlink>
         </w:p>
@@ -811,7 +811,7 @@
               </w:rPr>
               <w:t>Segurança</w:t>
               <w:tab/>
-              <w:t>10</w:t>
+              <w:t>12</w:t>
             </w:r>
           </w:hyperlink>
         </w:p>
@@ -831,7 +831,7 @@
               </w:rPr>
               <w:t>Hardware e software</w:t>
               <w:tab/>
-              <w:t>10</w:t>
+              <w:t>12</w:t>
             </w:r>
           </w:hyperlink>
         </w:p>
@@ -1468,7 +1468,7 @@
         <mc:AlternateContent>
           <mc:Choice Requires="wps">
             <w:drawing>
-              <wp:anchor behindDoc="0" distT="0" distB="0" distL="111760" distR="114300" simplePos="0" locked="0" layoutInCell="0" allowOverlap="1" relativeHeight="2">
+              <wp:anchor behindDoc="0" distT="0" distB="0" distL="109855" distR="114300" simplePos="0" locked="0" layoutInCell="0" allowOverlap="1" relativeHeight="2">
                 <wp:simplePos x="0" y="0"/>
                 <wp:positionH relativeFrom="page">
                   <wp:posOffset>6309995</wp:posOffset>
@@ -1540,7 +1540,7 @@
                                 <v:shape id="ole_rId14" type="_x0000_tole_rId14" style="width:29.05pt;height:37pt;mso-wrap-distance-right:0pt;mso-wrap-distance-bottom:24pt" filled="f" o:ole="">
                                   <v:imagedata r:id="rId15" o:title=""/>
                                 </v:shape>
-                                <o:OLEObject Type="Embed" ProgID="" ShapeID="ole_rId14" DrawAspect="Content" ObjectID="_651603533" r:id="rId14"/>
+                                <o:OLEObject Type="Embed" ProgID="" ShapeID="ole_rId14" DrawAspect="Content" ObjectID="_1226069245" r:id="rId14"/>
                               </w:object>
                             </w:r>
                           </w:p>
@@ -1597,7 +1597,7 @@
                           <v:shape id="ole_rId16" type="_x0000_tole_rId16" style="width:29.05pt;height:37pt;mso-wrap-distance-right:0pt;mso-wrap-distance-bottom:24pt" filled="f" o:ole="">
                             <v:imagedata r:id="rId17" o:title=""/>
                           </v:shape>
-                          <o:OLEObject Type="Embed" ProgID="" ShapeID="ole_rId16" DrawAspect="Content" ObjectID="_1310919488" r:id="rId16"/>
+                          <o:OLEObject Type="Embed" ProgID="" ShapeID="ole_rId16" DrawAspect="Content" ObjectID="_1456951055" r:id="rId16"/>
                         </w:object>
                       </w:r>
                     </w:p>
@@ -2538,7 +2538,7 @@
       <w:r>
         <w:rPr/>
         <w:drawing>
-          <wp:anchor behindDoc="0" distT="0" distB="0" distL="0" distR="0" simplePos="0" locked="0" layoutInCell="0" allowOverlap="1" relativeHeight="17">
+          <wp:anchor behindDoc="0" distT="0" distB="0" distL="0" distR="0" simplePos="0" locked="0" layoutInCell="0" allowOverlap="1" relativeHeight="13">
             <wp:simplePos x="0" y="0"/>
             <wp:positionH relativeFrom="column">
               <wp:align>center</wp:align>
@@ -2548,7 +2548,7 @@
             </wp:positionV>
             <wp:extent cx="4744720" cy="4963160"/>
             <wp:effectExtent l="0" t="0" r="0" b="0"/>
-            <wp:wrapSquare wrapText="largest"/>
+            <wp:wrapSquare wrapText="right"/>
             <wp:docPr id="3" name="Image1"/>
             <wp:cNvGraphicFramePr>
               <a:graphicFrameLocks xmlns:a="http://schemas.openxmlformats.org/drawingml/2006/main" noChangeAspect="1"/>
@@ -2790,7 +2790,7 @@
       </w:pPr>
       <w:r>
         <w:drawing>
-          <wp:anchor behindDoc="0" distT="0" distB="0" distL="0" distR="0" simplePos="0" locked="0" layoutInCell="0" allowOverlap="1" relativeHeight="18">
+          <wp:anchor behindDoc="0" distT="0" distB="0" distL="0" distR="0" simplePos="0" locked="0" layoutInCell="0" allowOverlap="1" relativeHeight="14">
             <wp:simplePos x="0" y="0"/>
             <wp:positionH relativeFrom="column">
               <wp:posOffset>519430</wp:posOffset>
@@ -2800,7 +2800,7 @@
             </wp:positionV>
             <wp:extent cx="5688330" cy="6543675"/>
             <wp:effectExtent l="0" t="0" r="0" b="0"/>
-            <wp:wrapSquare wrapText="largest"/>
+            <wp:wrapSquare wrapText="right"/>
             <wp:docPr id="4" name="Image2"/>
             <wp:cNvGraphicFramePr>
               <a:graphicFrameLocks xmlns:a="http://schemas.openxmlformats.org/drawingml/2006/main" noChangeAspect="1"/>
@@ -2875,7 +2875,7 @@
         <mc:AlternateContent>
           <mc:Choice Requires="wps">
             <w:drawing>
-              <wp:anchor behindDoc="0" distT="0" distB="0" distL="111760" distR="114300" simplePos="0" locked="0" layoutInCell="0" allowOverlap="1" relativeHeight="4">
+              <wp:anchor behindDoc="0" distT="0" distB="0" distL="109855" distR="114300" simplePos="0" locked="0" layoutInCell="0" allowOverlap="1" relativeHeight="4">
                 <wp:simplePos x="0" y="0"/>
                 <wp:positionH relativeFrom="page">
                   <wp:posOffset>6309995</wp:posOffset>
@@ -2947,7 +2947,7 @@
                                 <v:shape id="ole_rId28" type="_x0000_tole_rId28" style="width:29.05pt;height:37pt;mso-wrap-distance-right:0pt;mso-wrap-distance-bottom:24pt" filled="f" o:ole="">
                                   <v:imagedata r:id="rId29" o:title=""/>
                                 </v:shape>
-                                <o:OLEObject Type="Embed" ProgID="" ShapeID="ole_rId28" DrawAspect="Content" ObjectID="_2106269397" r:id="rId28"/>
+                                <o:OLEObject Type="Embed" ProgID="" ShapeID="ole_rId28" DrawAspect="Content" ObjectID="_41368092" r:id="rId28"/>
                               </w:object>
                             </w:r>
                           </w:p>
@@ -3004,7 +3004,7 @@
                           <v:shape id="ole_rId30" type="_x0000_tole_rId30" style="width:29.05pt;height:37pt;mso-wrap-distance-right:0pt;mso-wrap-distance-bottom:24pt" filled="f" o:ole="">
                             <v:imagedata r:id="rId31" o:title=""/>
                           </v:shape>
-                          <o:OLEObject Type="Embed" ProgID="" ShapeID="ole_rId30" DrawAspect="Content" ObjectID="_1571815285" r:id="rId30"/>
+                          <o:OLEObject Type="Embed" ProgID="" ShapeID="ole_rId30" DrawAspect="Content" ObjectID="_1221212610" r:id="rId30"/>
                         </w:object>
                       </w:r>
                     </w:p>
@@ -3587,7 +3587,7 @@
             </w:pPr>
             <w:r>
               <w:rPr/>
-              <w:t>2. Exibir formulário de cadastro.</w:t>
+              <w:t>2. Exibir o formulário de cadastro.</w:t>
             </w:r>
           </w:p>
           <w:p>
@@ -3607,7 +3607,37 @@
             </w:pPr>
             <w:r>
               <w:rPr/>
-              <w:t>6. Gravar o usuário e exibir mensagem de sucesso.</w:t>
+              <w:t>6. Aplicar as regras de negócio (e-mail único e senha com no mínimo 8 caracteres).</w:t>
+            </w:r>
+          </w:p>
+          <w:p>
+            <w:pPr>
+              <w:pStyle w:val="Normal"/>
+              <w:rPr/>
+            </w:pPr>
+            <w:r>
+              <w:rPr/>
+              <w:t>7. Gravar o usuário no banco de dados.</w:t>
+            </w:r>
+          </w:p>
+          <w:p>
+            <w:pPr>
+              <w:pStyle w:val="Normal"/>
+              <w:rPr/>
+            </w:pPr>
+            <w:r>
+              <w:rPr/>
+              <w:t>8. Enviar a mensagem “cadastro realizado com sucesso”.</w:t>
+            </w:r>
+          </w:p>
+          <w:p>
+            <w:pPr>
+              <w:pStyle w:val="Normal"/>
+              <w:rPr/>
+            </w:pPr>
+            <w:r>
+              <w:rPr/>
+              <w:t>9. Redirecionar para a tela I_Login.</w:t>
             </w:r>
           </w:p>
         </w:tc>
@@ -4271,17 +4301,47 @@
             </w:pPr>
             <w:r>
               <w:rPr/>
-              <w:t>2. Validar as credenciais.</w:t>
-            </w:r>
-          </w:p>
-          <w:p>
-            <w:pPr>
-              <w:pStyle w:val="Normal"/>
-              <w:rPr/>
-            </w:pPr>
-            <w:r>
-              <w:rPr/>
-              <w:t>4. Iniciar a sessão e redirecionar ao painel principal.</w:t>
+              <w:t>2. Validar as credenciais informadas.</w:t>
+            </w:r>
+          </w:p>
+          <w:p>
+            <w:pPr>
+              <w:pStyle w:val="Normal"/>
+              <w:rPr/>
+            </w:pPr>
+            <w:r>
+              <w:rPr/>
+              <w:t>4. Aplicar a regra de negócio de bloqueio (após 5 tentativas inválidas consecutivas, bloquear o acesso por 1 minuto).</w:t>
+            </w:r>
+          </w:p>
+          <w:p>
+            <w:pPr>
+              <w:pStyle w:val="Normal"/>
+              <w:rPr/>
+            </w:pPr>
+            <w:r>
+              <w:rPr/>
+              <w:t>5. Buscar o usuário e conferir a senha no banco de dados.</w:t>
+            </w:r>
+          </w:p>
+          <w:p>
+            <w:pPr>
+              <w:pStyle w:val="Normal"/>
+              <w:rPr/>
+            </w:pPr>
+            <w:r>
+              <w:rPr/>
+              <w:t>6. Enviar a mensagem “e-mail ou senha incorretos” quando as credenciais forem inválidas.</w:t>
+            </w:r>
+          </w:p>
+          <w:p>
+            <w:pPr>
+              <w:pStyle w:val="Normal"/>
+              <w:rPr/>
+            </w:pPr>
+            <w:r>
+              <w:rPr/>
+              <w:t>7. Iniciar a sessão e redirecionar para a tela I_PainelPrincipal.</w:t>
             </w:r>
           </w:p>
         </w:tc>
@@ -4725,7 +4785,7 @@
             </w:pPr>
             <w:r>
               <w:rPr/>
-              <w:t>O usuário deve estar logado.</w:t>
+              <w:t>O usuário deve estar logado e na tela I_PainelPrincipal.</w:t>
             </w:r>
           </w:p>
         </w:tc>
@@ -4925,7 +4985,47 @@
             </w:pPr>
             <w:r>
               <w:rPr/>
-              <w:t>2. Encerrar a sessão e redirecionar à tela de login.</w:t>
+              <w:t>2. Validar a sessão ativa do usuário.</w:t>
+            </w:r>
+          </w:p>
+          <w:p>
+            <w:pPr>
+              <w:pStyle w:val="Normal"/>
+              <w:rPr/>
+            </w:pPr>
+            <w:r>
+              <w:rPr/>
+              <w:t>3. Aplicar a regra de negócio de encerramento de sessão.</w:t>
+            </w:r>
+          </w:p>
+          <w:p>
+            <w:pPr>
+              <w:pStyle w:val="Normal"/>
+              <w:rPr/>
+            </w:pPr>
+            <w:r>
+              <w:rPr/>
+              <w:t>4. Encerrar a sessão no banco de dados.</w:t>
+            </w:r>
+          </w:p>
+          <w:p>
+            <w:pPr>
+              <w:pStyle w:val="Normal"/>
+              <w:rPr/>
+            </w:pPr>
+            <w:r>
+              <w:rPr/>
+              <w:t>5. Enviar a mensagem “sessão encerrada com sucesso”.</w:t>
+            </w:r>
+          </w:p>
+          <w:p>
+            <w:pPr>
+              <w:pStyle w:val="Normal"/>
+              <w:rPr/>
+            </w:pPr>
+            <w:r>
+              <w:rPr/>
+              <w:t>6. Redirecionar para a tela I_Login.</w:t>
             </w:r>
           </w:p>
         </w:tc>
@@ -5083,7 +5183,7 @@
       <w:bookmarkEnd w:id="21"/>
       <w:r>
         <w:rPr/>
-        <w:t>Entidade Seleção (CRUD Simples)</w:t>
+        <w:t>Entidade Estádio (CRUD Simples)</w:t>
       </w:r>
       <w:bookmarkEnd w:id="22"/>
     </w:p>
@@ -5097,7 +5197,11 @@
       <w:bookmarkEnd w:id="23"/>
       <w:r>
         <w:rPr/>
-        <w:t>[RF004] Cadastrar Seleção</w:t>
+        <w:t xml:space="preserve">[RF004] Cadastrar </w:t>
+      </w:r>
+      <w:r>
+        <w:rPr/>
+        <w:t>Estádio</w:t>
       </w:r>
     </w:p>
     <w:tbl>
@@ -5173,7 +5277,7 @@
                 <w:sz w:val="24"/>
                 <w:szCs w:val="24"/>
               </w:rPr>
-              <w:t>Cadastrar Seleção</w:t>
+              <w:t>Cadastrar Estádio</w:t>
             </w:r>
           </w:p>
         </w:tc>
@@ -5326,7 +5430,7 @@
             </w:pPr>
             <w:r>
               <w:rPr/>
-              <w:t>Cadastrar uma seleção participante e associá-la a um grupo.</w:t>
+              <w:t>Cadastrar um estádio onde as partidas da Copa são realizadas.</w:t>
             </w:r>
           </w:p>
         </w:tc>
@@ -5377,7 +5481,7 @@
             </w:pPr>
             <w:r>
               <w:rPr/>
-              <w:t>O administrador deve estar logado e na tela I_CadastrarSelecao.</w:t>
+              <w:t>O administrador deve estar logado e na tela I_CadastrarEstadio.</w:t>
             </w:r>
           </w:p>
         </w:tc>
@@ -5428,7 +5532,7 @@
             </w:pPr>
             <w:r>
               <w:rPr/>
-              <w:t>Seleção gravada no sistema.</w:t>
+              <w:t>Estádio gravado no sistema.</w:t>
             </w:r>
           </w:p>
         </w:tc>
@@ -5479,7 +5583,7 @@
             </w:pPr>
             <w:r>
               <w:rPr/>
-              <w:t>I_CadastrarSelecao</w:t>
+              <w:t>I_CadastrarEstadio</w:t>
             </w:r>
           </w:p>
         </w:tc>
@@ -5542,7 +5646,7 @@
             </w:pPr>
             <w:r>
               <w:rPr/>
-              <w:t>1. Informar nome, país, bandeira e grupo.</w:t>
+              <w:t>1. Informar nome, cidade, país e capacidade.</w:t>
             </w:r>
           </w:p>
           <w:p>
@@ -5587,17 +5691,47 @@
             </w:pPr>
             <w:r>
               <w:rPr/>
-              <w:t>2. Validar os dados.</w:t>
-            </w:r>
-          </w:p>
-          <w:p>
-            <w:pPr>
-              <w:pStyle w:val="Normal"/>
-              <w:rPr/>
-            </w:pPr>
-            <w:r>
-              <w:rPr/>
-              <w:t>4. Gravar a seleção e exibir mensagem de sucesso.</w:t>
+              <w:t>2. Validar os dados informados.</w:t>
+            </w:r>
+          </w:p>
+          <w:p>
+            <w:pPr>
+              <w:pStyle w:val="Normal"/>
+              <w:rPr/>
+            </w:pPr>
+            <w:r>
+              <w:rPr/>
+              <w:t>4. Aplicar as regras de negócio (nome único e capacidade maior que zero).</w:t>
+            </w:r>
+          </w:p>
+          <w:p>
+            <w:pPr>
+              <w:pStyle w:val="Normal"/>
+              <w:rPr/>
+            </w:pPr>
+            <w:r>
+              <w:rPr/>
+              <w:t>5. Gravar o estádio no banco de dados.</w:t>
+            </w:r>
+          </w:p>
+          <w:p>
+            <w:pPr>
+              <w:pStyle w:val="Normal"/>
+              <w:rPr/>
+            </w:pPr>
+            <w:r>
+              <w:rPr/>
+              <w:t>6. Enviar a mensagem “estádio cadastrado com sucesso”.</w:t>
+            </w:r>
+          </w:p>
+          <w:p>
+            <w:pPr>
+              <w:pStyle w:val="Normal"/>
+              <w:rPr/>
+            </w:pPr>
+            <w:r>
+              <w:rPr/>
+              <w:t>7. Redirecionar para a tela I_Estadios.</w:t>
             </w:r>
           </w:p>
         </w:tc>
@@ -5685,7 +5819,7 @@
             </w:pPr>
             <w:r>
               <w:rPr/>
-              <w:t>2a. Caso o nome já exista, exibir “seleção já cadastrada”.</w:t>
+              <w:t>2a. Caso o nome já exista, exibir a mensagem “estádio já cadastrado”.</w:t>
             </w:r>
           </w:p>
         </w:tc>
@@ -5736,17 +5870,17 @@
             </w:pPr>
             <w:r>
               <w:rPr/>
-              <w:t>1 – O nome da seleção deve ser único.</w:t>
-            </w:r>
-          </w:p>
-          <w:p>
-            <w:pPr>
-              <w:pStyle w:val="Normal"/>
-              <w:rPr/>
-            </w:pPr>
-            <w:r>
-              <w:rPr/>
-              <w:t>2 – O grupo informado deve existir previamente.</w:t>
+              <w:t>1 – O nome do estádio deve ser único.</w:t>
+            </w:r>
+          </w:p>
+          <w:p>
+            <w:pPr>
+              <w:pStyle w:val="Normal"/>
+              <w:rPr/>
+            </w:pPr>
+            <w:r>
+              <w:rPr/>
+              <w:t>2 – A capacidade deve ser maior que zero.</w:t>
             </w:r>
           </w:p>
         </w:tc>
@@ -5771,7 +5905,11 @@
       <w:bookmarkEnd w:id="24"/>
       <w:r>
         <w:rPr/>
-        <w:t>[RF005] Consultar Seleção</w:t>
+        <w:t xml:space="preserve">[RF005] Consultar </w:t>
+      </w:r>
+      <w:r>
+        <w:rPr/>
+        <w:t>Estádio</w:t>
       </w:r>
     </w:p>
     <w:tbl>
@@ -5847,7 +5985,7 @@
                 <w:sz w:val="24"/>
                 <w:szCs w:val="24"/>
               </w:rPr>
-              <w:t>Consultar Seleção</w:t>
+              <w:t>Consultar Estádio</w:t>
             </w:r>
           </w:p>
         </w:tc>
@@ -6000,7 +6138,7 @@
             </w:pPr>
             <w:r>
               <w:rPr/>
-              <w:t>Exibir os dados de uma seleção.</w:t>
+              <w:t>Exibir os dados de um estádio.</w:t>
             </w:r>
           </w:p>
         </w:tc>
@@ -6051,7 +6189,7 @@
             </w:pPr>
             <w:r>
               <w:rPr/>
-              <w:t>O usuário deve estar logado.</w:t>
+              <w:t>O usuário deve estar logado e na tela I_Estadios.</w:t>
             </w:r>
           </w:p>
         </w:tc>
@@ -6102,7 +6240,7 @@
             </w:pPr>
             <w:r>
               <w:rPr/>
-              <w:t>Dados da seleção exibidos.</w:t>
+              <w:t>Dados do estádio exibidos.</w:t>
             </w:r>
           </w:p>
         </w:tc>
@@ -6153,7 +6291,7 @@
             </w:pPr>
             <w:r>
               <w:rPr/>
-              <w:t>I_Selecoes, I_DetalheSelecao</w:t>
+              <w:t>I_Estadios, I_DetalheEstadio</w:t>
             </w:r>
           </w:p>
         </w:tc>
@@ -6216,7 +6354,7 @@
             </w:pPr>
             <w:r>
               <w:rPr/>
-              <w:t>1. Selecionar uma seleção na listagem.</w:t>
+              <w:t>1. Selecionar um estádio na listagem.</w:t>
             </w:r>
           </w:p>
         </w:tc>
@@ -6251,7 +6389,47 @@
             </w:pPr>
             <w:r>
               <w:rPr/>
-              <w:t>2. Exibir os dados da seleção (país, grupo e elenco).</w:t>
+              <w:t>2. Validar o estádio selecionado e a permissão do usuário.</w:t>
+            </w:r>
+          </w:p>
+          <w:p>
+            <w:pPr>
+              <w:pStyle w:val="Normal"/>
+              <w:rPr/>
+            </w:pPr>
+            <w:r>
+              <w:rPr/>
+              <w:t>3. Aplicar as regras de negócio de exibição (apresentar apenas estádios cadastrados).</w:t>
+            </w:r>
+          </w:p>
+          <w:p>
+            <w:pPr>
+              <w:pStyle w:val="Normal"/>
+              <w:rPr/>
+            </w:pPr>
+            <w:r>
+              <w:rPr/>
+              <w:t>4. Buscar os dados do estádio no banco de dados.</w:t>
+            </w:r>
+          </w:p>
+          <w:p>
+            <w:pPr>
+              <w:pStyle w:val="Normal"/>
+              <w:rPr/>
+            </w:pPr>
+            <w:r>
+              <w:rPr/>
+              <w:t>5. Enviar a mensagem “estádio não encontrado” caso não exista.</w:t>
+            </w:r>
+          </w:p>
+          <w:p>
+            <w:pPr>
+              <w:pStyle w:val="Normal"/>
+              <w:rPr/>
+            </w:pPr>
+            <w:r>
+              <w:rPr/>
+              <w:t>6. Exibir os dados do estádio (nome, cidade, país e capacidade) na tela I_DetalheEstadio.</w:t>
             </w:r>
           </w:p>
         </w:tc>
@@ -6404,7 +6582,11 @@
       <w:bookmarkEnd w:id="25"/>
       <w:r>
         <w:rPr/>
-        <w:t>[RF006] Alterar Seleção</w:t>
+        <w:t xml:space="preserve">[RF006] Alterar </w:t>
+      </w:r>
+      <w:r>
+        <w:rPr/>
+        <w:t>Estádio</w:t>
       </w:r>
     </w:p>
     <w:tbl>
@@ -6480,7 +6662,7 @@
                 <w:sz w:val="24"/>
                 <w:szCs w:val="24"/>
               </w:rPr>
-              <w:t>Alterar Seleção</w:t>
+              <w:t>Alterar Estádio</w:t>
             </w:r>
           </w:p>
         </w:tc>
@@ -6633,7 +6815,7 @@
             </w:pPr>
             <w:r>
               <w:rPr/>
-              <w:t>Alterar os dados de uma seleção já cadastrada.</w:t>
+              <w:t>Alterar os dados de um estádio já cadastrado.</w:t>
             </w:r>
           </w:p>
         </w:tc>
@@ -6684,7 +6866,7 @@
             </w:pPr>
             <w:r>
               <w:rPr/>
-              <w:t>O administrador deve estar logado e a seleção deve existir.</w:t>
+              <w:t>O administrador deve estar logado, na tela I_Estadios, e o estádio deve existir.</w:t>
             </w:r>
           </w:p>
         </w:tc>
@@ -6735,7 +6917,7 @@
             </w:pPr>
             <w:r>
               <w:rPr/>
-              <w:t>Dados da seleção atualizados.</w:t>
+              <w:t>Dados do estádio atualizados.</w:t>
             </w:r>
           </w:p>
         </w:tc>
@@ -6786,7 +6968,7 @@
             </w:pPr>
             <w:r>
               <w:rPr/>
-              <w:t>I_CadastrarSelecao</w:t>
+              <w:t>I_CadastrarEstadio</w:t>
             </w:r>
           </w:p>
         </w:tc>
@@ -6849,7 +7031,7 @@
             </w:pPr>
             <w:r>
               <w:rPr/>
-              <w:t>1. Selecionar a seleção a alterar.</w:t>
+              <w:t>1. Selecionar o estádio a alterar.</w:t>
             </w:r>
           </w:p>
           <w:p>
@@ -6904,27 +7086,57 @@
             </w:pPr>
             <w:r>
               <w:rPr/>
-              <w:t>2. Exibir os dados atuais.</w:t>
-            </w:r>
-          </w:p>
-          <w:p>
-            <w:pPr>
-              <w:pStyle w:val="Normal"/>
-              <w:rPr/>
-            </w:pPr>
-            <w:r>
-              <w:rPr/>
-              <w:t>4. Validar os dados.</w:t>
-            </w:r>
-          </w:p>
-          <w:p>
-            <w:pPr>
-              <w:pStyle w:val="Normal"/>
-              <w:rPr/>
-            </w:pPr>
-            <w:r>
-              <w:rPr/>
-              <w:t>6. Gravar as alterações.</w:t>
+              <w:t>2. Buscar e exibir os dados atuais do estádio na tela I_CadastrarEstadio.</w:t>
+            </w:r>
+          </w:p>
+          <w:p>
+            <w:pPr>
+              <w:pStyle w:val="Normal"/>
+              <w:rPr/>
+            </w:pPr>
+            <w:r>
+              <w:rPr/>
+              <w:t>4. Validar os dados informados.</w:t>
+            </w:r>
+          </w:p>
+          <w:p>
+            <w:pPr>
+              <w:pStyle w:val="Normal"/>
+              <w:rPr/>
+            </w:pPr>
+            <w:r>
+              <w:rPr/>
+              <w:t>6. Aplicar a regra de negócio (o nome deve permanecer único).</w:t>
+            </w:r>
+          </w:p>
+          <w:p>
+            <w:pPr>
+              <w:pStyle w:val="Normal"/>
+              <w:rPr/>
+            </w:pPr>
+            <w:r>
+              <w:rPr/>
+              <w:t>7. Gravar as alterações no banco de dados.</w:t>
+            </w:r>
+          </w:p>
+          <w:p>
+            <w:pPr>
+              <w:pStyle w:val="Normal"/>
+              <w:rPr/>
+            </w:pPr>
+            <w:r>
+              <w:rPr/>
+              <w:t>8. Enviar a mensagem “estádio alterado com sucesso”.</w:t>
+            </w:r>
+          </w:p>
+          <w:p>
+            <w:pPr>
+              <w:pStyle w:val="Normal"/>
+              <w:rPr/>
+            </w:pPr>
+            <w:r>
+              <w:rPr/>
+              <w:t>9. Redirecionar para a tela I_Estadios.</w:t>
             </w:r>
           </w:p>
         </w:tc>
@@ -7053,7 +7265,7 @@
             </w:pPr>
             <w:r>
               <w:rPr/>
-              <w:t>1 – O nome da seleção deve permanecer único.</w:t>
+              <w:t>1 – O nome do estádio deve permanecer único.</w:t>
             </w:r>
           </w:p>
         </w:tc>
@@ -7078,7 +7290,11 @@
       <w:bookmarkEnd w:id="26"/>
       <w:r>
         <w:rPr/>
-        <w:t>[RF007] Excluir Seleção</w:t>
+        <w:t xml:space="preserve">[RF007] Excluir </w:t>
+      </w:r>
+      <w:r>
+        <w:rPr/>
+        <w:t>Estádio</w:t>
       </w:r>
     </w:p>
     <w:tbl>
@@ -7154,7 +7370,7 @@
                 <w:sz w:val="24"/>
                 <w:szCs w:val="24"/>
               </w:rPr>
-              <w:t>Excluir Seleção</w:t>
+              <w:t>Excluir Estádio</w:t>
             </w:r>
           </w:p>
         </w:tc>
@@ -7307,7 +7523,7 @@
             </w:pPr>
             <w:r>
               <w:rPr/>
-              <w:t>Remover uma seleção do sistema.</w:t>
+              <w:t>Remover um estádio do sistema.</w:t>
             </w:r>
           </w:p>
         </w:tc>
@@ -7358,7 +7574,7 @@
             </w:pPr>
             <w:r>
               <w:rPr/>
-              <w:t>O administrador deve estar logado e a seleção deve existir.</w:t>
+              <w:t>O administrador deve estar logado, na tela I_Estadios, e o estádio deve existir.</w:t>
             </w:r>
           </w:p>
         </w:tc>
@@ -7409,7 +7625,7 @@
             </w:pPr>
             <w:r>
               <w:rPr/>
-              <w:t>Seleção removida.</w:t>
+              <w:t>Estádio removido.</w:t>
             </w:r>
           </w:p>
         </w:tc>
@@ -7460,7 +7676,7 @@
             </w:pPr>
             <w:r>
               <w:rPr/>
-              <w:t>I_Selecoes</w:t>
+              <w:t>I_Estadios</w:t>
             </w:r>
           </w:p>
         </w:tc>
@@ -7523,7 +7739,7 @@
             </w:pPr>
             <w:r>
               <w:rPr/>
-              <w:t>1. Selecionar a seleção a excluir.</w:t>
+              <w:t>1. Selecionar o estádio a excluir.</w:t>
             </w:r>
           </w:p>
           <w:p>
@@ -7568,17 +7784,57 @@
             </w:pPr>
             <w:r>
               <w:rPr/>
-              <w:t>2. Solicitar confirmação.</w:t>
-            </w:r>
-          </w:p>
-          <w:p>
-            <w:pPr>
-              <w:pStyle w:val="Normal"/>
-              <w:rPr/>
-            </w:pPr>
-            <w:r>
-              <w:rPr/>
-              <w:t>4. Remover a seleção.</w:t>
+              <w:t>2. Solicitar a confirmação da exclusão.</w:t>
+            </w:r>
+          </w:p>
+          <w:p>
+            <w:pPr>
+              <w:pStyle w:val="Normal"/>
+              <w:rPr/>
+            </w:pPr>
+            <w:r>
+              <w:rPr/>
+              <w:t>4. Validar o estádio selecionado.</w:t>
+            </w:r>
+          </w:p>
+          <w:p>
+            <w:pPr>
+              <w:pStyle w:val="Normal"/>
+              <w:rPr/>
+            </w:pPr>
+            <w:r>
+              <w:rPr/>
+              <w:t>5. Aplicar a regra de negócio (bloquear a exclusão se o estádio estiver vinculado a alguma partida).</w:t>
+            </w:r>
+          </w:p>
+          <w:p>
+            <w:pPr>
+              <w:pStyle w:val="Normal"/>
+              <w:rPr/>
+            </w:pPr>
+            <w:r>
+              <w:rPr/>
+              <w:t>6. Remover o estádio do banco de dados.</w:t>
+            </w:r>
+          </w:p>
+          <w:p>
+            <w:pPr>
+              <w:pStyle w:val="Normal"/>
+              <w:rPr/>
+            </w:pPr>
+            <w:r>
+              <w:rPr/>
+              <w:t>7. Enviar a mensagem “estádio excluído com sucesso”.</w:t>
+            </w:r>
+          </w:p>
+          <w:p>
+            <w:pPr>
+              <w:pStyle w:val="Normal"/>
+              <w:rPr/>
+            </w:pPr>
+            <w:r>
+              <w:rPr/>
+              <w:t>8. Redirecionar para a tela I_Estadios.</w:t>
             </w:r>
           </w:p>
         </w:tc>
@@ -7717,7 +7973,7 @@
             </w:pPr>
             <w:r>
               <w:rPr/>
-              <w:t>1 – Uma seleção não pode ser excluída se estiver vinculada a alguma partida.</w:t>
+              <w:t>1 – Um estádio não pode ser excluído se estiver vinculado a alguma partida.</w:t>
             </w:r>
           </w:p>
         </w:tc>
@@ -8041,7 +8297,7 @@
             </w:pPr>
             <w:r>
               <w:rPr/>
-              <w:t>O administrador deve estar logado e a seleção deve existir.</w:t>
+              <w:t>O administrador deve estar logado, na tela I_CadastrarJogador, e a seleção deve existir.</w:t>
             </w:r>
           </w:p>
         </w:tc>
@@ -8251,17 +8507,47 @@
             </w:pPr>
             <w:r>
               <w:rPr/>
-              <w:t>2. Validar os dados.</w:t>
-            </w:r>
-          </w:p>
-          <w:p>
-            <w:pPr>
-              <w:pStyle w:val="Normal"/>
-              <w:rPr/>
-            </w:pPr>
-            <w:r>
-              <w:rPr/>
-              <w:t>4. Gravar o jogador.</w:t>
+              <w:t>2. Validar os dados informados.</w:t>
+            </w:r>
+          </w:p>
+          <w:p>
+            <w:pPr>
+              <w:pStyle w:val="Normal"/>
+              <w:rPr/>
+            </w:pPr>
+            <w:r>
+              <w:rPr/>
+              <w:t>4. Aplicar a regra de negócio (número da camisa único dentro da mesma seleção).</w:t>
+            </w:r>
+          </w:p>
+          <w:p>
+            <w:pPr>
+              <w:pStyle w:val="Normal"/>
+              <w:rPr/>
+            </w:pPr>
+            <w:r>
+              <w:rPr/>
+              <w:t>5. Gravar o jogador no banco de dados, vinculado à seleção.</w:t>
+            </w:r>
+          </w:p>
+          <w:p>
+            <w:pPr>
+              <w:pStyle w:val="Normal"/>
+              <w:rPr/>
+            </w:pPr>
+            <w:r>
+              <w:rPr/>
+              <w:t>6. Enviar a mensagem “jogador cadastrado com sucesso”.</w:t>
+            </w:r>
+          </w:p>
+          <w:p>
+            <w:pPr>
+              <w:pStyle w:val="Normal"/>
+              <w:rPr/>
+            </w:pPr>
+            <w:r>
+              <w:rPr/>
+              <w:t>7. Redirecionar para a tela I_Elenco.</w:t>
             </w:r>
           </w:p>
         </w:tc>
@@ -8695,7 +8981,7 @@
             </w:pPr>
             <w:r>
               <w:rPr/>
-              <w:t>O usuário deve estar logado.</w:t>
+              <w:t>O usuário deve estar logado e na tela I_Selecoes.</w:t>
             </w:r>
           </w:p>
         </w:tc>
@@ -8895,7 +9181,47 @@
             </w:pPr>
             <w:r>
               <w:rPr/>
-              <w:t>2. Listar os jogadores convocados da seleção.</w:t>
+              <w:t>2. Validar a seleção escolhida e a permissão do usuário.</w:t>
+            </w:r>
+          </w:p>
+          <w:p>
+            <w:pPr>
+              <w:pStyle w:val="Normal"/>
+              <w:rPr/>
+            </w:pPr>
+            <w:r>
+              <w:rPr/>
+              <w:t>3. Aplicar as regras de negócio de exibição (listar apenas jogadores convocados).</w:t>
+            </w:r>
+          </w:p>
+          <w:p>
+            <w:pPr>
+              <w:pStyle w:val="Normal"/>
+              <w:rPr/>
+            </w:pPr>
+            <w:r>
+              <w:rPr/>
+              <w:t>4. Buscar os jogadores convocados da seleção no banco de dados.</w:t>
+            </w:r>
+          </w:p>
+          <w:p>
+            <w:pPr>
+              <w:pStyle w:val="Normal"/>
+              <w:rPr/>
+            </w:pPr>
+            <w:r>
+              <w:rPr/>
+              <w:t>5. Enviar a mensagem “nenhum jogador convocado” caso a lista esteja vazia.</w:t>
+            </w:r>
+          </w:p>
+          <w:p>
+            <w:pPr>
+              <w:pStyle w:val="Normal"/>
+              <w:rPr/>
+            </w:pPr>
+            <w:r>
+              <w:rPr/>
+              <w:t>6. Exibir o elenco na tela I_Elenco.</w:t>
             </w:r>
           </w:p>
         </w:tc>
@@ -9347,7 +9673,7 @@
             </w:pPr>
             <w:r>
               <w:rPr/>
-              <w:t>O administrador deve estar logado; as seleções e o estádio devem existir.</w:t>
+              <w:t>O administrador deve estar logado, na tela I_CadastrarPartida; as seleções e o estádio devem existir.</w:t>
             </w:r>
           </w:p>
         </w:tc>
@@ -9557,17 +9883,47 @@
             </w:pPr>
             <w:r>
               <w:rPr/>
-              <w:t>2. Validar os dados.</w:t>
-            </w:r>
-          </w:p>
-          <w:p>
-            <w:pPr>
-              <w:pStyle w:val="Normal"/>
-              <w:rPr/>
-            </w:pPr>
-            <w:r>
-              <w:rPr/>
-              <w:t>4. Gravar a partida.</w:t>
+              <w:t>2. Validar os dados informados.</w:t>
+            </w:r>
+          </w:p>
+          <w:p>
+            <w:pPr>
+              <w:pStyle w:val="Normal"/>
+              <w:rPr/>
+            </w:pPr>
+            <w:r>
+              <w:rPr/>
+              <w:t>4. Aplicar as regras de negócio (mandante e visitante diferentes; seleções e estádio devem existir).</w:t>
+            </w:r>
+          </w:p>
+          <w:p>
+            <w:pPr>
+              <w:pStyle w:val="Normal"/>
+              <w:rPr/>
+            </w:pPr>
+            <w:r>
+              <w:rPr/>
+              <w:t>5. Gravar a partida no banco de dados.</w:t>
+            </w:r>
+          </w:p>
+          <w:p>
+            <w:pPr>
+              <w:pStyle w:val="Normal"/>
+              <w:rPr/>
+            </w:pPr>
+            <w:r>
+              <w:rPr/>
+              <w:t>6. Enviar a mensagem “partida cadastrada com sucesso”.</w:t>
+            </w:r>
+          </w:p>
+          <w:p>
+            <w:pPr>
+              <w:pStyle w:val="Normal"/>
+              <w:rPr/>
+            </w:pPr>
+            <w:r>
+              <w:rPr/>
+              <w:t>7. Redirecionar para a tela I_Agenda.</w:t>
             </w:r>
           </w:p>
         </w:tc>
@@ -10021,7 +10377,7 @@
             </w:pPr>
             <w:r>
               <w:rPr/>
-              <w:t>O usuário deve estar logado.</w:t>
+              <w:t>O usuário deve estar logado e na tela I_Agenda.</w:t>
             </w:r>
           </w:p>
         </w:tc>
@@ -10221,7 +10577,47 @@
             </w:pPr>
             <w:r>
               <w:rPr/>
-              <w:t>2. Exibir os dados da partida, incluindo odds e estatísticas quando disponíveis.</w:t>
+              <w:t>2. Validar a partida selecionada e a permissão do usuário.</w:t>
+            </w:r>
+          </w:p>
+          <w:p>
+            <w:pPr>
+              <w:pStyle w:val="Normal"/>
+              <w:rPr/>
+            </w:pPr>
+            <w:r>
+              <w:rPr/>
+              <w:t>3. Aplicar as regras de negócio de exibição (exibir odds e estatísticas apenas quando disponíveis).</w:t>
+            </w:r>
+          </w:p>
+          <w:p>
+            <w:pPr>
+              <w:pStyle w:val="Normal"/>
+              <w:rPr/>
+            </w:pPr>
+            <w:r>
+              <w:rPr/>
+              <w:t>4. Buscar os dados da partida no banco de dados.</w:t>
+            </w:r>
+          </w:p>
+          <w:p>
+            <w:pPr>
+              <w:pStyle w:val="Normal"/>
+              <w:rPr/>
+            </w:pPr>
+            <w:r>
+              <w:rPr/>
+              <w:t>5. Enviar a mensagem “partida não encontrada” caso não exista.</w:t>
+            </w:r>
+          </w:p>
+          <w:p>
+            <w:pPr>
+              <w:pStyle w:val="Normal"/>
+              <w:rPr/>
+            </w:pPr>
+            <w:r>
+              <w:rPr/>
+              <w:t>6. Exibir os dados da partida (seleções, estádio, fase, placar e status) na tela I_DetalhePartida.</w:t>
             </w:r>
           </w:p>
         </w:tc>
@@ -10654,7 +11050,7 @@
             </w:pPr>
             <w:r>
               <w:rPr/>
-              <w:t>O administrador deve estar logado e a partida deve existir.</w:t>
+              <w:t>O administrador deve estar logado, na tela I_Agenda, e a partida deve existir.</w:t>
             </w:r>
           </w:p>
         </w:tc>
@@ -10874,27 +11270,57 @@
             </w:pPr>
             <w:r>
               <w:rPr/>
-              <w:t>2. Exibir os dados atuais.</w:t>
-            </w:r>
-          </w:p>
-          <w:p>
-            <w:pPr>
-              <w:pStyle w:val="Normal"/>
-              <w:rPr/>
-            </w:pPr>
-            <w:r>
-              <w:rPr/>
-              <w:t>4. Validar os dados.</w:t>
-            </w:r>
-          </w:p>
-          <w:p>
-            <w:pPr>
-              <w:pStyle w:val="Normal"/>
-              <w:rPr/>
-            </w:pPr>
-            <w:r>
-              <w:rPr/>
-              <w:t>6. Gravar e, se encerrada, atualizar a classificação do grupo.</w:t>
+              <w:t>2. Buscar e exibir os dados atuais da partida na tela I_CadastrarPartida.</w:t>
+            </w:r>
+          </w:p>
+          <w:p>
+            <w:pPr>
+              <w:pStyle w:val="Normal"/>
+              <w:rPr/>
+            </w:pPr>
+            <w:r>
+              <w:rPr/>
+              <w:t>4. Validar os dados informados.</w:t>
+            </w:r>
+          </w:p>
+          <w:p>
+            <w:pPr>
+              <w:pStyle w:val="Normal"/>
+              <w:rPr/>
+            </w:pPr>
+            <w:r>
+              <w:rPr/>
+              <w:t>6. Aplicar as regras de negócio (placar não pode ser negativo; ao encerrar partida da fase de grupos, recalcular a classificação do grupo).</w:t>
+            </w:r>
+          </w:p>
+          <w:p>
+            <w:pPr>
+              <w:pStyle w:val="Normal"/>
+              <w:rPr/>
+            </w:pPr>
+            <w:r>
+              <w:rPr/>
+              <w:t>7. Gravar as alterações no banco de dados.</w:t>
+            </w:r>
+          </w:p>
+          <w:p>
+            <w:pPr>
+              <w:pStyle w:val="Normal"/>
+              <w:rPr/>
+            </w:pPr>
+            <w:r>
+              <w:rPr/>
+              <w:t>8. Enviar a mensagem “partida alterada com sucesso”.</w:t>
+            </w:r>
+          </w:p>
+          <w:p>
+            <w:pPr>
+              <w:pStyle w:val="Normal"/>
+              <w:rPr/>
+            </w:pPr>
+            <w:r>
+              <w:rPr/>
+              <w:t>9. Redirecionar para a tela I_Agenda.</w:t>
             </w:r>
           </w:p>
         </w:tc>
@@ -11338,7 +11764,7 @@
             </w:pPr>
             <w:r>
               <w:rPr/>
-              <w:t>O administrador deve estar logado e a partida deve existir.</w:t>
+              <w:t>O administrador deve estar logado, na tela I_Agenda, e a partida deve existir.</w:t>
             </w:r>
           </w:p>
         </w:tc>
@@ -11548,17 +11974,57 @@
             </w:pPr>
             <w:r>
               <w:rPr/>
-              <w:t>2. Solicitar confirmação.</w:t>
-            </w:r>
-          </w:p>
-          <w:p>
-            <w:pPr>
-              <w:pStyle w:val="Normal"/>
-              <w:rPr/>
-            </w:pPr>
-            <w:r>
-              <w:rPr/>
-              <w:t>4. Remover a partida e seus dados associados (odds e estatísticas).</w:t>
+              <w:t>2. Solicitar a confirmação da exclusão.</w:t>
+            </w:r>
+          </w:p>
+          <w:p>
+            <w:pPr>
+              <w:pStyle w:val="Normal"/>
+              <w:rPr/>
+            </w:pPr>
+            <w:r>
+              <w:rPr/>
+              <w:t>4. Validar a partida selecionada.</w:t>
+            </w:r>
+          </w:p>
+          <w:p>
+            <w:pPr>
+              <w:pStyle w:val="Normal"/>
+              <w:rPr/>
+            </w:pPr>
+            <w:r>
+              <w:rPr/>
+              <w:t>5. Aplicar a regra de negócio (remover também as odds e estatísticas vinculadas à partida).</w:t>
+            </w:r>
+          </w:p>
+          <w:p>
+            <w:pPr>
+              <w:pStyle w:val="Normal"/>
+              <w:rPr/>
+            </w:pPr>
+            <w:r>
+              <w:rPr/>
+              <w:t>6. Remover a partida do banco de dados.</w:t>
+            </w:r>
+          </w:p>
+          <w:p>
+            <w:pPr>
+              <w:pStyle w:val="Normal"/>
+              <w:rPr/>
+            </w:pPr>
+            <w:r>
+              <w:rPr/>
+              <w:t>7. Enviar a mensagem “partida excluída com sucesso”.</w:t>
+            </w:r>
+          </w:p>
+          <w:p>
+            <w:pPr>
+              <w:pStyle w:val="Normal"/>
+              <w:rPr/>
+            </w:pPr>
+            <w:r>
+              <w:rPr/>
+              <w:t>8. Redirecionar para a tela I_Agenda.</w:t>
             </w:r>
           </w:p>
         </w:tc>
@@ -12011,7 +12477,7 @@
             </w:pPr>
             <w:r>
               <w:rPr/>
-              <w:t>O usuário deve estar logado.</w:t>
+              <w:t>O usuário deve estar logado e na tela I_Agenda.</w:t>
             </w:r>
           </w:p>
         </w:tc>
@@ -12211,7 +12677,47 @@
             </w:pPr>
             <w:r>
               <w:rPr/>
-              <w:t>2. Listar as partidas da fase com data, seleções e placar.</w:t>
+              <w:t>2. Validar a fase selecionada e a permissão do usuário.</w:t>
+            </w:r>
+          </w:p>
+          <w:p>
+            <w:pPr>
+              <w:pStyle w:val="Normal"/>
+              <w:rPr/>
+            </w:pPr>
+            <w:r>
+              <w:rPr/>
+              <w:t>3. Aplicar as regras de negócio de filtragem (exibir apenas partidas da fase selecionada).</w:t>
+            </w:r>
+          </w:p>
+          <w:p>
+            <w:pPr>
+              <w:pStyle w:val="Normal"/>
+              <w:rPr/>
+            </w:pPr>
+            <w:r>
+              <w:rPr/>
+              <w:t>4. Buscar no banco de dados as partidas da fase.</w:t>
+            </w:r>
+          </w:p>
+          <w:p>
+            <w:pPr>
+              <w:pStyle w:val="Normal"/>
+              <w:rPr/>
+            </w:pPr>
+            <w:r>
+              <w:rPr/>
+              <w:t>5. Enviar a mensagem “nenhuma partida encontrada” caso a lista esteja vazia.</w:t>
+            </w:r>
+          </w:p>
+          <w:p>
+            <w:pPr>
+              <w:pStyle w:val="Normal"/>
+              <w:rPr/>
+            </w:pPr>
+            <w:r>
+              <w:rPr/>
+              <w:t>6. Exibir as partidas com data, seleções e placar na tela I_Agenda.</w:t>
             </w:r>
           </w:p>
         </w:tc>
@@ -12644,7 +13150,7 @@
             </w:pPr>
             <w:r>
               <w:rPr/>
-              <w:t>O usuário deve estar logado.</w:t>
+              <w:t>O usuário deve estar logado e na tela I_Grupos.</w:t>
             </w:r>
           </w:p>
         </w:tc>
@@ -12844,7 +13350,47 @@
             </w:pPr>
             <w:r>
               <w:rPr/>
-              <w:t>2. Exibir, por grupo, as seleções ordenadas por pontos, saldo e gols.</w:t>
+              <w:t>2. Validar a permissão do usuário.</w:t>
+            </w:r>
+          </w:p>
+          <w:p>
+            <w:pPr>
+              <w:pStyle w:val="Normal"/>
+              <w:rPr/>
+            </w:pPr>
+            <w:r>
+              <w:rPr/>
+              <w:t>3. Aplicar as regras de negócio (calcular a classificação a partir das partidas encerradas, ordenando por pontos, saldo e gols).</w:t>
+            </w:r>
+          </w:p>
+          <w:p>
+            <w:pPr>
+              <w:pStyle w:val="Normal"/>
+              <w:rPr/>
+            </w:pPr>
+            <w:r>
+              <w:rPr/>
+              <w:t>4. Buscar no banco de dados as partidas encerradas de cada grupo.</w:t>
+            </w:r>
+          </w:p>
+          <w:p>
+            <w:pPr>
+              <w:pStyle w:val="Normal"/>
+              <w:rPr/>
+            </w:pPr>
+            <w:r>
+              <w:rPr/>
+              <w:t>5. Enviar a mensagem “classificação indisponível” caso não haja partidas encerradas.</w:t>
+            </w:r>
+          </w:p>
+          <w:p>
+            <w:pPr>
+              <w:pStyle w:val="Normal"/>
+              <w:rPr/>
+            </w:pPr>
+            <w:r>
+              <w:rPr/>
+              <w:t>6. Exibir, por grupo, as seleções ordenadas na tela I_Grupos.</w:t>
             </w:r>
           </w:p>
         </w:tc>
@@ -13277,7 +13823,7 @@
             </w:pPr>
             <w:r>
               <w:rPr/>
-              <w:t>O usuário deve estar logado.</w:t>
+              <w:t>O usuário deve estar logado e na tela I_Selecoes.</w:t>
             </w:r>
           </w:p>
         </w:tc>
@@ -13477,7 +14023,47 @@
             </w:pPr>
             <w:r>
               <w:rPr/>
-              <w:t>2. Listar todas as seleções agrupadas por grupo.</w:t>
+              <w:t>2. Validar a permissão do usuário.</w:t>
+            </w:r>
+          </w:p>
+          <w:p>
+            <w:pPr>
+              <w:pStyle w:val="Normal"/>
+              <w:rPr/>
+            </w:pPr>
+            <w:r>
+              <w:rPr/>
+              <w:t>3. Aplicar as regras de negócio de exibição (agrupar as seleções por grupo).</w:t>
+            </w:r>
+          </w:p>
+          <w:p>
+            <w:pPr>
+              <w:pStyle w:val="Normal"/>
+              <w:rPr/>
+            </w:pPr>
+            <w:r>
+              <w:rPr/>
+              <w:t>4. Buscar todas as seleções participantes no banco de dados.</w:t>
+            </w:r>
+          </w:p>
+          <w:p>
+            <w:pPr>
+              <w:pStyle w:val="Normal"/>
+              <w:rPr/>
+            </w:pPr>
+            <w:r>
+              <w:rPr/>
+              <w:t>5. Enviar a mensagem “nenhuma seleção cadastrada” caso a lista esteja vazia.</w:t>
+            </w:r>
+          </w:p>
+          <w:p>
+            <w:pPr>
+              <w:pStyle w:val="Normal"/>
+              <w:rPr/>
+            </w:pPr>
+            <w:r>
+              <w:rPr/>
+              <w:t>6. Exibir as seleções agrupadas por grupo na tela I_Selecoes.</w:t>
             </w:r>
           </w:p>
         </w:tc>
@@ -13929,7 +14515,7 @@
             </w:pPr>
             <w:r>
               <w:rPr/>
-              <w:t>O usuário deve estar logado e a partida deve possuir odds cadastradas.</w:t>
+              <w:t>O usuário deve estar logado, na tela I_DetalhePartida, e a partida deve possuir odds cadastradas.</w:t>
             </w:r>
           </w:p>
         </w:tc>
@@ -14129,7 +14715,47 @@
             </w:pPr>
             <w:r>
               <w:rPr/>
-              <w:t>2. Exibir as odds de vitória, empate e derrota.</w:t>
+              <w:t>2. Validar a partida selecionada e a permissão do usuário.</w:t>
+            </w:r>
+          </w:p>
+          <w:p>
+            <w:pPr>
+              <w:pStyle w:val="Normal"/>
+              <w:rPr/>
+            </w:pPr>
+            <w:r>
+              <w:rPr/>
+              <w:t>3. Aplicar a regra de negócio (exibir odds apenas quando cadastradas para a partida).</w:t>
+            </w:r>
+          </w:p>
+          <w:p>
+            <w:pPr>
+              <w:pStyle w:val="Normal"/>
+              <w:rPr/>
+            </w:pPr>
+            <w:r>
+              <w:rPr/>
+              <w:t>4. Buscar as odds da partida no banco de dados.</w:t>
+            </w:r>
+          </w:p>
+          <w:p>
+            <w:pPr>
+              <w:pStyle w:val="Normal"/>
+              <w:rPr/>
+            </w:pPr>
+            <w:r>
+              <w:rPr/>
+              <w:t>5. Enviar a mensagem “odds não disponíveis” caso não existam.</w:t>
+            </w:r>
+          </w:p>
+          <w:p>
+            <w:pPr>
+              <w:pStyle w:val="Normal"/>
+              <w:rPr/>
+            </w:pPr>
+            <w:r>
+              <w:rPr/>
+              <w:t>6. Exibir as odds de vitória do mandante, empate e vitória do visitante na tela I_Odds.</w:t>
             </w:r>
           </w:p>
         </w:tc>
@@ -14562,7 +15188,7 @@
             </w:pPr>
             <w:r>
               <w:rPr/>
-              <w:t>O usuário deve estar logado e a partida deve estar encerrada.</w:t>
+              <w:t>O usuário deve estar logado, na tela I_DetalhePartida, e a partida deve estar encerrada.</w:t>
             </w:r>
           </w:p>
         </w:tc>
@@ -14762,7 +15388,47 @@
             </w:pPr>
             <w:r>
               <w:rPr/>
-              <w:t>2. Exibir posse de bola, finalizações, escanteios, faltas e cartões de cada seleção.</w:t>
+              <w:t>2. Validar a partida selecionada e o status encerrado.</w:t>
+            </w:r>
+          </w:p>
+          <w:p>
+            <w:pPr>
+              <w:pStyle w:val="Normal"/>
+              <w:rPr/>
+            </w:pPr>
+            <w:r>
+              <w:rPr/>
+              <w:t>3. Aplicar a regra de negócio (exibir estatísticas apenas de partidas encerradas).</w:t>
+            </w:r>
+          </w:p>
+          <w:p>
+            <w:pPr>
+              <w:pStyle w:val="Normal"/>
+              <w:rPr/>
+            </w:pPr>
+            <w:r>
+              <w:rPr/>
+              <w:t>4. Buscar as estatísticas da partida no banco de dados.</w:t>
+            </w:r>
+          </w:p>
+          <w:p>
+            <w:pPr>
+              <w:pStyle w:val="Normal"/>
+              <w:rPr/>
+            </w:pPr>
+            <w:r>
+              <w:rPr/>
+              <w:t>5. Enviar a mensagem “estatísticas não disponíveis” caso não existam.</w:t>
+            </w:r>
+          </w:p>
+          <w:p>
+            <w:pPr>
+              <w:pStyle w:val="Normal"/>
+              <w:rPr/>
+            </w:pPr>
+            <w:r>
+              <w:rPr/>
+              <w:t>6. Exibir posse de bola, finalizações, escanteios, faltas e cartões de cada seleção na tela I_Estatisticas.</w:t>
             </w:r>
           </w:p>
         </w:tc>
@@ -15214,7 +15880,7 @@
             </w:pPr>
             <w:r>
               <w:rPr/>
-              <w:t>O usuário deve estar logado.</w:t>
+              <w:t>O usuário deve estar logado e na tela I_Simulador.</w:t>
             </w:r>
           </w:p>
         </w:tc>
@@ -15424,7 +16090,47 @@
             </w:pPr>
             <w:r>
               <w:rPr/>
-              <w:t>3. Recalcular a classificação e o avanço das seleções a cada resultado definido.</w:t>
+              <w:t>3. Validar os resultados informados.</w:t>
+            </w:r>
+          </w:p>
+          <w:p>
+            <w:pPr>
+              <w:pStyle w:val="Normal"/>
+              <w:rPr/>
+            </w:pPr>
+            <w:r>
+              <w:rPr/>
+              <w:t>4. Buscar as partidas e a classificação atual no banco de dados.</w:t>
+            </w:r>
+          </w:p>
+          <w:p>
+            <w:pPr>
+              <w:pStyle w:val="Normal"/>
+              <w:rPr/>
+            </w:pPr>
+            <w:r>
+              <w:rPr/>
+              <w:t>5. Aplicar as regras de negócio (recalcular a classificação e o avanço das seleções a cada resultado definido).</w:t>
+            </w:r>
+          </w:p>
+          <w:p>
+            <w:pPr>
+              <w:pStyle w:val="Normal"/>
+              <w:rPr/>
+            </w:pPr>
+            <w:r>
+              <w:rPr/>
+              <w:t>6. Enviar a mensagem “simulação atualizada”.</w:t>
+            </w:r>
+          </w:p>
+          <w:p>
+            <w:pPr>
+              <w:pStyle w:val="Normal"/>
+              <w:rPr/>
+            </w:pPr>
+            <w:r>
+              <w:rPr/>
+              <w:t>7. Redirecionar para a tela I_Simulador exibindo o chaveamento atualizado.</w:t>
             </w:r>
           </w:p>
         </w:tc>
@@ -15857,7 +16563,7 @@
             </w:pPr>
             <w:r>
               <w:rPr/>
-              <w:t>O usuário deve estar logado e ter uma simulação em andamento.</w:t>
+              <w:t>O usuário deve estar logado, na tela I_Simulador, e ter uma simulação em andamento.</w:t>
             </w:r>
           </w:p>
         </w:tc>
@@ -16067,17 +16773,47 @@
             </w:pPr>
             <w:r>
               <w:rPr/>
-              <w:t>2. Validar o nome.</w:t>
-            </w:r>
-          </w:p>
-          <w:p>
-            <w:pPr>
-              <w:pStyle w:val="Normal"/>
-              <w:rPr/>
-            </w:pPr>
-            <w:r>
-              <w:rPr/>
-              <w:t>4. Gravar a simulação e seus resultados vinculados ao usuário.</w:t>
+              <w:t>2. Validar o nome informado.</w:t>
+            </w:r>
+          </w:p>
+          <w:p>
+            <w:pPr>
+              <w:pStyle w:val="Normal"/>
+              <w:rPr/>
+            </w:pPr>
+            <w:r>
+              <w:rPr/>
+              <w:t>4. Aplicar a regra de negócio (o nome da simulação deve ser único por usuário).</w:t>
+            </w:r>
+          </w:p>
+          <w:p>
+            <w:pPr>
+              <w:pStyle w:val="Normal"/>
+              <w:rPr/>
+            </w:pPr>
+            <w:r>
+              <w:rPr/>
+              <w:t>5. Gravar a simulação e seus resultados no banco de dados, vinculados ao usuário.</w:t>
+            </w:r>
+          </w:p>
+          <w:p>
+            <w:pPr>
+              <w:pStyle w:val="Normal"/>
+              <w:rPr/>
+            </w:pPr>
+            <w:r>
+              <w:rPr/>
+              <w:t>6. Enviar a mensagem “simulação salva com sucesso”.</w:t>
+            </w:r>
+          </w:p>
+          <w:p>
+            <w:pPr>
+              <w:pStyle w:val="Normal"/>
+              <w:rPr/>
+            </w:pPr>
+            <w:r>
+              <w:rPr/>
+              <w:t>7. Redirecionar para a tela I_MinhasSimulacoes.</w:t>
             </w:r>
           </w:p>
         </w:tc>
@@ -16212,6 +16948,15 @@
         </w:tc>
       </w:tr>
     </w:tbl>
+    <w:p>
+      <w:pPr>
+        <w:pStyle w:val="TextoNormal"/>
+        <w:rPr/>
+      </w:pPr>
+      <w:r>
+        <w:rPr/>
+      </w:r>
+    </w:p>
     <w:p>
       <w:pPr>
         <w:pStyle w:val="TextoNormal"/>
@@ -16561,7 +17306,7 @@
         <mc:AlternateContent>
           <mc:Choice Requires="wps">
             <w:drawing>
-              <wp:anchor behindDoc="0" distT="0" distB="0" distL="111760" distR="114300" simplePos="0" locked="0" layoutInCell="0" allowOverlap="1" relativeHeight="6">
+              <wp:anchor behindDoc="0" distT="0" distB="0" distL="109855" distR="114300" simplePos="0" locked="0" layoutInCell="0" allowOverlap="1" relativeHeight="6">
                 <wp:simplePos x="0" y="0"/>
                 <wp:positionH relativeFrom="page">
                   <wp:posOffset>6309995</wp:posOffset>
@@ -16633,7 +17378,7 @@
                                 <v:shape id="ole_rId32" type="_x0000_tole_rId32" style="width:29.05pt;height:37pt;mso-wrap-distance-right:0pt;mso-wrap-distance-bottom:24pt" filled="f" o:ole="">
                                   <v:imagedata r:id="rId33" o:title=""/>
                                 </v:shape>
-                                <o:OLEObject Type="Embed" ProgID="" ShapeID="ole_rId32" DrawAspect="Content" ObjectID="_1538907351" r:id="rId32"/>
+                                <o:OLEObject Type="Embed" ProgID="" ShapeID="ole_rId32" DrawAspect="Content" ObjectID="_556873817" r:id="rId32"/>
                               </w:object>
                             </w:r>
                           </w:p>
@@ -16690,7 +17435,7 @@
                           <v:shape id="ole_rId34" type="_x0000_tole_rId34" style="width:29.05pt;height:37pt;mso-wrap-distance-right:0pt;mso-wrap-distance-bottom:24pt" filled="f" o:ole="">
                             <v:imagedata r:id="rId35" o:title=""/>
                           </v:shape>
-                          <o:OLEObject Type="Embed" ProgID="" ShapeID="ole_rId34" DrawAspect="Content" ObjectID="_996113273" r:id="rId34"/>
+                          <o:OLEObject Type="Embed" ProgID="" ShapeID="ole_rId34" DrawAspect="Content" ObjectID="_1325987769" r:id="rId34"/>
                         </w:object>
                       </w:r>
                     </w:p>
@@ -18158,7 +18903,7 @@
       <w:pPr>
         <w:pStyle w:val="TextoNormal"/>
         <w:spacing w:before="0" w:after="0"/>
-        <w:ind w:hanging="0" w:left="0"/>
+        <w:ind w:hanging="0" w:left="0" w:right="0"/>
         <w:jc w:val="right"/>
         <w:rPr>
           <w:rFonts w:ascii="Arial" w:hAnsi="Arial" w:cs="Arial"/>
@@ -18170,7 +18915,7 @@
         <mc:AlternateContent>
           <mc:Choice Requires="wps">
             <w:drawing>
-              <wp:anchor behindDoc="0" distT="0" distB="0" distL="114300" distR="114300" simplePos="0" locked="0" layoutInCell="0" allowOverlap="1" relativeHeight="13" wp14:anchorId="3B645B6E">
+              <wp:anchor behindDoc="0" distT="0" distB="0" distL="114300" distR="114300" simplePos="0" locked="0" layoutInCell="0" allowOverlap="1" relativeHeight="10" wp14:anchorId="3B645B6E">
                 <wp:simplePos x="0" y="0"/>
                 <wp:positionH relativeFrom="page">
                   <wp:posOffset>6309995</wp:posOffset>
@@ -18216,10 +18961,14 @@
                               <w:bidi w:val="0"/>
                               <w:spacing w:before="0" w:after="480"/>
                               <w:jc w:val="right"/>
-                              <w:rPr/>
+                              <w:rPr>
+                                <w:color w:val="000000"/>
+                              </w:rPr>
                             </w:pPr>
                             <w:r>
-                              <w:rPr/>
+                              <w:rPr>
+                                <w:color w:val="000000"/>
+                              </w:rPr>
                               <w:object>
                                 <v:shapetype id="_x0000_tole_rId42" coordsize="21600,21600" o:spt="ole_rId42" o:preferrelative="t" path="m@4@5l@4@11@9@11@9@5xe" filled="f" stroked="f">
                                   <v:stroke joinstyle="miter"/>
@@ -18240,10 +18989,10 @@
                                   <v:path o:extrusionok="f" gradientshapeok="t" o:connecttype="rect"/>
                                   <o:lock v:ext="edit" aspectratio="t"/>
                                 </v:shapetype>
-                                <v:shape id="ole_rId42" type="_x0000_tole_rId42" style="width:29.25pt;height:36.75pt;mso-wrap-distance-right:0pt" filled="t" fillcolor="#FFFFFF" o:ole="">
+                                <v:shape id="ole_rId42" type="_x0000_tole_rId42" style="width:29.25pt;height:36.75pt;mso-wrap-distance-right:0pt;mso-wrap-distance-bottom:24pt" filled="t" fillcolor="#FFFFFF" o:ole="">
                                   <v:imagedata r:id="rId43" o:title=""/>
                                 </v:shape>
-                                <o:OLEObject Type="Embed" ProgID="" ShapeID="ole_rId42" DrawAspect="Content" ObjectID="_1727709367" r:id="rId42"/>
+                                <o:OLEObject Type="Embed" ProgID="" ShapeID="ole_rId42" DrawAspect="Content" ObjectID="_111037457" r:id="rId42"/>
                               </w:object>
                             </w:r>
                           </w:p>
@@ -18260,8 +19009,8 @@
           </mc:Choice>
           <mc:Fallback>
             <w:pict>
-              <v:rect id="shape_0" ID="Frame5" path="m0,0l-2147483645,0l-2147483645,-2147483646l0,-2147483646xe" fillcolor="white" stroked="f" o:allowincell="f" style="position:absolute;margin-left:496.85pt;margin-top:0.05pt;width:28.95pt;height:36.9pt;mso-wrap-style:none;v-text-anchor:middle;mso-position-horizontal-relative:page" wp14:anchorId="3B645B6E">
-                <v:fill o:detectmouseclick="t" type="solid" color2="black" opacity="0"/>
+              <v:rect id="shape_0" ID="Frame5" path="m0,0l-2147483645,0l-2147483645,-2147483646l0,-2147483646xe" stroked="f" o:allowincell="f" style="position:absolute;margin-left:496.85pt;margin-top:0.05pt;width:28.95pt;height:36.9pt;mso-wrap-style:none;v-text-anchor:middle;mso-position-horizontal-relative:page" wp14:anchorId="3B645B6E">
+                <v:fill o:detectmouseclick="t" on="false"/>
                 <v:stroke color="#3465a4" joinstyle="round" endcap="flat"/>
                 <v:textbox>
                   <w:txbxContent>
@@ -18274,10 +19023,14 @@
                         <w:bidi w:val="0"/>
                         <w:spacing w:before="0" w:after="480"/>
                         <w:jc w:val="right"/>
-                        <w:rPr/>
+                        <w:rPr>
+                          <w:color w:val="000000"/>
+                        </w:rPr>
                       </w:pPr>
                       <w:r>
-                        <w:rPr/>
+                        <w:rPr>
+                          <w:color w:val="000000"/>
+                        </w:rPr>
                         <w:object>
                           <v:shapetype id="_x0000_tole_rId44" coordsize="21600,21600" o:spt="ole_rId44" o:preferrelative="t" path="m@4@5l@4@11@9@11@9@5xe" filled="f" stroked="f">
                             <v:stroke joinstyle="miter"/>
@@ -18298,10 +19051,10 @@
                             <v:path o:extrusionok="f" gradientshapeok="t" o:connecttype="rect"/>
                             <o:lock v:ext="edit" aspectratio="t"/>
                           </v:shapetype>
-                          <v:shape id="ole_rId44" type="_x0000_tole_rId44" style="width:29.25pt;height:36.75pt;mso-wrap-distance-right:0pt" filled="t" fillcolor="#FFFFFF" o:ole="">
+                          <v:shape id="ole_rId44" type="_x0000_tole_rId44" style="width:29.25pt;height:36.75pt;mso-wrap-distance-right:0pt;mso-wrap-distance-bottom:24pt" filled="t" fillcolor="#FFFFFF" o:ole="">
                             <v:imagedata r:id="rId45" o:title=""/>
                           </v:shape>
-                          <o:OLEObject Type="Embed" ProgID="" ShapeID="ole_rId44" DrawAspect="Content" ObjectID="_1556917026" r:id="rId44"/>
+                          <o:OLEObject Type="Embed" ProgID="" ShapeID="ole_rId44" DrawAspect="Content" ObjectID="_749796616" r:id="rId44"/>
                         </w:object>
                       </w:r>
                     </w:p>
@@ -18362,7 +19115,7 @@
     <w:p>
       <w:pPr>
         <w:pStyle w:val="TextoNormal"/>
-        <w:ind w:left="0"/>
+        <w:ind w:hanging="0" w:left="0" w:right="0"/>
         <w:rPr>
           <w:color w:themeColor="text1" w:val="000000"/>
         </w:rPr>
@@ -18376,7 +19129,7 @@
     <w:p>
       <w:pPr>
         <w:pStyle w:val="TextoNormal"/>
-        <w:ind w:left="0"/>
+        <w:ind w:hanging="0" w:left="0" w:right="0"/>
         <w:rPr>
           <w:color w:themeColor="text1" w:val="000000"/>
         </w:rPr>
@@ -18400,7 +19153,7 @@
     <w:p>
       <w:pPr>
         <w:pStyle w:val="TextoNormal"/>
-        <w:ind w:left="0"/>
+        <w:ind w:hanging="0" w:left="0" w:right="0"/>
         <w:rPr>
           <w:color w:themeColor="text1" w:val="000000"/>
         </w:rPr>
@@ -18414,7 +19167,7 @@
     <w:p>
       <w:pPr>
         <w:pStyle w:val="TextoNormal"/>
-        <w:ind w:left="0"/>
+        <w:ind w:hanging="0" w:left="0" w:right="0"/>
         <w:rPr>
           <w:color w:themeColor="text1" w:val="000000"/>
         </w:rPr>
@@ -18428,7 +19181,7 @@
     <w:p>
       <w:pPr>
         <w:pStyle w:val="TextoNormal"/>
-        <w:ind w:left="0"/>
+        <w:ind w:hanging="0" w:left="0" w:right="0"/>
         <w:rPr>
           <w:color w:themeColor="text1" w:val="000000"/>
         </w:rPr>
@@ -18442,7 +19195,7 @@
     <w:p>
       <w:pPr>
         <w:pStyle w:val="TextoNormal"/>
-        <w:ind w:left="0"/>
+        <w:ind w:hanging="0" w:left="0" w:right="0"/>
         <w:rPr>
           <w:color w:themeColor="text1" w:val="000000"/>
         </w:rPr>
@@ -18456,7 +19209,7 @@
     <w:p>
       <w:pPr>
         <w:pStyle w:val="TextoNormal"/>
-        <w:ind w:left="0"/>
+        <w:ind w:hanging="0" w:left="0" w:right="0"/>
         <w:rPr>
           <w:color w:themeColor="text1" w:val="000000"/>
         </w:rPr>
@@ -18470,7 +19223,7 @@
     <w:p>
       <w:pPr>
         <w:pStyle w:val="TextoNormal"/>
-        <w:ind w:left="0"/>
+        <w:ind w:hanging="0" w:left="0" w:right="0"/>
         <w:rPr>
           <w:color w:themeColor="text1" w:val="000000"/>
         </w:rPr>
@@ -18484,7 +19237,7 @@
     <w:p>
       <w:pPr>
         <w:pStyle w:val="TextoNormal"/>
-        <w:ind w:left="0"/>
+        <w:ind w:hanging="0" w:left="0" w:right="0"/>
         <w:rPr>
           <w:color w:themeColor="text1" w:val="000000"/>
         </w:rPr>
@@ -18498,7 +19251,7 @@
     <w:p>
       <w:pPr>
         <w:pStyle w:val="TextoNormal"/>
-        <w:ind w:left="0"/>
+        <w:ind w:hanging="0" w:left="0" w:right="0"/>
         <w:rPr>
           <w:color w:themeColor="text1" w:val="000000"/>
         </w:rPr>
@@ -18512,7 +19265,7 @@
     <w:p>
       <w:pPr>
         <w:pStyle w:val="TextoNormal"/>
-        <w:ind w:left="0"/>
+        <w:ind w:hanging="0" w:left="0" w:right="0"/>
         <w:rPr>
           <w:color w:themeColor="text1" w:val="000000"/>
         </w:rPr>
@@ -18526,7 +19279,7 @@
     <w:p>
       <w:pPr>
         <w:pStyle w:val="TextoNormal"/>
-        <w:ind w:left="0"/>
+        <w:ind w:hanging="0" w:left="0" w:right="0"/>
         <w:rPr>
           <w:color w:themeColor="text1" w:val="000000"/>
         </w:rPr>
@@ -18540,7 +19293,7 @@
     <w:p>
       <w:pPr>
         <w:pStyle w:val="TextoNormal"/>
-        <w:ind w:left="0"/>
+        <w:ind w:hanging="0" w:left="0" w:right="0"/>
         <w:rPr>
           <w:color w:themeColor="text1" w:val="000000"/>
         </w:rPr>
@@ -18554,7 +19307,7 @@
     <w:p>
       <w:pPr>
         <w:pStyle w:val="TextoNormal"/>
-        <w:ind w:left="0"/>
+        <w:ind w:hanging="0" w:left="0" w:right="0"/>
         <w:rPr>
           <w:color w:themeColor="text1" w:val="000000"/>
         </w:rPr>
@@ -18568,7 +19321,7 @@
     <w:p>
       <w:pPr>
         <w:pStyle w:val="TextoNormal"/>
-        <w:ind w:left="0"/>
+        <w:ind w:hanging="0" w:left="0" w:right="0"/>
         <w:rPr>
           <w:color w:themeColor="text1" w:val="000000"/>
         </w:rPr>
@@ -18582,7 +19335,7 @@
     <w:p>
       <w:pPr>
         <w:pStyle w:val="TextoNormal"/>
-        <w:ind w:left="0"/>
+        <w:ind w:hanging="0" w:left="0" w:right="0"/>
         <w:rPr>
           <w:color w:themeColor="text1" w:val="000000"/>
         </w:rPr>
@@ -18596,7 +19349,7 @@
     <w:p>
       <w:pPr>
         <w:pStyle w:val="TextoNormal"/>
-        <w:ind w:left="0"/>
+        <w:ind w:hanging="0" w:left="0" w:right="0"/>
         <w:rPr>
           <w:color w:themeColor="text1" w:val="000000"/>
         </w:rPr>
@@ -18610,7 +19363,7 @@
     <w:p>
       <w:pPr>
         <w:pStyle w:val="TextoNormal"/>
-        <w:ind w:left="0"/>
+        <w:ind w:hanging="0" w:left="0" w:right="0"/>
         <w:rPr>
           <w:color w:themeColor="text1" w:val="000000"/>
         </w:rPr>
@@ -18624,7 +19377,7 @@
     <w:p>
       <w:pPr>
         <w:pStyle w:val="TextoNormal"/>
-        <w:ind w:left="0"/>
+        <w:ind w:hanging="0" w:left="0" w:right="0"/>
         <w:rPr>
           <w:color w:themeColor="text1" w:val="000000"/>
         </w:rPr>
@@ -18638,7 +19391,7 @@
     <w:p>
       <w:pPr>
         <w:pStyle w:val="TextoNormal"/>
-        <w:ind w:left="0"/>
+        <w:ind w:hanging="0" w:left="0" w:right="0"/>
         <w:rPr>
           <w:color w:themeColor="text1" w:val="000000"/>
         </w:rPr>
@@ -18652,7 +19405,7 @@
     <w:p>
       <w:pPr>
         <w:pStyle w:val="TextoNormal"/>
-        <w:ind w:left="0"/>
+        <w:ind w:hanging="0" w:left="0" w:right="0"/>
         <w:rPr>
           <w:color w:themeColor="text1" w:val="000000"/>
         </w:rPr>
@@ -18666,7 +19419,7 @@
     <w:p>
       <w:pPr>
         <w:pStyle w:val="TextoNormal"/>
-        <w:ind w:left="0"/>
+        <w:ind w:hanging="0" w:left="0" w:right="0"/>
         <w:rPr>
           <w:color w:themeColor="text1" w:val="000000"/>
         </w:rPr>
@@ -18680,7 +19433,7 @@
     <w:p>
       <w:pPr>
         <w:pStyle w:val="TextoNormal"/>
-        <w:ind w:left="0"/>
+        <w:ind w:hanging="0" w:left="0" w:right="0"/>
         <w:rPr>
           <w:color w:themeColor="text1" w:val="000000"/>
         </w:rPr>
@@ -18694,7 +19447,7 @@
     <w:p>
       <w:pPr>
         <w:pStyle w:val="TextoNormal"/>
-        <w:ind w:left="0"/>
+        <w:ind w:hanging="0" w:left="0" w:right="0"/>
         <w:rPr>
           <w:color w:themeColor="text1" w:val="000000"/>
         </w:rPr>
@@ -18708,7 +19461,7 @@
     <w:p>
       <w:pPr>
         <w:pStyle w:val="TextoNormal"/>
-        <w:ind w:left="0"/>
+        <w:ind w:hanging="0" w:left="0" w:right="0"/>
         <w:rPr>
           <w:color w:themeColor="text1" w:val="000000"/>
         </w:rPr>
@@ -18722,16 +19475,14 @@
     <w:p>
       <w:pPr>
         <w:pStyle w:val="TextoNormal"/>
-        <w:ind w:left="0"/>
+        <w:ind w:hanging="0" w:left="0" w:right="0"/>
         <w:rPr>
           <w:color w:themeColor="text1" w:val="000000"/>
         </w:rPr>
       </w:pPr>
       <w:r>
         <w:rPr>
-          <w:rFonts w:cs="Arial" w:ascii="Arial" w:hAnsi="Arial"/>
-          <w:b/>
-          <w:sz w:val="24"/>
+          <w:color w:themeColor="text1" w:val="000000"/>
         </w:rPr>
       </w:r>
       <w:r>
@@ -18751,7 +19502,7 @@
       </w:pPr>
       <w:r>
         <w:drawing>
-          <wp:anchor behindDoc="0" distT="0" distB="0" distL="114300" distR="114300" simplePos="0" locked="0" layoutInCell="0" allowOverlap="1" relativeHeight="16">
+          <wp:anchor behindDoc="0" distT="0" distB="0" distL="114300" distR="114300" simplePos="0" locked="0" layoutInCell="0" allowOverlap="1" relativeHeight="12">
             <wp:simplePos x="0" y="0"/>
             <wp:positionH relativeFrom="column">
               <wp:posOffset>5375910</wp:posOffset>
@@ -18891,17 +19642,17 @@
         </w:tblCellMar>
       </w:tblPr>
       <w:tblGrid>
-        <w:gridCol w:w="1697"/>
-        <w:gridCol w:w="3053"/>
+        <w:gridCol w:w="1695"/>
+        <w:gridCol w:w="3055"/>
         <w:gridCol w:w="1347"/>
-        <w:gridCol w:w="900"/>
-        <w:gridCol w:w="2029"/>
+        <w:gridCol w:w="899"/>
+        <w:gridCol w:w="2030"/>
       </w:tblGrid>
       <w:tr>
         <w:trPr/>
         <w:tc>
           <w:tcPr>
-            <w:tcW w:w="1697" w:type="dxa"/>
+            <w:tcW w:w="1695" w:type="dxa"/>
             <w:tcBorders>
               <w:top w:val="single" w:sz="4" w:space="0" w:color="BFBFBF"/>
               <w:left w:val="single" w:sz="4" w:space="0" w:color="BFBFBF"/>
@@ -18925,7 +19676,7 @@
         </w:tc>
         <w:tc>
           <w:tcPr>
-            <w:tcW w:w="3053" w:type="dxa"/>
+            <w:tcW w:w="3055" w:type="dxa"/>
             <w:tcBorders>
               <w:top w:val="single" w:sz="4" w:space="0" w:color="BFBFBF"/>
               <w:left w:val="single" w:sz="4" w:space="0" w:color="BFBFBF"/>
@@ -18973,7 +19724,7 @@
         </w:tc>
         <w:tc>
           <w:tcPr>
-            <w:tcW w:w="900" w:type="dxa"/>
+            <w:tcW w:w="899" w:type="dxa"/>
             <w:tcBorders>
               <w:top w:val="single" w:sz="4" w:space="0" w:color="BFBFBF"/>
               <w:left w:val="single" w:sz="4" w:space="0" w:color="BFBFBF"/>
@@ -18997,7 +19748,7 @@
         </w:tc>
         <w:tc>
           <w:tcPr>
-            <w:tcW w:w="2029" w:type="dxa"/>
+            <w:tcW w:w="2030" w:type="dxa"/>
             <w:tcBorders>
               <w:top w:val="single" w:sz="4" w:space="0" w:color="BFBFBF"/>
               <w:left w:val="single" w:sz="4" w:space="0" w:color="BFBFBF"/>
@@ -19024,7 +19775,7 @@
         <w:trPr/>
         <w:tc>
           <w:tcPr>
-            <w:tcW w:w="1697" w:type="dxa"/>
+            <w:tcW w:w="1695" w:type="dxa"/>
             <w:tcBorders>
               <w:top w:val="single" w:sz="4" w:space="0" w:color="BFBFBF"/>
               <w:left w:val="single" w:sz="4" w:space="0" w:color="BFBFBF"/>
@@ -19045,7 +19796,7 @@
         </w:tc>
         <w:tc>
           <w:tcPr>
-            <w:tcW w:w="3053" w:type="dxa"/>
+            <w:tcW w:w="3055" w:type="dxa"/>
             <w:tcBorders>
               <w:top w:val="single" w:sz="4" w:space="0" w:color="BFBFBF"/>
               <w:left w:val="single" w:sz="4" w:space="0" w:color="BFBFBF"/>
@@ -19087,7 +19838,7 @@
         </w:tc>
         <w:tc>
           <w:tcPr>
-            <w:tcW w:w="900" w:type="dxa"/>
+            <w:tcW w:w="899" w:type="dxa"/>
             <w:tcBorders>
               <w:top w:val="single" w:sz="4" w:space="0" w:color="BFBFBF"/>
               <w:left w:val="single" w:sz="4" w:space="0" w:color="BFBFBF"/>
@@ -19108,7 +19859,7 @@
         </w:tc>
         <w:tc>
           <w:tcPr>
-            <w:tcW w:w="2029" w:type="dxa"/>
+            <w:tcW w:w="2030" w:type="dxa"/>
             <w:tcBorders>
               <w:top w:val="single" w:sz="4" w:space="0" w:color="BFBFBF"/>
               <w:left w:val="single" w:sz="4" w:space="0" w:color="BFBFBF"/>
@@ -19132,7 +19883,7 @@
         <w:trPr/>
         <w:tc>
           <w:tcPr>
-            <w:tcW w:w="1697" w:type="dxa"/>
+            <w:tcW w:w="1695" w:type="dxa"/>
             <w:tcBorders>
               <w:top w:val="single" w:sz="4" w:space="0" w:color="BFBFBF"/>
               <w:left w:val="single" w:sz="4" w:space="0" w:color="BFBFBF"/>
@@ -19153,7 +19904,7 @@
         </w:tc>
         <w:tc>
           <w:tcPr>
-            <w:tcW w:w="3053" w:type="dxa"/>
+            <w:tcW w:w="3055" w:type="dxa"/>
             <w:tcBorders>
               <w:top w:val="single" w:sz="4" w:space="0" w:color="BFBFBF"/>
               <w:left w:val="single" w:sz="4" w:space="0" w:color="BFBFBF"/>
@@ -19195,7 +19946,7 @@
         </w:tc>
         <w:tc>
           <w:tcPr>
-            <w:tcW w:w="900" w:type="dxa"/>
+            <w:tcW w:w="899" w:type="dxa"/>
             <w:tcBorders>
               <w:top w:val="single" w:sz="4" w:space="0" w:color="BFBFBF"/>
               <w:left w:val="single" w:sz="4" w:space="0" w:color="BFBFBF"/>
@@ -19216,7 +19967,7 @@
         </w:tc>
         <w:tc>
           <w:tcPr>
-            <w:tcW w:w="2029" w:type="dxa"/>
+            <w:tcW w:w="2030" w:type="dxa"/>
             <w:tcBorders>
               <w:top w:val="single" w:sz="4" w:space="0" w:color="BFBFBF"/>
               <w:left w:val="single" w:sz="4" w:space="0" w:color="BFBFBF"/>
@@ -19240,7 +19991,7 @@
         <w:trPr/>
         <w:tc>
           <w:tcPr>
-            <w:tcW w:w="1697" w:type="dxa"/>
+            <w:tcW w:w="1695" w:type="dxa"/>
             <w:tcBorders>
               <w:top w:val="single" w:sz="4" w:space="0" w:color="BFBFBF"/>
               <w:left w:val="single" w:sz="4" w:space="0" w:color="BFBFBF"/>
@@ -19261,7 +20012,7 @@
         </w:tc>
         <w:tc>
           <w:tcPr>
-            <w:tcW w:w="3053" w:type="dxa"/>
+            <w:tcW w:w="3055" w:type="dxa"/>
             <w:tcBorders>
               <w:top w:val="single" w:sz="4" w:space="0" w:color="BFBFBF"/>
               <w:left w:val="single" w:sz="4" w:space="0" w:color="BFBFBF"/>
@@ -19303,7 +20054,7 @@
         </w:tc>
         <w:tc>
           <w:tcPr>
-            <w:tcW w:w="900" w:type="dxa"/>
+            <w:tcW w:w="899" w:type="dxa"/>
             <w:tcBorders>
               <w:top w:val="single" w:sz="4" w:space="0" w:color="BFBFBF"/>
               <w:left w:val="single" w:sz="4" w:space="0" w:color="BFBFBF"/>
@@ -19324,7 +20075,7 @@
         </w:tc>
         <w:tc>
           <w:tcPr>
-            <w:tcW w:w="2029" w:type="dxa"/>
+            <w:tcW w:w="2030" w:type="dxa"/>
             <w:tcBorders>
               <w:top w:val="single" w:sz="4" w:space="0" w:color="BFBFBF"/>
               <w:left w:val="single" w:sz="4" w:space="0" w:color="BFBFBF"/>
@@ -19348,7 +20099,7 @@
         <w:trPr/>
         <w:tc>
           <w:tcPr>
-            <w:tcW w:w="1697" w:type="dxa"/>
+            <w:tcW w:w="1695" w:type="dxa"/>
             <w:tcBorders>
               <w:top w:val="single" w:sz="4" w:space="0" w:color="BFBFBF"/>
               <w:left w:val="single" w:sz="4" w:space="0" w:color="BFBFBF"/>
@@ -19369,7 +20120,7 @@
         </w:tc>
         <w:tc>
           <w:tcPr>
-            <w:tcW w:w="3053" w:type="dxa"/>
+            <w:tcW w:w="3055" w:type="dxa"/>
             <w:tcBorders>
               <w:top w:val="single" w:sz="4" w:space="0" w:color="BFBFBF"/>
               <w:left w:val="single" w:sz="4" w:space="0" w:color="BFBFBF"/>
@@ -19411,7 +20162,7 @@
         </w:tc>
         <w:tc>
           <w:tcPr>
-            <w:tcW w:w="900" w:type="dxa"/>
+            <w:tcW w:w="899" w:type="dxa"/>
             <w:tcBorders>
               <w:top w:val="single" w:sz="4" w:space="0" w:color="BFBFBF"/>
               <w:left w:val="single" w:sz="4" w:space="0" w:color="BFBFBF"/>
@@ -19432,7 +20183,7 @@
         </w:tc>
         <w:tc>
           <w:tcPr>
-            <w:tcW w:w="2029" w:type="dxa"/>
+            <w:tcW w:w="2030" w:type="dxa"/>
             <w:tcBorders>
               <w:top w:val="single" w:sz="4" w:space="0" w:color="BFBFBF"/>
               <w:left w:val="single" w:sz="4" w:space="0" w:color="BFBFBF"/>
@@ -19456,7 +20207,7 @@
         <w:trPr/>
         <w:tc>
           <w:tcPr>
-            <w:tcW w:w="1697" w:type="dxa"/>
+            <w:tcW w:w="1695" w:type="dxa"/>
             <w:tcBorders>
               <w:top w:val="single" w:sz="4" w:space="0" w:color="BFBFBF"/>
               <w:left w:val="single" w:sz="4" w:space="0" w:color="BFBFBF"/>
@@ -19477,7 +20228,7 @@
         </w:tc>
         <w:tc>
           <w:tcPr>
-            <w:tcW w:w="3053" w:type="dxa"/>
+            <w:tcW w:w="3055" w:type="dxa"/>
             <w:tcBorders>
               <w:top w:val="single" w:sz="4" w:space="0" w:color="BFBFBF"/>
               <w:left w:val="single" w:sz="4" w:space="0" w:color="BFBFBF"/>
@@ -19519,7 +20270,7 @@
         </w:tc>
         <w:tc>
           <w:tcPr>
-            <w:tcW w:w="900" w:type="dxa"/>
+            <w:tcW w:w="899" w:type="dxa"/>
             <w:tcBorders>
               <w:top w:val="single" w:sz="4" w:space="0" w:color="BFBFBF"/>
               <w:left w:val="single" w:sz="4" w:space="0" w:color="BFBFBF"/>
@@ -19540,7 +20291,7 @@
         </w:tc>
         <w:tc>
           <w:tcPr>
-            <w:tcW w:w="2029" w:type="dxa"/>
+            <w:tcW w:w="2030" w:type="dxa"/>
             <w:tcBorders>
               <w:top w:val="single" w:sz="4" w:space="0" w:color="BFBFBF"/>
               <w:left w:val="single" w:sz="4" w:space="0" w:color="BFBFBF"/>
@@ -19619,17 +20370,17 @@
         </w:tblCellMar>
       </w:tblPr>
       <w:tblGrid>
-        <w:gridCol w:w="1697"/>
-        <w:gridCol w:w="3053"/>
+        <w:gridCol w:w="1695"/>
+        <w:gridCol w:w="3055"/>
         <w:gridCol w:w="1347"/>
-        <w:gridCol w:w="900"/>
-        <w:gridCol w:w="2029"/>
+        <w:gridCol w:w="899"/>
+        <w:gridCol w:w="2030"/>
       </w:tblGrid>
       <w:tr>
         <w:trPr/>
         <w:tc>
           <w:tcPr>
-            <w:tcW w:w="1697" w:type="dxa"/>
+            <w:tcW w:w="1695" w:type="dxa"/>
             <w:tcBorders>
               <w:top w:val="single" w:sz="4" w:space="0" w:color="BFBFBF"/>
               <w:left w:val="single" w:sz="4" w:space="0" w:color="BFBFBF"/>
@@ -19653,7 +20404,7 @@
         </w:tc>
         <w:tc>
           <w:tcPr>
-            <w:tcW w:w="3053" w:type="dxa"/>
+            <w:tcW w:w="3055" w:type="dxa"/>
             <w:tcBorders>
               <w:top w:val="single" w:sz="4" w:space="0" w:color="BFBFBF"/>
               <w:left w:val="single" w:sz="4" w:space="0" w:color="BFBFBF"/>
@@ -19701,7 +20452,7 @@
         </w:tc>
         <w:tc>
           <w:tcPr>
-            <w:tcW w:w="900" w:type="dxa"/>
+            <w:tcW w:w="899" w:type="dxa"/>
             <w:tcBorders>
               <w:top w:val="single" w:sz="4" w:space="0" w:color="BFBFBF"/>
               <w:left w:val="single" w:sz="4" w:space="0" w:color="BFBFBF"/>
@@ -19725,7 +20476,7 @@
         </w:tc>
         <w:tc>
           <w:tcPr>
-            <w:tcW w:w="2029" w:type="dxa"/>
+            <w:tcW w:w="2030" w:type="dxa"/>
             <w:tcBorders>
               <w:top w:val="single" w:sz="4" w:space="0" w:color="BFBFBF"/>
               <w:left w:val="single" w:sz="4" w:space="0" w:color="BFBFBF"/>
@@ -19752,7 +20503,7 @@
         <w:trPr/>
         <w:tc>
           <w:tcPr>
-            <w:tcW w:w="1697" w:type="dxa"/>
+            <w:tcW w:w="1695" w:type="dxa"/>
             <w:tcBorders>
               <w:top w:val="single" w:sz="4" w:space="0" w:color="BFBFBF"/>
               <w:left w:val="single" w:sz="4" w:space="0" w:color="BFBFBF"/>
@@ -19773,7 +20524,7 @@
         </w:tc>
         <w:tc>
           <w:tcPr>
-            <w:tcW w:w="3053" w:type="dxa"/>
+            <w:tcW w:w="3055" w:type="dxa"/>
             <w:tcBorders>
               <w:top w:val="single" w:sz="4" w:space="0" w:color="BFBFBF"/>
               <w:left w:val="single" w:sz="4" w:space="0" w:color="BFBFBF"/>
@@ -19815,7 +20566,7 @@
         </w:tc>
         <w:tc>
           <w:tcPr>
-            <w:tcW w:w="900" w:type="dxa"/>
+            <w:tcW w:w="899" w:type="dxa"/>
             <w:tcBorders>
               <w:top w:val="single" w:sz="4" w:space="0" w:color="BFBFBF"/>
               <w:left w:val="single" w:sz="4" w:space="0" w:color="BFBFBF"/>
@@ -19836,7 +20587,7 @@
         </w:tc>
         <w:tc>
           <w:tcPr>
-            <w:tcW w:w="2029" w:type="dxa"/>
+            <w:tcW w:w="2030" w:type="dxa"/>
             <w:tcBorders>
               <w:top w:val="single" w:sz="4" w:space="0" w:color="BFBFBF"/>
               <w:left w:val="single" w:sz="4" w:space="0" w:color="BFBFBF"/>
@@ -19860,7 +20611,7 @@
         <w:trPr/>
         <w:tc>
           <w:tcPr>
-            <w:tcW w:w="1697" w:type="dxa"/>
+            <w:tcW w:w="1695" w:type="dxa"/>
             <w:tcBorders>
               <w:top w:val="single" w:sz="4" w:space="0" w:color="BFBFBF"/>
               <w:left w:val="single" w:sz="4" w:space="0" w:color="BFBFBF"/>
@@ -19881,7 +20632,7 @@
         </w:tc>
         <w:tc>
           <w:tcPr>
-            <w:tcW w:w="3053" w:type="dxa"/>
+            <w:tcW w:w="3055" w:type="dxa"/>
             <w:tcBorders>
               <w:top w:val="single" w:sz="4" w:space="0" w:color="BFBFBF"/>
               <w:left w:val="single" w:sz="4" w:space="0" w:color="BFBFBF"/>
@@ -19923,7 +20674,7 @@
         </w:tc>
         <w:tc>
           <w:tcPr>
-            <w:tcW w:w="900" w:type="dxa"/>
+            <w:tcW w:w="899" w:type="dxa"/>
             <w:tcBorders>
               <w:top w:val="single" w:sz="4" w:space="0" w:color="BFBFBF"/>
               <w:left w:val="single" w:sz="4" w:space="0" w:color="BFBFBF"/>
@@ -19944,7 +20695,7 @@
         </w:tc>
         <w:tc>
           <w:tcPr>
-            <w:tcW w:w="2029" w:type="dxa"/>
+            <w:tcW w:w="2030" w:type="dxa"/>
             <w:tcBorders>
               <w:top w:val="single" w:sz="4" w:space="0" w:color="BFBFBF"/>
               <w:left w:val="single" w:sz="4" w:space="0" w:color="BFBFBF"/>
@@ -19968,7 +20719,7 @@
         <w:trPr/>
         <w:tc>
           <w:tcPr>
-            <w:tcW w:w="1697" w:type="dxa"/>
+            <w:tcW w:w="1695" w:type="dxa"/>
             <w:tcBorders>
               <w:top w:val="single" w:sz="4" w:space="0" w:color="BFBFBF"/>
               <w:left w:val="single" w:sz="4" w:space="0" w:color="BFBFBF"/>
@@ -19989,7 +20740,7 @@
         </w:tc>
         <w:tc>
           <w:tcPr>
-            <w:tcW w:w="3053" w:type="dxa"/>
+            <w:tcW w:w="3055" w:type="dxa"/>
             <w:tcBorders>
               <w:top w:val="single" w:sz="4" w:space="0" w:color="BFBFBF"/>
               <w:left w:val="single" w:sz="4" w:space="0" w:color="BFBFBF"/>
@@ -20031,7 +20782,7 @@
         </w:tc>
         <w:tc>
           <w:tcPr>
-            <w:tcW w:w="900" w:type="dxa"/>
+            <w:tcW w:w="899" w:type="dxa"/>
             <w:tcBorders>
               <w:top w:val="single" w:sz="4" w:space="0" w:color="BFBFBF"/>
               <w:left w:val="single" w:sz="4" w:space="0" w:color="BFBFBF"/>
@@ -20052,7 +20803,7 @@
         </w:tc>
         <w:tc>
           <w:tcPr>
-            <w:tcW w:w="2029" w:type="dxa"/>
+            <w:tcW w:w="2030" w:type="dxa"/>
             <w:tcBorders>
               <w:top w:val="single" w:sz="4" w:space="0" w:color="BFBFBF"/>
               <w:left w:val="single" w:sz="4" w:space="0" w:color="BFBFBF"/>
@@ -20076,7 +20827,7 @@
         <w:trPr/>
         <w:tc>
           <w:tcPr>
-            <w:tcW w:w="1697" w:type="dxa"/>
+            <w:tcW w:w="1695" w:type="dxa"/>
             <w:tcBorders>
               <w:top w:val="single" w:sz="4" w:space="0" w:color="BFBFBF"/>
               <w:left w:val="single" w:sz="4" w:space="0" w:color="BFBFBF"/>
@@ -20097,7 +20848,7 @@
         </w:tc>
         <w:tc>
           <w:tcPr>
-            <w:tcW w:w="3053" w:type="dxa"/>
+            <w:tcW w:w="3055" w:type="dxa"/>
             <w:tcBorders>
               <w:top w:val="single" w:sz="4" w:space="0" w:color="BFBFBF"/>
               <w:left w:val="single" w:sz="4" w:space="0" w:color="BFBFBF"/>
@@ -20139,7 +20890,7 @@
         </w:tc>
         <w:tc>
           <w:tcPr>
-            <w:tcW w:w="900" w:type="dxa"/>
+            <w:tcW w:w="899" w:type="dxa"/>
             <w:tcBorders>
               <w:top w:val="single" w:sz="4" w:space="0" w:color="BFBFBF"/>
               <w:left w:val="single" w:sz="4" w:space="0" w:color="BFBFBF"/>
@@ -20160,7 +20911,7 @@
         </w:tc>
         <w:tc>
           <w:tcPr>
-            <w:tcW w:w="2029" w:type="dxa"/>
+            <w:tcW w:w="2030" w:type="dxa"/>
             <w:tcBorders>
               <w:top w:val="single" w:sz="4" w:space="0" w:color="BFBFBF"/>
               <w:left w:val="single" w:sz="4" w:space="0" w:color="BFBFBF"/>
@@ -20184,7 +20935,7 @@
         <w:trPr/>
         <w:tc>
           <w:tcPr>
-            <w:tcW w:w="1697" w:type="dxa"/>
+            <w:tcW w:w="1695" w:type="dxa"/>
             <w:tcBorders>
               <w:top w:val="single" w:sz="4" w:space="0" w:color="BFBFBF"/>
               <w:left w:val="single" w:sz="4" w:space="0" w:color="BFBFBF"/>
@@ -20205,7 +20956,7 @@
         </w:tc>
         <w:tc>
           <w:tcPr>
-            <w:tcW w:w="3053" w:type="dxa"/>
+            <w:tcW w:w="3055" w:type="dxa"/>
             <w:tcBorders>
               <w:top w:val="single" w:sz="4" w:space="0" w:color="BFBFBF"/>
               <w:left w:val="single" w:sz="4" w:space="0" w:color="BFBFBF"/>
@@ -20247,7 +20998,7 @@
         </w:tc>
         <w:tc>
           <w:tcPr>
-            <w:tcW w:w="900" w:type="dxa"/>
+            <w:tcW w:w="899" w:type="dxa"/>
             <w:tcBorders>
               <w:top w:val="single" w:sz="4" w:space="0" w:color="BFBFBF"/>
               <w:left w:val="single" w:sz="4" w:space="0" w:color="BFBFBF"/>
@@ -20268,7 +21019,7 @@
         </w:tc>
         <w:tc>
           <w:tcPr>
-            <w:tcW w:w="2029" w:type="dxa"/>
+            <w:tcW w:w="2030" w:type="dxa"/>
             <w:tcBorders>
               <w:top w:val="single" w:sz="4" w:space="0" w:color="BFBFBF"/>
               <w:left w:val="single" w:sz="4" w:space="0" w:color="BFBFBF"/>
@@ -20347,17 +21098,17 @@
         </w:tblCellMar>
       </w:tblPr>
       <w:tblGrid>
-        <w:gridCol w:w="1697"/>
-        <w:gridCol w:w="3053"/>
+        <w:gridCol w:w="1695"/>
+        <w:gridCol w:w="3055"/>
         <w:gridCol w:w="1347"/>
-        <w:gridCol w:w="900"/>
-        <w:gridCol w:w="2029"/>
+        <w:gridCol w:w="899"/>
+        <w:gridCol w:w="2030"/>
       </w:tblGrid>
       <w:tr>
         <w:trPr/>
         <w:tc>
           <w:tcPr>
-            <w:tcW w:w="1697" w:type="dxa"/>
+            <w:tcW w:w="1695" w:type="dxa"/>
             <w:tcBorders>
               <w:top w:val="single" w:sz="4" w:space="0" w:color="BFBFBF"/>
               <w:left w:val="single" w:sz="4" w:space="0" w:color="BFBFBF"/>
@@ -20381,7 +21132,7 @@
         </w:tc>
         <w:tc>
           <w:tcPr>
-            <w:tcW w:w="3053" w:type="dxa"/>
+            <w:tcW w:w="3055" w:type="dxa"/>
             <w:tcBorders>
               <w:top w:val="single" w:sz="4" w:space="0" w:color="BFBFBF"/>
               <w:left w:val="single" w:sz="4" w:space="0" w:color="BFBFBF"/>
@@ -20429,7 +21180,7 @@
         </w:tc>
         <w:tc>
           <w:tcPr>
-            <w:tcW w:w="900" w:type="dxa"/>
+            <w:tcW w:w="899" w:type="dxa"/>
             <w:tcBorders>
               <w:top w:val="single" w:sz="4" w:space="0" w:color="BFBFBF"/>
               <w:left w:val="single" w:sz="4" w:space="0" w:color="BFBFBF"/>
@@ -20453,7 +21204,7 @@
         </w:tc>
         <w:tc>
           <w:tcPr>
-            <w:tcW w:w="2029" w:type="dxa"/>
+            <w:tcW w:w="2030" w:type="dxa"/>
             <w:tcBorders>
               <w:top w:val="single" w:sz="4" w:space="0" w:color="BFBFBF"/>
               <w:left w:val="single" w:sz="4" w:space="0" w:color="BFBFBF"/>
@@ -20480,7 +21231,7 @@
         <w:trPr/>
         <w:tc>
           <w:tcPr>
-            <w:tcW w:w="1697" w:type="dxa"/>
+            <w:tcW w:w="1695" w:type="dxa"/>
             <w:tcBorders>
               <w:top w:val="single" w:sz="4" w:space="0" w:color="BFBFBF"/>
               <w:left w:val="single" w:sz="4" w:space="0" w:color="BFBFBF"/>
@@ -20501,7 +21252,7 @@
         </w:tc>
         <w:tc>
           <w:tcPr>
-            <w:tcW w:w="3053" w:type="dxa"/>
+            <w:tcW w:w="3055" w:type="dxa"/>
             <w:tcBorders>
               <w:top w:val="single" w:sz="4" w:space="0" w:color="BFBFBF"/>
               <w:left w:val="single" w:sz="4" w:space="0" w:color="BFBFBF"/>
@@ -20543,7 +21294,7 @@
         </w:tc>
         <w:tc>
           <w:tcPr>
-            <w:tcW w:w="900" w:type="dxa"/>
+            <w:tcW w:w="899" w:type="dxa"/>
             <w:tcBorders>
               <w:top w:val="single" w:sz="4" w:space="0" w:color="BFBFBF"/>
               <w:left w:val="single" w:sz="4" w:space="0" w:color="BFBFBF"/>
@@ -20564,7 +21315,7 @@
         </w:tc>
         <w:tc>
           <w:tcPr>
-            <w:tcW w:w="2029" w:type="dxa"/>
+            <w:tcW w:w="2030" w:type="dxa"/>
             <w:tcBorders>
               <w:top w:val="single" w:sz="4" w:space="0" w:color="BFBFBF"/>
               <w:left w:val="single" w:sz="4" w:space="0" w:color="BFBFBF"/>
@@ -20588,7 +21339,7 @@
         <w:trPr/>
         <w:tc>
           <w:tcPr>
-            <w:tcW w:w="1697" w:type="dxa"/>
+            <w:tcW w:w="1695" w:type="dxa"/>
             <w:tcBorders>
               <w:top w:val="single" w:sz="4" w:space="0" w:color="BFBFBF"/>
               <w:left w:val="single" w:sz="4" w:space="0" w:color="BFBFBF"/>
@@ -20609,7 +21360,7 @@
         </w:tc>
         <w:tc>
           <w:tcPr>
-            <w:tcW w:w="3053" w:type="dxa"/>
+            <w:tcW w:w="3055" w:type="dxa"/>
             <w:tcBorders>
               <w:top w:val="single" w:sz="4" w:space="0" w:color="BFBFBF"/>
               <w:left w:val="single" w:sz="4" w:space="0" w:color="BFBFBF"/>
@@ -20651,7 +21402,7 @@
         </w:tc>
         <w:tc>
           <w:tcPr>
-            <w:tcW w:w="900" w:type="dxa"/>
+            <w:tcW w:w="899" w:type="dxa"/>
             <w:tcBorders>
               <w:top w:val="single" w:sz="4" w:space="0" w:color="BFBFBF"/>
               <w:left w:val="single" w:sz="4" w:space="0" w:color="BFBFBF"/>
@@ -20672,7 +21423,7 @@
         </w:tc>
         <w:tc>
           <w:tcPr>
-            <w:tcW w:w="2029" w:type="dxa"/>
+            <w:tcW w:w="2030" w:type="dxa"/>
             <w:tcBorders>
               <w:top w:val="single" w:sz="4" w:space="0" w:color="BFBFBF"/>
               <w:left w:val="single" w:sz="4" w:space="0" w:color="BFBFBF"/>
@@ -20696,7 +21447,7 @@
         <w:trPr/>
         <w:tc>
           <w:tcPr>
-            <w:tcW w:w="1697" w:type="dxa"/>
+            <w:tcW w:w="1695" w:type="dxa"/>
             <w:tcBorders>
               <w:top w:val="single" w:sz="4" w:space="0" w:color="BFBFBF"/>
               <w:left w:val="single" w:sz="4" w:space="0" w:color="BFBFBF"/>
@@ -20717,7 +21468,7 @@
         </w:tc>
         <w:tc>
           <w:tcPr>
-            <w:tcW w:w="3053" w:type="dxa"/>
+            <w:tcW w:w="3055" w:type="dxa"/>
             <w:tcBorders>
               <w:top w:val="single" w:sz="4" w:space="0" w:color="BFBFBF"/>
               <w:left w:val="single" w:sz="4" w:space="0" w:color="BFBFBF"/>
@@ -20759,7 +21510,7 @@
         </w:tc>
         <w:tc>
           <w:tcPr>
-            <w:tcW w:w="900" w:type="dxa"/>
+            <w:tcW w:w="899" w:type="dxa"/>
             <w:tcBorders>
               <w:top w:val="single" w:sz="4" w:space="0" w:color="BFBFBF"/>
               <w:left w:val="single" w:sz="4" w:space="0" w:color="BFBFBF"/>
@@ -20780,7 +21531,7 @@
         </w:tc>
         <w:tc>
           <w:tcPr>
-            <w:tcW w:w="2029" w:type="dxa"/>
+            <w:tcW w:w="2030" w:type="dxa"/>
             <w:tcBorders>
               <w:top w:val="single" w:sz="4" w:space="0" w:color="BFBFBF"/>
               <w:left w:val="single" w:sz="4" w:space="0" w:color="BFBFBF"/>
@@ -20804,7 +21555,7 @@
         <w:trPr/>
         <w:tc>
           <w:tcPr>
-            <w:tcW w:w="1697" w:type="dxa"/>
+            <w:tcW w:w="1695" w:type="dxa"/>
             <w:tcBorders>
               <w:top w:val="single" w:sz="4" w:space="0" w:color="BFBFBF"/>
               <w:left w:val="single" w:sz="4" w:space="0" w:color="BFBFBF"/>
@@ -20825,7 +21576,7 @@
         </w:tc>
         <w:tc>
           <w:tcPr>
-            <w:tcW w:w="3053" w:type="dxa"/>
+            <w:tcW w:w="3055" w:type="dxa"/>
             <w:tcBorders>
               <w:top w:val="single" w:sz="4" w:space="0" w:color="BFBFBF"/>
               <w:left w:val="single" w:sz="4" w:space="0" w:color="BFBFBF"/>
@@ -20867,7 +21618,7 @@
         </w:tc>
         <w:tc>
           <w:tcPr>
-            <w:tcW w:w="900" w:type="dxa"/>
+            <w:tcW w:w="899" w:type="dxa"/>
             <w:tcBorders>
               <w:top w:val="single" w:sz="4" w:space="0" w:color="BFBFBF"/>
               <w:left w:val="single" w:sz="4" w:space="0" w:color="BFBFBF"/>
@@ -20888,7 +21639,7 @@
         </w:tc>
         <w:tc>
           <w:tcPr>
-            <w:tcW w:w="2029" w:type="dxa"/>
+            <w:tcW w:w="2030" w:type="dxa"/>
             <w:tcBorders>
               <w:top w:val="single" w:sz="4" w:space="0" w:color="BFBFBF"/>
               <w:left w:val="single" w:sz="4" w:space="0" w:color="BFBFBF"/>
@@ -20912,7 +21663,7 @@
         <w:trPr/>
         <w:tc>
           <w:tcPr>
-            <w:tcW w:w="1697" w:type="dxa"/>
+            <w:tcW w:w="1695" w:type="dxa"/>
             <w:tcBorders>
               <w:top w:val="single" w:sz="4" w:space="0" w:color="BFBFBF"/>
               <w:left w:val="single" w:sz="4" w:space="0" w:color="BFBFBF"/>
@@ -20933,7 +21684,7 @@
         </w:tc>
         <w:tc>
           <w:tcPr>
-            <w:tcW w:w="3053" w:type="dxa"/>
+            <w:tcW w:w="3055" w:type="dxa"/>
             <w:tcBorders>
               <w:top w:val="single" w:sz="4" w:space="0" w:color="BFBFBF"/>
               <w:left w:val="single" w:sz="4" w:space="0" w:color="BFBFBF"/>
@@ -20975,7 +21726,7 @@
         </w:tc>
         <w:tc>
           <w:tcPr>
-            <w:tcW w:w="900" w:type="dxa"/>
+            <w:tcW w:w="899" w:type="dxa"/>
             <w:tcBorders>
               <w:top w:val="single" w:sz="4" w:space="0" w:color="BFBFBF"/>
               <w:left w:val="single" w:sz="4" w:space="0" w:color="BFBFBF"/>
@@ -20996,7 +21747,7 @@
         </w:tc>
         <w:tc>
           <w:tcPr>
-            <w:tcW w:w="2029" w:type="dxa"/>
+            <w:tcW w:w="2030" w:type="dxa"/>
             <w:tcBorders>
               <w:top w:val="single" w:sz="4" w:space="0" w:color="BFBFBF"/>
               <w:left w:val="single" w:sz="4" w:space="0" w:color="BFBFBF"/>
@@ -21075,17 +21826,17 @@
         </w:tblCellMar>
       </w:tblPr>
       <w:tblGrid>
-        <w:gridCol w:w="1697"/>
-        <w:gridCol w:w="3053"/>
+        <w:gridCol w:w="1695"/>
+        <w:gridCol w:w="3055"/>
         <w:gridCol w:w="1347"/>
-        <w:gridCol w:w="900"/>
-        <w:gridCol w:w="2029"/>
+        <w:gridCol w:w="899"/>
+        <w:gridCol w:w="2030"/>
       </w:tblGrid>
       <w:tr>
         <w:trPr/>
         <w:tc>
           <w:tcPr>
-            <w:tcW w:w="1697" w:type="dxa"/>
+            <w:tcW w:w="1695" w:type="dxa"/>
             <w:tcBorders>
               <w:top w:val="single" w:sz="4" w:space="0" w:color="BFBFBF"/>
               <w:left w:val="single" w:sz="4" w:space="0" w:color="BFBFBF"/>
@@ -21109,7 +21860,7 @@
         </w:tc>
         <w:tc>
           <w:tcPr>
-            <w:tcW w:w="3053" w:type="dxa"/>
+            <w:tcW w:w="3055" w:type="dxa"/>
             <w:tcBorders>
               <w:top w:val="single" w:sz="4" w:space="0" w:color="BFBFBF"/>
               <w:left w:val="single" w:sz="4" w:space="0" w:color="BFBFBF"/>
@@ -21157,7 +21908,7 @@
         </w:tc>
         <w:tc>
           <w:tcPr>
-            <w:tcW w:w="900" w:type="dxa"/>
+            <w:tcW w:w="899" w:type="dxa"/>
             <w:tcBorders>
               <w:top w:val="single" w:sz="4" w:space="0" w:color="BFBFBF"/>
               <w:left w:val="single" w:sz="4" w:space="0" w:color="BFBFBF"/>
@@ -21181,7 +21932,7 @@
         </w:tc>
         <w:tc>
           <w:tcPr>
-            <w:tcW w:w="2029" w:type="dxa"/>
+            <w:tcW w:w="2030" w:type="dxa"/>
             <w:tcBorders>
               <w:top w:val="single" w:sz="4" w:space="0" w:color="BFBFBF"/>
               <w:left w:val="single" w:sz="4" w:space="0" w:color="BFBFBF"/>
@@ -21208,7 +21959,7 @@
         <w:trPr/>
         <w:tc>
           <w:tcPr>
-            <w:tcW w:w="1697" w:type="dxa"/>
+            <w:tcW w:w="1695" w:type="dxa"/>
             <w:tcBorders>
               <w:top w:val="single" w:sz="4" w:space="0" w:color="BFBFBF"/>
               <w:left w:val="single" w:sz="4" w:space="0" w:color="BFBFBF"/>
@@ -21229,7 +21980,7 @@
         </w:tc>
         <w:tc>
           <w:tcPr>
-            <w:tcW w:w="3053" w:type="dxa"/>
+            <w:tcW w:w="3055" w:type="dxa"/>
             <w:tcBorders>
               <w:top w:val="single" w:sz="4" w:space="0" w:color="BFBFBF"/>
               <w:left w:val="single" w:sz="4" w:space="0" w:color="BFBFBF"/>
@@ -21271,7 +22022,7 @@
         </w:tc>
         <w:tc>
           <w:tcPr>
-            <w:tcW w:w="900" w:type="dxa"/>
+            <w:tcW w:w="899" w:type="dxa"/>
             <w:tcBorders>
               <w:top w:val="single" w:sz="4" w:space="0" w:color="BFBFBF"/>
               <w:left w:val="single" w:sz="4" w:space="0" w:color="BFBFBF"/>
@@ -21292,7 +22043,7 @@
         </w:tc>
         <w:tc>
           <w:tcPr>
-            <w:tcW w:w="2029" w:type="dxa"/>
+            <w:tcW w:w="2030" w:type="dxa"/>
             <w:tcBorders>
               <w:top w:val="single" w:sz="4" w:space="0" w:color="BFBFBF"/>
               <w:left w:val="single" w:sz="4" w:space="0" w:color="BFBFBF"/>
@@ -21316,7 +22067,7 @@
         <w:trPr/>
         <w:tc>
           <w:tcPr>
-            <w:tcW w:w="1697" w:type="dxa"/>
+            <w:tcW w:w="1695" w:type="dxa"/>
             <w:tcBorders>
               <w:top w:val="single" w:sz="4" w:space="0" w:color="BFBFBF"/>
               <w:left w:val="single" w:sz="4" w:space="0" w:color="BFBFBF"/>
@@ -21337,7 +22088,7 @@
         </w:tc>
         <w:tc>
           <w:tcPr>
-            <w:tcW w:w="3053" w:type="dxa"/>
+            <w:tcW w:w="3055" w:type="dxa"/>
             <w:tcBorders>
               <w:top w:val="single" w:sz="4" w:space="0" w:color="BFBFBF"/>
               <w:left w:val="single" w:sz="4" w:space="0" w:color="BFBFBF"/>
@@ -21379,7 +22130,7 @@
         </w:tc>
         <w:tc>
           <w:tcPr>
-            <w:tcW w:w="900" w:type="dxa"/>
+            <w:tcW w:w="899" w:type="dxa"/>
             <w:tcBorders>
               <w:top w:val="single" w:sz="4" w:space="0" w:color="BFBFBF"/>
               <w:left w:val="single" w:sz="4" w:space="0" w:color="BFBFBF"/>
@@ -21400,7 +22151,7 @@
         </w:tc>
         <w:tc>
           <w:tcPr>
-            <w:tcW w:w="2029" w:type="dxa"/>
+            <w:tcW w:w="2030" w:type="dxa"/>
             <w:tcBorders>
               <w:top w:val="single" w:sz="4" w:space="0" w:color="BFBFBF"/>
               <w:left w:val="single" w:sz="4" w:space="0" w:color="BFBFBF"/>
@@ -21424,7 +22175,7 @@
         <w:trPr/>
         <w:tc>
           <w:tcPr>
-            <w:tcW w:w="1697" w:type="dxa"/>
+            <w:tcW w:w="1695" w:type="dxa"/>
             <w:tcBorders>
               <w:top w:val="single" w:sz="4" w:space="0" w:color="BFBFBF"/>
               <w:left w:val="single" w:sz="4" w:space="0" w:color="BFBFBF"/>
@@ -21445,7 +22196,7 @@
         </w:tc>
         <w:tc>
           <w:tcPr>
-            <w:tcW w:w="3053" w:type="dxa"/>
+            <w:tcW w:w="3055" w:type="dxa"/>
             <w:tcBorders>
               <w:top w:val="single" w:sz="4" w:space="0" w:color="BFBFBF"/>
               <w:left w:val="single" w:sz="4" w:space="0" w:color="BFBFBF"/>
@@ -21487,7 +22238,7 @@
         </w:tc>
         <w:tc>
           <w:tcPr>
-            <w:tcW w:w="900" w:type="dxa"/>
+            <w:tcW w:w="899" w:type="dxa"/>
             <w:tcBorders>
               <w:top w:val="single" w:sz="4" w:space="0" w:color="BFBFBF"/>
               <w:left w:val="single" w:sz="4" w:space="0" w:color="BFBFBF"/>
@@ -21508,7 +22259,7 @@
         </w:tc>
         <w:tc>
           <w:tcPr>
-            <w:tcW w:w="2029" w:type="dxa"/>
+            <w:tcW w:w="2030" w:type="dxa"/>
             <w:tcBorders>
               <w:top w:val="single" w:sz="4" w:space="0" w:color="BFBFBF"/>
               <w:left w:val="single" w:sz="4" w:space="0" w:color="BFBFBF"/>
@@ -21532,7 +22283,7 @@
         <w:trPr/>
         <w:tc>
           <w:tcPr>
-            <w:tcW w:w="1697" w:type="dxa"/>
+            <w:tcW w:w="1695" w:type="dxa"/>
             <w:tcBorders>
               <w:top w:val="single" w:sz="4" w:space="0" w:color="BFBFBF"/>
               <w:left w:val="single" w:sz="4" w:space="0" w:color="BFBFBF"/>
@@ -21553,7 +22304,7 @@
         </w:tc>
         <w:tc>
           <w:tcPr>
-            <w:tcW w:w="3053" w:type="dxa"/>
+            <w:tcW w:w="3055" w:type="dxa"/>
             <w:tcBorders>
               <w:top w:val="single" w:sz="4" w:space="0" w:color="BFBFBF"/>
               <w:left w:val="single" w:sz="4" w:space="0" w:color="BFBFBF"/>
@@ -21595,7 +22346,7 @@
         </w:tc>
         <w:tc>
           <w:tcPr>
-            <w:tcW w:w="900" w:type="dxa"/>
+            <w:tcW w:w="899" w:type="dxa"/>
             <w:tcBorders>
               <w:top w:val="single" w:sz="4" w:space="0" w:color="BFBFBF"/>
               <w:left w:val="single" w:sz="4" w:space="0" w:color="BFBFBF"/>
@@ -21616,7 +22367,7 @@
         </w:tc>
         <w:tc>
           <w:tcPr>
-            <w:tcW w:w="2029" w:type="dxa"/>
+            <w:tcW w:w="2030" w:type="dxa"/>
             <w:tcBorders>
               <w:top w:val="single" w:sz="4" w:space="0" w:color="BFBFBF"/>
               <w:left w:val="single" w:sz="4" w:space="0" w:color="BFBFBF"/>
@@ -21640,7 +22391,7 @@
         <w:trPr/>
         <w:tc>
           <w:tcPr>
-            <w:tcW w:w="1697" w:type="dxa"/>
+            <w:tcW w:w="1695" w:type="dxa"/>
             <w:tcBorders>
               <w:top w:val="single" w:sz="4" w:space="0" w:color="BFBFBF"/>
               <w:left w:val="single" w:sz="4" w:space="0" w:color="BFBFBF"/>
@@ -21661,7 +22412,7 @@
         </w:tc>
         <w:tc>
           <w:tcPr>
-            <w:tcW w:w="3053" w:type="dxa"/>
+            <w:tcW w:w="3055" w:type="dxa"/>
             <w:tcBorders>
               <w:top w:val="single" w:sz="4" w:space="0" w:color="BFBFBF"/>
               <w:left w:val="single" w:sz="4" w:space="0" w:color="BFBFBF"/>
@@ -21703,7 +22454,7 @@
         </w:tc>
         <w:tc>
           <w:tcPr>
-            <w:tcW w:w="900" w:type="dxa"/>
+            <w:tcW w:w="899" w:type="dxa"/>
             <w:tcBorders>
               <w:top w:val="single" w:sz="4" w:space="0" w:color="BFBFBF"/>
               <w:left w:val="single" w:sz="4" w:space="0" w:color="BFBFBF"/>
@@ -21724,7 +22475,7 @@
         </w:tc>
         <w:tc>
           <w:tcPr>
-            <w:tcW w:w="2029" w:type="dxa"/>
+            <w:tcW w:w="2030" w:type="dxa"/>
             <w:tcBorders>
               <w:top w:val="single" w:sz="4" w:space="0" w:color="BFBFBF"/>
               <w:left w:val="single" w:sz="4" w:space="0" w:color="BFBFBF"/>
@@ -21748,7 +22499,7 @@
         <w:trPr/>
         <w:tc>
           <w:tcPr>
-            <w:tcW w:w="1697" w:type="dxa"/>
+            <w:tcW w:w="1695" w:type="dxa"/>
             <w:tcBorders>
               <w:top w:val="single" w:sz="4" w:space="0" w:color="BFBFBF"/>
               <w:left w:val="single" w:sz="4" w:space="0" w:color="BFBFBF"/>
@@ -21769,7 +22520,7 @@
         </w:tc>
         <w:tc>
           <w:tcPr>
-            <w:tcW w:w="3053" w:type="dxa"/>
+            <w:tcW w:w="3055" w:type="dxa"/>
             <w:tcBorders>
               <w:top w:val="single" w:sz="4" w:space="0" w:color="BFBFBF"/>
               <w:left w:val="single" w:sz="4" w:space="0" w:color="BFBFBF"/>
@@ -21811,7 +22562,7 @@
         </w:tc>
         <w:tc>
           <w:tcPr>
-            <w:tcW w:w="900" w:type="dxa"/>
+            <w:tcW w:w="899" w:type="dxa"/>
             <w:tcBorders>
               <w:top w:val="single" w:sz="4" w:space="0" w:color="BFBFBF"/>
               <w:left w:val="single" w:sz="4" w:space="0" w:color="BFBFBF"/>
@@ -21832,7 +22583,7 @@
         </w:tc>
         <w:tc>
           <w:tcPr>
-            <w:tcW w:w="2029" w:type="dxa"/>
+            <w:tcW w:w="2030" w:type="dxa"/>
             <w:tcBorders>
               <w:top w:val="single" w:sz="4" w:space="0" w:color="BFBFBF"/>
               <w:left w:val="single" w:sz="4" w:space="0" w:color="BFBFBF"/>
@@ -21856,7 +22607,7 @@
         <w:trPr/>
         <w:tc>
           <w:tcPr>
-            <w:tcW w:w="1697" w:type="dxa"/>
+            <w:tcW w:w="1695" w:type="dxa"/>
             <w:tcBorders>
               <w:top w:val="single" w:sz="4" w:space="0" w:color="BFBFBF"/>
               <w:left w:val="single" w:sz="4" w:space="0" w:color="BFBFBF"/>
@@ -21877,7 +22628,7 @@
         </w:tc>
         <w:tc>
           <w:tcPr>
-            <w:tcW w:w="3053" w:type="dxa"/>
+            <w:tcW w:w="3055" w:type="dxa"/>
             <w:tcBorders>
               <w:top w:val="single" w:sz="4" w:space="0" w:color="BFBFBF"/>
               <w:left w:val="single" w:sz="4" w:space="0" w:color="BFBFBF"/>
@@ -21919,7 +22670,7 @@
         </w:tc>
         <w:tc>
           <w:tcPr>
-            <w:tcW w:w="900" w:type="dxa"/>
+            <w:tcW w:w="899" w:type="dxa"/>
             <w:tcBorders>
               <w:top w:val="single" w:sz="4" w:space="0" w:color="BFBFBF"/>
               <w:left w:val="single" w:sz="4" w:space="0" w:color="BFBFBF"/>
@@ -21940,7 +22691,7 @@
         </w:tc>
         <w:tc>
           <w:tcPr>
-            <w:tcW w:w="2029" w:type="dxa"/>
+            <w:tcW w:w="2030" w:type="dxa"/>
             <w:tcBorders>
               <w:top w:val="single" w:sz="4" w:space="0" w:color="BFBFBF"/>
               <w:left w:val="single" w:sz="4" w:space="0" w:color="BFBFBF"/>
@@ -21964,7 +22715,7 @@
         <w:trPr/>
         <w:tc>
           <w:tcPr>
-            <w:tcW w:w="1697" w:type="dxa"/>
+            <w:tcW w:w="1695" w:type="dxa"/>
             <w:tcBorders>
               <w:top w:val="single" w:sz="4" w:space="0" w:color="BFBFBF"/>
               <w:left w:val="single" w:sz="4" w:space="0" w:color="BFBFBF"/>
@@ -21985,7 +22736,7 @@
         </w:tc>
         <w:tc>
           <w:tcPr>
-            <w:tcW w:w="3053" w:type="dxa"/>
+            <w:tcW w:w="3055" w:type="dxa"/>
             <w:tcBorders>
               <w:top w:val="single" w:sz="4" w:space="0" w:color="BFBFBF"/>
               <w:left w:val="single" w:sz="4" w:space="0" w:color="BFBFBF"/>
@@ -22027,7 +22778,7 @@
         </w:tc>
         <w:tc>
           <w:tcPr>
-            <w:tcW w:w="900" w:type="dxa"/>
+            <w:tcW w:w="899" w:type="dxa"/>
             <w:tcBorders>
               <w:top w:val="single" w:sz="4" w:space="0" w:color="BFBFBF"/>
               <w:left w:val="single" w:sz="4" w:space="0" w:color="BFBFBF"/>
@@ -22048,7 +22799,7 @@
         </w:tc>
         <w:tc>
           <w:tcPr>
-            <w:tcW w:w="2029" w:type="dxa"/>
+            <w:tcW w:w="2030" w:type="dxa"/>
             <w:tcBorders>
               <w:top w:val="single" w:sz="4" w:space="0" w:color="BFBFBF"/>
               <w:left w:val="single" w:sz="4" w:space="0" w:color="BFBFBF"/>
@@ -22072,7 +22823,7 @@
         <w:trPr/>
         <w:tc>
           <w:tcPr>
-            <w:tcW w:w="1697" w:type="dxa"/>
+            <w:tcW w:w="1695" w:type="dxa"/>
             <w:tcBorders>
               <w:top w:val="single" w:sz="4" w:space="0" w:color="BFBFBF"/>
               <w:left w:val="single" w:sz="4" w:space="0" w:color="BFBFBF"/>
@@ -22093,7 +22844,7 @@
         </w:tc>
         <w:tc>
           <w:tcPr>
-            <w:tcW w:w="3053" w:type="dxa"/>
+            <w:tcW w:w="3055" w:type="dxa"/>
             <w:tcBorders>
               <w:top w:val="single" w:sz="4" w:space="0" w:color="BFBFBF"/>
               <w:left w:val="single" w:sz="4" w:space="0" w:color="BFBFBF"/>
@@ -22135,7 +22886,7 @@
         </w:tc>
         <w:tc>
           <w:tcPr>
-            <w:tcW w:w="900" w:type="dxa"/>
+            <w:tcW w:w="899" w:type="dxa"/>
             <w:tcBorders>
               <w:top w:val="single" w:sz="4" w:space="0" w:color="BFBFBF"/>
               <w:left w:val="single" w:sz="4" w:space="0" w:color="BFBFBF"/>
@@ -22156,7 +22907,7 @@
         </w:tc>
         <w:tc>
           <w:tcPr>
-            <w:tcW w:w="2029" w:type="dxa"/>
+            <w:tcW w:w="2030" w:type="dxa"/>
             <w:tcBorders>
               <w:top w:val="single" w:sz="4" w:space="0" w:color="BFBFBF"/>
               <w:left w:val="single" w:sz="4" w:space="0" w:color="BFBFBF"/>
@@ -22180,7 +22931,7 @@
         <w:trPr/>
         <w:tc>
           <w:tcPr>
-            <w:tcW w:w="1697" w:type="dxa"/>
+            <w:tcW w:w="1695" w:type="dxa"/>
             <w:tcBorders>
               <w:top w:val="single" w:sz="4" w:space="0" w:color="BFBFBF"/>
               <w:left w:val="single" w:sz="4" w:space="0" w:color="BFBFBF"/>
@@ -22201,7 +22952,7 @@
         </w:tc>
         <w:tc>
           <w:tcPr>
-            <w:tcW w:w="3053" w:type="dxa"/>
+            <w:tcW w:w="3055" w:type="dxa"/>
             <w:tcBorders>
               <w:top w:val="single" w:sz="4" w:space="0" w:color="BFBFBF"/>
               <w:left w:val="single" w:sz="4" w:space="0" w:color="BFBFBF"/>
@@ -22243,7 +22994,7 @@
         </w:tc>
         <w:tc>
           <w:tcPr>
-            <w:tcW w:w="900" w:type="dxa"/>
+            <w:tcW w:w="899" w:type="dxa"/>
             <w:tcBorders>
               <w:top w:val="single" w:sz="4" w:space="0" w:color="BFBFBF"/>
               <w:left w:val="single" w:sz="4" w:space="0" w:color="BFBFBF"/>
@@ -22264,7 +23015,7 @@
         </w:tc>
         <w:tc>
           <w:tcPr>
-            <w:tcW w:w="2029" w:type="dxa"/>
+            <w:tcW w:w="2030" w:type="dxa"/>
             <w:tcBorders>
               <w:top w:val="single" w:sz="4" w:space="0" w:color="BFBFBF"/>
               <w:left w:val="single" w:sz="4" w:space="0" w:color="BFBFBF"/>
@@ -22343,17 +23094,17 @@
         </w:tblCellMar>
       </w:tblPr>
       <w:tblGrid>
-        <w:gridCol w:w="1697"/>
-        <w:gridCol w:w="3053"/>
+        <w:gridCol w:w="1695"/>
+        <w:gridCol w:w="3055"/>
         <w:gridCol w:w="1347"/>
-        <w:gridCol w:w="900"/>
-        <w:gridCol w:w="2029"/>
+        <w:gridCol w:w="899"/>
+        <w:gridCol w:w="2030"/>
       </w:tblGrid>
       <w:tr>
         <w:trPr/>
         <w:tc>
           <w:tcPr>
-            <w:tcW w:w="1697" w:type="dxa"/>
+            <w:tcW w:w="1695" w:type="dxa"/>
             <w:tcBorders>
               <w:top w:val="single" w:sz="4" w:space="0" w:color="BFBFBF"/>
               <w:left w:val="single" w:sz="4" w:space="0" w:color="BFBFBF"/>
@@ -22377,7 +23128,7 @@
         </w:tc>
         <w:tc>
           <w:tcPr>
-            <w:tcW w:w="3053" w:type="dxa"/>
+            <w:tcW w:w="3055" w:type="dxa"/>
             <w:tcBorders>
               <w:top w:val="single" w:sz="4" w:space="0" w:color="BFBFBF"/>
               <w:left w:val="single" w:sz="4" w:space="0" w:color="BFBFBF"/>
@@ -22425,7 +23176,7 @@
         </w:tc>
         <w:tc>
           <w:tcPr>
-            <w:tcW w:w="900" w:type="dxa"/>
+            <w:tcW w:w="899" w:type="dxa"/>
             <w:tcBorders>
               <w:top w:val="single" w:sz="4" w:space="0" w:color="BFBFBF"/>
               <w:left w:val="single" w:sz="4" w:space="0" w:color="BFBFBF"/>
@@ -22449,7 +23200,7 @@
         </w:tc>
         <w:tc>
           <w:tcPr>
-            <w:tcW w:w="2029" w:type="dxa"/>
+            <w:tcW w:w="2030" w:type="dxa"/>
             <w:tcBorders>
               <w:top w:val="single" w:sz="4" w:space="0" w:color="BFBFBF"/>
               <w:left w:val="single" w:sz="4" w:space="0" w:color="BFBFBF"/>
@@ -22476,7 +23227,7 @@
         <w:trPr/>
         <w:tc>
           <w:tcPr>
-            <w:tcW w:w="1697" w:type="dxa"/>
+            <w:tcW w:w="1695" w:type="dxa"/>
             <w:tcBorders>
               <w:top w:val="single" w:sz="4" w:space="0" w:color="BFBFBF"/>
               <w:left w:val="single" w:sz="4" w:space="0" w:color="BFBFBF"/>
@@ -22497,7 +23248,7 @@
         </w:tc>
         <w:tc>
           <w:tcPr>
-            <w:tcW w:w="3053" w:type="dxa"/>
+            <w:tcW w:w="3055" w:type="dxa"/>
             <w:tcBorders>
               <w:top w:val="single" w:sz="4" w:space="0" w:color="BFBFBF"/>
               <w:left w:val="single" w:sz="4" w:space="0" w:color="BFBFBF"/>
@@ -22539,7 +23290,7 @@
         </w:tc>
         <w:tc>
           <w:tcPr>
-            <w:tcW w:w="900" w:type="dxa"/>
+            <w:tcW w:w="899" w:type="dxa"/>
             <w:tcBorders>
               <w:top w:val="single" w:sz="4" w:space="0" w:color="BFBFBF"/>
               <w:left w:val="single" w:sz="4" w:space="0" w:color="BFBFBF"/>
@@ -22560,7 +23311,7 @@
         </w:tc>
         <w:tc>
           <w:tcPr>
-            <w:tcW w:w="2029" w:type="dxa"/>
+            <w:tcW w:w="2030" w:type="dxa"/>
             <w:tcBorders>
               <w:top w:val="single" w:sz="4" w:space="0" w:color="BFBFBF"/>
               <w:left w:val="single" w:sz="4" w:space="0" w:color="BFBFBF"/>
@@ -22584,7 +23335,7 @@
         <w:trPr/>
         <w:tc>
           <w:tcPr>
-            <w:tcW w:w="1697" w:type="dxa"/>
+            <w:tcW w:w="1695" w:type="dxa"/>
             <w:tcBorders>
               <w:top w:val="single" w:sz="4" w:space="0" w:color="BFBFBF"/>
               <w:left w:val="single" w:sz="4" w:space="0" w:color="BFBFBF"/>
@@ -22605,7 +23356,7 @@
         </w:tc>
         <w:tc>
           <w:tcPr>
-            <w:tcW w:w="3053" w:type="dxa"/>
+            <w:tcW w:w="3055" w:type="dxa"/>
             <w:tcBorders>
               <w:top w:val="single" w:sz="4" w:space="0" w:color="BFBFBF"/>
               <w:left w:val="single" w:sz="4" w:space="0" w:color="BFBFBF"/>
@@ -22647,7 +23398,7 @@
         </w:tc>
         <w:tc>
           <w:tcPr>
-            <w:tcW w:w="900" w:type="dxa"/>
+            <w:tcW w:w="899" w:type="dxa"/>
             <w:tcBorders>
               <w:top w:val="single" w:sz="4" w:space="0" w:color="BFBFBF"/>
               <w:left w:val="single" w:sz="4" w:space="0" w:color="BFBFBF"/>
@@ -22668,7 +23419,7 @@
         </w:tc>
         <w:tc>
           <w:tcPr>
-            <w:tcW w:w="2029" w:type="dxa"/>
+            <w:tcW w:w="2030" w:type="dxa"/>
             <w:tcBorders>
               <w:top w:val="single" w:sz="4" w:space="0" w:color="BFBFBF"/>
               <w:left w:val="single" w:sz="4" w:space="0" w:color="BFBFBF"/>
@@ -22692,7 +23443,7 @@
         <w:trPr/>
         <w:tc>
           <w:tcPr>
-            <w:tcW w:w="1697" w:type="dxa"/>
+            <w:tcW w:w="1695" w:type="dxa"/>
             <w:tcBorders>
               <w:top w:val="single" w:sz="4" w:space="0" w:color="BFBFBF"/>
               <w:left w:val="single" w:sz="4" w:space="0" w:color="BFBFBF"/>
@@ -22713,7 +23464,7 @@
         </w:tc>
         <w:tc>
           <w:tcPr>
-            <w:tcW w:w="3053" w:type="dxa"/>
+            <w:tcW w:w="3055" w:type="dxa"/>
             <w:tcBorders>
               <w:top w:val="single" w:sz="4" w:space="0" w:color="BFBFBF"/>
               <w:left w:val="single" w:sz="4" w:space="0" w:color="BFBFBF"/>
@@ -22755,7 +23506,7 @@
         </w:tc>
         <w:tc>
           <w:tcPr>
-            <w:tcW w:w="900" w:type="dxa"/>
+            <w:tcW w:w="899" w:type="dxa"/>
             <w:tcBorders>
               <w:top w:val="single" w:sz="4" w:space="0" w:color="BFBFBF"/>
               <w:left w:val="single" w:sz="4" w:space="0" w:color="BFBFBF"/>
@@ -22776,7 +23527,7 @@
         </w:tc>
         <w:tc>
           <w:tcPr>
-            <w:tcW w:w="2029" w:type="dxa"/>
+            <w:tcW w:w="2030" w:type="dxa"/>
             <w:tcBorders>
               <w:top w:val="single" w:sz="4" w:space="0" w:color="BFBFBF"/>
               <w:left w:val="single" w:sz="4" w:space="0" w:color="BFBFBF"/>
@@ -22800,7 +23551,7 @@
         <w:trPr/>
         <w:tc>
           <w:tcPr>
-            <w:tcW w:w="1697" w:type="dxa"/>
+            <w:tcW w:w="1695" w:type="dxa"/>
             <w:tcBorders>
               <w:top w:val="single" w:sz="4" w:space="0" w:color="BFBFBF"/>
               <w:left w:val="single" w:sz="4" w:space="0" w:color="BFBFBF"/>
@@ -22821,7 +23572,7 @@
         </w:tc>
         <w:tc>
           <w:tcPr>
-            <w:tcW w:w="3053" w:type="dxa"/>
+            <w:tcW w:w="3055" w:type="dxa"/>
             <w:tcBorders>
               <w:top w:val="single" w:sz="4" w:space="0" w:color="BFBFBF"/>
               <w:left w:val="single" w:sz="4" w:space="0" w:color="BFBFBF"/>
@@ -22863,7 +23614,7 @@
         </w:tc>
         <w:tc>
           <w:tcPr>
-            <w:tcW w:w="900" w:type="dxa"/>
+            <w:tcW w:w="899" w:type="dxa"/>
             <w:tcBorders>
               <w:top w:val="single" w:sz="4" w:space="0" w:color="BFBFBF"/>
               <w:left w:val="single" w:sz="4" w:space="0" w:color="BFBFBF"/>
@@ -22884,7 +23635,7 @@
         </w:tc>
         <w:tc>
           <w:tcPr>
-            <w:tcW w:w="2029" w:type="dxa"/>
+            <w:tcW w:w="2030" w:type="dxa"/>
             <w:tcBorders>
               <w:top w:val="single" w:sz="4" w:space="0" w:color="BFBFBF"/>
               <w:left w:val="single" w:sz="4" w:space="0" w:color="BFBFBF"/>
@@ -22908,7 +23659,7 @@
         <w:trPr/>
         <w:tc>
           <w:tcPr>
-            <w:tcW w:w="1697" w:type="dxa"/>
+            <w:tcW w:w="1695" w:type="dxa"/>
             <w:tcBorders>
               <w:top w:val="single" w:sz="4" w:space="0" w:color="BFBFBF"/>
               <w:left w:val="single" w:sz="4" w:space="0" w:color="BFBFBF"/>
@@ -22929,7 +23680,7 @@
         </w:tc>
         <w:tc>
           <w:tcPr>
-            <w:tcW w:w="3053" w:type="dxa"/>
+            <w:tcW w:w="3055" w:type="dxa"/>
             <w:tcBorders>
               <w:top w:val="single" w:sz="4" w:space="0" w:color="BFBFBF"/>
               <w:left w:val="single" w:sz="4" w:space="0" w:color="BFBFBF"/>
@@ -22971,7 +23722,7 @@
         </w:tc>
         <w:tc>
           <w:tcPr>
-            <w:tcW w:w="900" w:type="dxa"/>
+            <w:tcW w:w="899" w:type="dxa"/>
             <w:tcBorders>
               <w:top w:val="single" w:sz="4" w:space="0" w:color="BFBFBF"/>
               <w:left w:val="single" w:sz="4" w:space="0" w:color="BFBFBF"/>
@@ -22992,7 +23743,7 @@
         </w:tc>
         <w:tc>
           <w:tcPr>
-            <w:tcW w:w="2029" w:type="dxa"/>
+            <w:tcW w:w="2030" w:type="dxa"/>
             <w:tcBorders>
               <w:top w:val="single" w:sz="4" w:space="0" w:color="BFBFBF"/>
               <w:left w:val="single" w:sz="4" w:space="0" w:color="BFBFBF"/>
@@ -23079,17 +23830,17 @@
         </w:tblCellMar>
       </w:tblPr>
       <w:tblGrid>
-        <w:gridCol w:w="1698"/>
-        <w:gridCol w:w="3052"/>
-        <w:gridCol w:w="1348"/>
-        <w:gridCol w:w="900"/>
-        <w:gridCol w:w="2028"/>
+        <w:gridCol w:w="1696"/>
+        <w:gridCol w:w="3054"/>
+        <w:gridCol w:w="1347"/>
+        <w:gridCol w:w="899"/>
+        <w:gridCol w:w="2030"/>
       </w:tblGrid>
       <w:tr>
         <w:trPr/>
         <w:tc>
           <w:tcPr>
-            <w:tcW w:w="1698" w:type="dxa"/>
+            <w:tcW w:w="1696" w:type="dxa"/>
             <w:tcBorders>
               <w:top w:val="single" w:sz="4" w:space="0" w:color="BFBFBF"/>
               <w:left w:val="single" w:sz="4" w:space="0" w:color="BFBFBF"/>
@@ -23113,7 +23864,7 @@
         </w:tc>
         <w:tc>
           <w:tcPr>
-            <w:tcW w:w="3052" w:type="dxa"/>
+            <w:tcW w:w="3054" w:type="dxa"/>
             <w:tcBorders>
               <w:top w:val="single" w:sz="4" w:space="0" w:color="BFBFBF"/>
               <w:left w:val="single" w:sz="4" w:space="0" w:color="BFBFBF"/>
@@ -23137,7 +23888,7 @@
         </w:tc>
         <w:tc>
           <w:tcPr>
-            <w:tcW w:w="1348" w:type="dxa"/>
+            <w:tcW w:w="1347" w:type="dxa"/>
             <w:tcBorders>
               <w:top w:val="single" w:sz="4" w:space="0" w:color="BFBFBF"/>
               <w:left w:val="single" w:sz="4" w:space="0" w:color="BFBFBF"/>
@@ -23161,7 +23912,7 @@
         </w:tc>
         <w:tc>
           <w:tcPr>
-            <w:tcW w:w="900" w:type="dxa"/>
+            <w:tcW w:w="899" w:type="dxa"/>
             <w:tcBorders>
               <w:top w:val="single" w:sz="4" w:space="0" w:color="BFBFBF"/>
               <w:left w:val="single" w:sz="4" w:space="0" w:color="BFBFBF"/>
@@ -23185,7 +23936,7 @@
         </w:tc>
         <w:tc>
           <w:tcPr>
-            <w:tcW w:w="2028" w:type="dxa"/>
+            <w:tcW w:w="2030" w:type="dxa"/>
             <w:tcBorders>
               <w:top w:val="single" w:sz="4" w:space="0" w:color="BFBFBF"/>
               <w:left w:val="single" w:sz="4" w:space="0" w:color="BFBFBF"/>
@@ -23212,7 +23963,7 @@
         <w:trPr/>
         <w:tc>
           <w:tcPr>
-            <w:tcW w:w="1698" w:type="dxa"/>
+            <w:tcW w:w="1696" w:type="dxa"/>
             <w:tcBorders>
               <w:top w:val="single" w:sz="4" w:space="0" w:color="BFBFBF"/>
               <w:left w:val="single" w:sz="4" w:space="0" w:color="BFBFBF"/>
@@ -23233,7 +23984,7 @@
         </w:tc>
         <w:tc>
           <w:tcPr>
-            <w:tcW w:w="3052" w:type="dxa"/>
+            <w:tcW w:w="3054" w:type="dxa"/>
             <w:tcBorders>
               <w:top w:val="single" w:sz="4" w:space="0" w:color="BFBFBF"/>
               <w:left w:val="single" w:sz="4" w:space="0" w:color="BFBFBF"/>
@@ -23254,7 +24005,7 @@
         </w:tc>
         <w:tc>
           <w:tcPr>
-            <w:tcW w:w="1348" w:type="dxa"/>
+            <w:tcW w:w="1347" w:type="dxa"/>
             <w:tcBorders>
               <w:top w:val="single" w:sz="4" w:space="0" w:color="BFBFBF"/>
               <w:left w:val="single" w:sz="4" w:space="0" w:color="BFBFBF"/>
@@ -23275,7 +24026,7 @@
         </w:tc>
         <w:tc>
           <w:tcPr>
-            <w:tcW w:w="900" w:type="dxa"/>
+            <w:tcW w:w="899" w:type="dxa"/>
             <w:tcBorders>
               <w:top w:val="single" w:sz="4" w:space="0" w:color="BFBFBF"/>
               <w:left w:val="single" w:sz="4" w:space="0" w:color="BFBFBF"/>
@@ -23296,7 +24047,7 @@
         </w:tc>
         <w:tc>
           <w:tcPr>
-            <w:tcW w:w="2028" w:type="dxa"/>
+            <w:tcW w:w="2030" w:type="dxa"/>
             <w:tcBorders>
               <w:top w:val="single" w:sz="4" w:space="0" w:color="BFBFBF"/>
               <w:left w:val="single" w:sz="4" w:space="0" w:color="BFBFBF"/>
@@ -23320,7 +24071,7 @@
         <w:trPr/>
         <w:tc>
           <w:tcPr>
-            <w:tcW w:w="1698" w:type="dxa"/>
+            <w:tcW w:w="1696" w:type="dxa"/>
             <w:tcBorders>
               <w:top w:val="single" w:sz="4" w:space="0" w:color="BFBFBF"/>
               <w:left w:val="single" w:sz="4" w:space="0" w:color="BFBFBF"/>
@@ -23341,7 +24092,7 @@
         </w:tc>
         <w:tc>
           <w:tcPr>
-            <w:tcW w:w="3052" w:type="dxa"/>
+            <w:tcW w:w="3054" w:type="dxa"/>
             <w:tcBorders>
               <w:top w:val="single" w:sz="4" w:space="0" w:color="BFBFBF"/>
               <w:left w:val="single" w:sz="4" w:space="0" w:color="BFBFBF"/>
@@ -23362,7 +24113,7 @@
         </w:tc>
         <w:tc>
           <w:tcPr>
-            <w:tcW w:w="1348" w:type="dxa"/>
+            <w:tcW w:w="1347" w:type="dxa"/>
             <w:tcBorders>
               <w:top w:val="single" w:sz="4" w:space="0" w:color="BFBFBF"/>
               <w:left w:val="single" w:sz="4" w:space="0" w:color="BFBFBF"/>
@@ -23383,7 +24134,7 @@
         </w:tc>
         <w:tc>
           <w:tcPr>
-            <w:tcW w:w="900" w:type="dxa"/>
+            <w:tcW w:w="899" w:type="dxa"/>
             <w:tcBorders>
               <w:top w:val="single" w:sz="4" w:space="0" w:color="BFBFBF"/>
               <w:left w:val="single" w:sz="4" w:space="0" w:color="BFBFBF"/>
@@ -23404,7 +24155,7 @@
         </w:tc>
         <w:tc>
           <w:tcPr>
-            <w:tcW w:w="2028" w:type="dxa"/>
+            <w:tcW w:w="2030" w:type="dxa"/>
             <w:tcBorders>
               <w:top w:val="single" w:sz="4" w:space="0" w:color="BFBFBF"/>
               <w:left w:val="single" w:sz="4" w:space="0" w:color="BFBFBF"/>
@@ -23428,7 +24179,7 @@
         <w:trPr/>
         <w:tc>
           <w:tcPr>
-            <w:tcW w:w="1698" w:type="dxa"/>
+            <w:tcW w:w="1696" w:type="dxa"/>
             <w:tcBorders>
               <w:top w:val="single" w:sz="4" w:space="0" w:color="BFBFBF"/>
               <w:left w:val="single" w:sz="4" w:space="0" w:color="BFBFBF"/>
@@ -23449,7 +24200,7 @@
         </w:tc>
         <w:tc>
           <w:tcPr>
-            <w:tcW w:w="3052" w:type="dxa"/>
+            <w:tcW w:w="3054" w:type="dxa"/>
             <w:tcBorders>
               <w:top w:val="single" w:sz="4" w:space="0" w:color="BFBFBF"/>
               <w:left w:val="single" w:sz="4" w:space="0" w:color="BFBFBF"/>
@@ -23470,7 +24221,7 @@
         </w:tc>
         <w:tc>
           <w:tcPr>
-            <w:tcW w:w="1348" w:type="dxa"/>
+            <w:tcW w:w="1347" w:type="dxa"/>
             <w:tcBorders>
               <w:top w:val="single" w:sz="4" w:space="0" w:color="BFBFBF"/>
               <w:left w:val="single" w:sz="4" w:space="0" w:color="BFBFBF"/>
@@ -23491,7 +24242,7 @@
         </w:tc>
         <w:tc>
           <w:tcPr>
-            <w:tcW w:w="900" w:type="dxa"/>
+            <w:tcW w:w="899" w:type="dxa"/>
             <w:tcBorders>
               <w:top w:val="single" w:sz="4" w:space="0" w:color="BFBFBF"/>
               <w:left w:val="single" w:sz="4" w:space="0" w:color="BFBFBF"/>
@@ -23512,7 +24263,7 @@
         </w:tc>
         <w:tc>
           <w:tcPr>
-            <w:tcW w:w="2028" w:type="dxa"/>
+            <w:tcW w:w="2030" w:type="dxa"/>
             <w:tcBorders>
               <w:top w:val="single" w:sz="4" w:space="0" w:color="BFBFBF"/>
               <w:left w:val="single" w:sz="4" w:space="0" w:color="BFBFBF"/>
@@ -23536,7 +24287,7 @@
         <w:trPr/>
         <w:tc>
           <w:tcPr>
-            <w:tcW w:w="1698" w:type="dxa"/>
+            <w:tcW w:w="1696" w:type="dxa"/>
             <w:tcBorders>
               <w:top w:val="single" w:sz="4" w:space="0" w:color="BFBFBF"/>
               <w:left w:val="single" w:sz="4" w:space="0" w:color="BFBFBF"/>
@@ -23557,7 +24308,7 @@
         </w:tc>
         <w:tc>
           <w:tcPr>
-            <w:tcW w:w="3052" w:type="dxa"/>
+            <w:tcW w:w="3054" w:type="dxa"/>
             <w:tcBorders>
               <w:top w:val="single" w:sz="4" w:space="0" w:color="BFBFBF"/>
               <w:left w:val="single" w:sz="4" w:space="0" w:color="BFBFBF"/>
@@ -23578,7 +24329,7 @@
         </w:tc>
         <w:tc>
           <w:tcPr>
-            <w:tcW w:w="1348" w:type="dxa"/>
+            <w:tcW w:w="1347" w:type="dxa"/>
             <w:tcBorders>
               <w:top w:val="single" w:sz="4" w:space="0" w:color="BFBFBF"/>
               <w:left w:val="single" w:sz="4" w:space="0" w:color="BFBFBF"/>
@@ -23599,7 +24350,7 @@
         </w:tc>
         <w:tc>
           <w:tcPr>
-            <w:tcW w:w="900" w:type="dxa"/>
+            <w:tcW w:w="899" w:type="dxa"/>
             <w:tcBorders>
               <w:top w:val="single" w:sz="4" w:space="0" w:color="BFBFBF"/>
               <w:left w:val="single" w:sz="4" w:space="0" w:color="BFBFBF"/>
@@ -23620,7 +24371,7 @@
         </w:tc>
         <w:tc>
           <w:tcPr>
-            <w:tcW w:w="2028" w:type="dxa"/>
+            <w:tcW w:w="2030" w:type="dxa"/>
             <w:tcBorders>
               <w:top w:val="single" w:sz="4" w:space="0" w:color="BFBFBF"/>
               <w:left w:val="single" w:sz="4" w:space="0" w:color="BFBFBF"/>
@@ -23644,7 +24395,7 @@
         <w:trPr/>
         <w:tc>
           <w:tcPr>
-            <w:tcW w:w="1698" w:type="dxa"/>
+            <w:tcW w:w="1696" w:type="dxa"/>
             <w:tcBorders>
               <w:top w:val="single" w:sz="4" w:space="0" w:color="BFBFBF"/>
               <w:left w:val="single" w:sz="4" w:space="0" w:color="BFBFBF"/>
@@ -23665,7 +24416,7 @@
         </w:tc>
         <w:tc>
           <w:tcPr>
-            <w:tcW w:w="3052" w:type="dxa"/>
+            <w:tcW w:w="3054" w:type="dxa"/>
             <w:tcBorders>
               <w:top w:val="single" w:sz="4" w:space="0" w:color="BFBFBF"/>
               <w:left w:val="single" w:sz="4" w:space="0" w:color="BFBFBF"/>
@@ -23686,7 +24437,7 @@
         </w:tc>
         <w:tc>
           <w:tcPr>
-            <w:tcW w:w="1348" w:type="dxa"/>
+            <w:tcW w:w="1347" w:type="dxa"/>
             <w:tcBorders>
               <w:top w:val="single" w:sz="4" w:space="0" w:color="BFBFBF"/>
               <w:left w:val="single" w:sz="4" w:space="0" w:color="BFBFBF"/>
@@ -23707,7 +24458,7 @@
         </w:tc>
         <w:tc>
           <w:tcPr>
-            <w:tcW w:w="900" w:type="dxa"/>
+            <w:tcW w:w="899" w:type="dxa"/>
             <w:tcBorders>
               <w:top w:val="single" w:sz="4" w:space="0" w:color="BFBFBF"/>
               <w:left w:val="single" w:sz="4" w:space="0" w:color="BFBFBF"/>
@@ -23728,7 +24479,7 @@
         </w:tc>
         <w:tc>
           <w:tcPr>
-            <w:tcW w:w="2028" w:type="dxa"/>
+            <w:tcW w:w="2030" w:type="dxa"/>
             <w:tcBorders>
               <w:top w:val="single" w:sz="4" w:space="0" w:color="BFBFBF"/>
               <w:left w:val="single" w:sz="4" w:space="0" w:color="BFBFBF"/>
@@ -24684,7 +25435,7 @@
               <w:rStyle w:val="PageNumber"/>
               <w:lang w:eastAsia="en-US"/>
             </w:rPr>
-            <w:t>10</w:t>
+            <w:t>12</w:t>
           </w:r>
           <w:r>
             <w:rPr>
@@ -24726,7 +25477,7 @@
               <w:rStyle w:val="PageNumber"/>
               <w:lang w:eastAsia="en-US"/>
             </w:rPr>
-            <w:t>10</w:t>
+            <w:t>12</w:t>
           </w:r>
           <w:r>
             <w:rPr>
@@ -24837,7 +25588,7 @@
               <w:rStyle w:val="PageNumber"/>
               <w:lang w:eastAsia="en-US"/>
             </w:rPr>
-            <w:t>10</w:t>
+            <w:t>12</w:t>
           </w:r>
           <w:r>
             <w:rPr>
@@ -24879,7 +25630,7 @@
               <w:rStyle w:val="PageNumber"/>
               <w:lang w:eastAsia="en-US"/>
             </w:rPr>
-            <w:t>10</w:t>
+            <w:t>12</w:t>
           </w:r>
           <w:r>
             <w:rPr>

</xml_diff>

<commit_message>
fix - Arruma formatação dos diagramas no doc de requisitos
</commit_message>
<xml_diff>
--- a/docs/documento_requisitos/Documento de Requisitos - PitScore.docx
+++ b/docs/documento_requisitos/Documento de Requisitos - PitScore.docx
@@ -22,6 +22,15 @@
     </w:p>
     <w:p>
       <w:pPr>
+        <w:pStyle w:val="Normal"/>
+        <w:numPr>
+          <w:ilvl w:val="0"/>
+          <w:numId w:val="0"/>
+        </w:numPr>
+        <w:ind w:hanging="0" w:left="0"/>
+        <w:rPr>
+          <w:rFonts w:ascii="Arial" w:hAnsi="Arial" w:cs="Arial"/>
+        </w:rPr>
         <w:sectPr>
           <w:type w:val="nextPage"/>
           <w:pgSz w:w="11906" w:h="16838"/>
@@ -31,15 +40,6 @@
           <w:textDirection w:val="lrTb"/>
           <w:docGrid w:type="default" w:linePitch="360" w:charSpace="0"/>
         </w:sectPr>
-        <w:pStyle w:val="Normal"/>
-        <w:numPr>
-          <w:ilvl w:val="0"/>
-          <w:numId w:val="0"/>
-        </w:numPr>
-        <w:ind w:hanging="0" w:left="0"/>
-        <w:rPr>
-          <w:rFonts w:ascii="Arial" w:hAnsi="Arial" w:cs="Arial"/>
-        </w:rPr>
       </w:pPr>
       <w:r>
         <w:rPr>
@@ -48,7 +48,7 @@
         <mc:AlternateContent>
           <mc:Choice Requires="wps">
             <w:drawing>
-              <wp:anchor behindDoc="0" distT="0" distB="0" distL="0" distR="0" simplePos="0" locked="0" layoutInCell="0" allowOverlap="1" relativeHeight="8">
+              <wp:anchor distT="0" distB="0" distL="0" distR="0" simplePos="0" relativeHeight="8" behindDoc="0" locked="0" layoutInCell="0" allowOverlap="1">
                 <wp:simplePos x="0" y="0"/>
                 <wp:positionH relativeFrom="margin">
                   <wp:posOffset>19050</wp:posOffset>
@@ -117,7 +117,7 @@
                           </w:p>
                         </w:txbxContent>
                       </wps:txbx>
-                      <wps:bodyPr lIns="720" rIns="720" tIns="720" bIns="720" anchor="t">
+                      <wps:bodyPr lIns="720" tIns="720" rIns="720" bIns="720" anchor="t">
                         <a:noAutofit/>
                       </wps:bodyPr>
                     </wps:wsp>
@@ -128,7 +128,7 @@
           </mc:Choice>
           <mc:Fallback>
             <w:pict>
-              <v:rect id="shape_0" ID="Frame1" path="m0,0l-2147483645,0l-2147483645,-2147483646l0,-2147483646xe" stroked="f" o:allowincell="f" style="position:absolute;margin-left:1.5pt;margin-top:56.7pt;width:451.4pt;height:727.2pt;mso-wrap-style:square;v-text-anchor:top;mso-position-horizontal-relative:margin;mso-position-vertical-relative:margin">
+              <v:rect id="shape_0" stroked="f" o:allowincell="f" style="position:absolute;margin-left:1.5pt;margin-top:56.7pt;width:451.4pt;height:727.2pt;mso-wrap-style:square;v-text-anchor:top;mso-position-horizontal-relative:margin;mso-position-vertical-relative:margin">
                 <v:fill o:detectmouseclick="t" on="false"/>
                 <v:stroke color="#3465a4" joinstyle="round" endcap="flat"/>
                 <v:textbox>
@@ -317,16 +317,17 @@
             </w:rPr>
             <w:fldChar w:fldCharType="separate"/>
           </w:r>
-          <w:hyperlink w:anchor="__RefHeading___Toc16060_4016492415" w:tooltip="Introdução">
-            <w:r>
-              <w:rPr>
-                <w:rStyle w:val="IndexLink"/>
-              </w:rPr>
-              <w:t>Introdução</w:t>
-              <w:tab/>
-              <w:t>1</w:t>
-            </w:r>
-          </w:hyperlink>
+          <w:r>
+            <w:rPr>
+              <w:rStyle w:val="IndexLink"/>
+            </w:rPr>
+            <w:t>Introdução</w:t>
+          </w:r>
+          <w:r>
+            <w:rPr/>
+            <w:tab/>
+            <w:t>1</w:t>
+          </w:r>
         </w:p>
         <w:p>
           <w:pPr>
@@ -337,16 +338,12 @@
             </w:tabs>
             <w:rPr/>
           </w:pPr>
-          <w:hyperlink w:anchor="__RefHeading___Toc125110041" w:tooltip="Visão geral deste documento">
-            <w:r>
-              <w:rPr>
-                <w:rStyle w:val="IndexLink"/>
-              </w:rPr>
-              <w:t>Visão geral deste documento</w:t>
-              <w:tab/>
-              <w:t>1</w:t>
-            </w:r>
-          </w:hyperlink>
+          <w:r>
+            <w:rPr/>
+            <w:t>Visão geral deste documento</w:t>
+            <w:tab/>
+            <w:t>1</w:t>
+          </w:r>
         </w:p>
         <w:p>
           <w:pPr>
@@ -357,16 +354,12 @@
             </w:tabs>
             <w:rPr/>
           </w:pPr>
-          <w:hyperlink w:anchor="__RefHeading___Toc125110042" w:tooltip="Glossário, Siglas e Acrogramas">
-            <w:r>
-              <w:rPr>
-                <w:rStyle w:val="IndexLink"/>
-              </w:rPr>
-              <w:t>Glossário, Siglas e Acrogramas</w:t>
-              <w:tab/>
-              <w:t>1</w:t>
-            </w:r>
-          </w:hyperlink>
+          <w:r>
+            <w:rPr/>
+            <w:t>Glossário, Siglas e Acrogramas</w:t>
+            <w:tab/>
+            <w:t>1</w:t>
+          </w:r>
         </w:p>
         <w:p>
           <w:pPr>
@@ -377,16 +370,12 @@
             </w:tabs>
             <w:rPr/>
           </w:pPr>
-          <w:hyperlink w:anchor="__RefHeading___Toc125110043" w:tooltip="Definições e Atributos de Requisitos">
-            <w:r>
-              <w:rPr>
-                <w:rStyle w:val="IndexLink"/>
-              </w:rPr>
-              <w:t>Definições e Atributos de Requisitos</w:t>
-              <w:tab/>
-              <w:t>1</w:t>
-            </w:r>
-          </w:hyperlink>
+          <w:r>
+            <w:rPr/>
+            <w:t>Definições e Atributos de Requisitos</w:t>
+            <w:tab/>
+            <w:t>1</w:t>
+          </w:r>
         </w:p>
         <w:p>
           <w:pPr>
@@ -398,17 +387,13 @@
             </w:tabs>
             <w:rPr/>
           </w:pPr>
-          <w:hyperlink w:anchor="__RefHeading___Toc125110044" w:tooltip="Identificação dos Requisitos">
-            <w:r>
-              <w:rPr>
-                <w:rStyle w:val="IndexLink"/>
-              </w:rPr>
-              <w:tab/>
-              <w:t>Identificação dos Requisitos</w:t>
-              <w:tab/>
-              <w:t>1</w:t>
-            </w:r>
-          </w:hyperlink>
+          <w:r>
+            <w:rPr/>
+            <w:tab/>
+            <w:t>Identificação dos Requisitos</w:t>
+            <w:tab/>
+            <w:t>1</w:t>
+          </w:r>
         </w:p>
         <w:p>
           <w:pPr>
@@ -420,17 +405,13 @@
             </w:tabs>
             <w:rPr/>
           </w:pPr>
-          <w:hyperlink w:anchor="__RefHeading___Toc125110045" w:tooltip="Prioridades dos Requisitos">
-            <w:r>
-              <w:rPr>
-                <w:rStyle w:val="IndexLink"/>
-              </w:rPr>
-              <w:tab/>
-              <w:t>Prioridades dos Requisitos</w:t>
-              <w:tab/>
-              <w:t>1</w:t>
-            </w:r>
-          </w:hyperlink>
+          <w:r>
+            <w:rPr/>
+            <w:tab/>
+            <w:t>Prioridades dos Requisitos</w:t>
+            <w:tab/>
+            <w:t>1</w:t>
+          </w:r>
         </w:p>
         <w:p>
           <w:pPr>
@@ -441,16 +422,12 @@
             </w:tabs>
             <w:rPr/>
           </w:pPr>
-          <w:hyperlink w:anchor="__RefHeading___Toc16062_4016492415" w:tooltip="Descrição geral do sistema">
-            <w:r>
-              <w:rPr>
-                <w:rStyle w:val="IndexLink"/>
-              </w:rPr>
-              <w:t>Descrição geral do sistema</w:t>
-              <w:tab/>
-              <w:t>1</w:t>
-            </w:r>
-          </w:hyperlink>
+          <w:r>
+            <w:rPr/>
+            <w:t>Descrição geral do sistema</w:t>
+            <w:tab/>
+            <w:t>1</w:t>
+          </w:r>
         </w:p>
         <w:p>
           <w:pPr>
@@ -461,16 +438,12 @@
             </w:tabs>
             <w:rPr/>
           </w:pPr>
-          <w:hyperlink w:anchor="__RefHeading___Toc125110047" w:tooltip="Abrangência e sistemas relacionados">
-            <w:r>
-              <w:rPr>
-                <w:rStyle w:val="IndexLink"/>
-              </w:rPr>
-              <w:t>Abrangência e sistemas relacionados</w:t>
-              <w:tab/>
-              <w:t>1</w:t>
-            </w:r>
-          </w:hyperlink>
+          <w:r>
+            <w:rPr/>
+            <w:t>Abrangência e sistemas relacionados</w:t>
+            <w:tab/>
+            <w:t>1</w:t>
+          </w:r>
         </w:p>
         <w:p>
           <w:pPr>
@@ -481,16 +454,12 @@
             </w:tabs>
             <w:rPr/>
           </w:pPr>
-          <w:hyperlink w:anchor="__RefHeading___Toc125110048" w:tooltip="Relação de usuários do sistema">
-            <w:r>
-              <w:rPr>
-                <w:rStyle w:val="IndexLink"/>
-              </w:rPr>
-              <w:t>Relação de usuários do sistema</w:t>
-              <w:tab/>
-              <w:t>2</w:t>
-            </w:r>
-          </w:hyperlink>
+          <w:r>
+            <w:rPr/>
+            <w:t>Relação de usuários do sistema</w:t>
+            <w:tab/>
+            <w:t>2</w:t>
+          </w:r>
         </w:p>
         <w:p>
           <w:pPr>
@@ -501,16 +470,12 @@
             </w:tabs>
             <w:rPr/>
           </w:pPr>
-          <w:hyperlink w:anchor="__RefHeading___Toc125110049" w:tooltip="Diagrama de Caso de Uso – Visáo do Usuário">
-            <w:r>
-              <w:rPr>
-                <w:rStyle w:val="IndexLink"/>
-              </w:rPr>
-              <w:t>Diagrama de Caso de Uso – Visáo do Usuário</w:t>
-              <w:tab/>
-              <w:t>3</w:t>
-            </w:r>
-          </w:hyperlink>
+          <w:r>
+            <w:rPr/>
+            <w:t>Diagrama de Caso de Uso – Visáo do Usuário</w:t>
+            <w:tab/>
+            <w:t>3</w:t>
+          </w:r>
         </w:p>
         <w:p>
           <w:pPr>
@@ -522,17 +487,13 @@
             </w:tabs>
             <w:rPr/>
           </w:pPr>
-          <w:hyperlink w:anchor="__RefHeading___Toc125110050" w:tooltip="Visão do Usuário">
-            <w:r>
-              <w:rPr>
-                <w:rStyle w:val="IndexLink"/>
-              </w:rPr>
-              <w:tab/>
-              <w:t>Visão do Usuário</w:t>
-              <w:tab/>
-              <w:t>3</w:t>
-            </w:r>
-          </w:hyperlink>
+          <w:r>
+            <w:rPr/>
+            <w:tab/>
+            <w:t>Visão do Usuário</w:t>
+            <w:tab/>
+            <w:t>3</w:t>
+          </w:r>
         </w:p>
         <w:p>
           <w:pPr>
@@ -564,16 +525,12 @@
             </w:tabs>
             <w:rPr/>
           </w:pPr>
-          <w:hyperlink w:anchor="__RefHeading___Toc16064_4016492415" w:tooltip="Requisitos funcionais (casos de uso)">
-            <w:r>
-              <w:rPr>
-                <w:rStyle w:val="IndexLink"/>
-              </w:rPr>
-              <w:t>Requisitos funcionais (casos de uso)</w:t>
-              <w:tab/>
-              <w:t>1</w:t>
-            </w:r>
-          </w:hyperlink>
+          <w:r>
+            <w:rPr/>
+            <w:t>Requisitos funcionais (casos de uso)</w:t>
+            <w:tab/>
+            <w:t>1</w:t>
+          </w:r>
         </w:p>
         <w:p>
           <w:pPr>
@@ -584,16 +541,12 @@
             </w:tabs>
             <w:rPr/>
           </w:pPr>
-          <w:hyperlink w:anchor="__RefHeading___Toc16066_4016492415" w:tooltip="Entidade Usuário (Acesso)">
-            <w:r>
-              <w:rPr>
-                <w:rStyle w:val="IndexLink"/>
-              </w:rPr>
-              <w:t>Entidade Usuário (Acesso)</w:t>
-              <w:tab/>
-              <w:t>1</w:t>
-            </w:r>
-          </w:hyperlink>
+          <w:r>
+            <w:rPr/>
+            <w:t>Entidade Usuário (Acesso)</w:t>
+            <w:tab/>
+            <w:t>1</w:t>
+          </w:r>
         </w:p>
         <w:p>
           <w:pPr>
@@ -604,16 +557,12 @@
             </w:tabs>
             <w:rPr/>
           </w:pPr>
-          <w:hyperlink w:anchor="__RefHeading___Toc16068_4016492415" w:tooltip="Entidade Estádio (CRUD Simples)">
-            <w:r>
-              <w:rPr>
-                <w:rStyle w:val="IndexLink"/>
-              </w:rPr>
-              <w:t>Entidade Estádio (CRUD Simples)</w:t>
-              <w:tab/>
-              <w:t>2</w:t>
-            </w:r>
-          </w:hyperlink>
+          <w:r>
+            <w:rPr/>
+            <w:t>Entidade Estádio (CRUD Simples)</w:t>
+            <w:tab/>
+            <w:t>2</w:t>
+          </w:r>
         </w:p>
         <w:p>
           <w:pPr>
@@ -624,16 +573,12 @@
             </w:tabs>
             <w:rPr/>
           </w:pPr>
-          <w:hyperlink w:anchor="__RefHeading___Toc16070_4016492415" w:tooltip="Entidade Jogador">
-            <w:r>
-              <w:rPr>
-                <w:rStyle w:val="IndexLink"/>
-              </w:rPr>
-              <w:t>Entidade Jogador</w:t>
-              <w:tab/>
-              <w:t>4</w:t>
-            </w:r>
-          </w:hyperlink>
+          <w:r>
+            <w:rPr/>
+            <w:t>Entidade Jogador</w:t>
+            <w:tab/>
+            <w:t>4</w:t>
+          </w:r>
         </w:p>
         <w:p>
           <w:pPr>
@@ -644,16 +589,12 @@
             </w:tabs>
             <w:rPr/>
           </w:pPr>
-          <w:hyperlink w:anchor="__RefHeading___Toc16072_4016492415" w:tooltip="Entidade Partida (CRUD Complexo)">
-            <w:r>
-              <w:rPr>
-                <w:rStyle w:val="IndexLink"/>
-              </w:rPr>
-              <w:t>Entidade Partida (CRUD Complexo)</w:t>
-              <w:tab/>
-              <w:t>5</w:t>
-            </w:r>
-          </w:hyperlink>
+          <w:r>
+            <w:rPr/>
+            <w:t>Entidade Partida (CRUD Complexo)</w:t>
+            <w:tab/>
+            <w:t>5</w:t>
+          </w:r>
         </w:p>
         <w:p>
           <w:pPr>
@@ -664,16 +605,12 @@
             </w:tabs>
             <w:rPr/>
           </w:pPr>
-          <w:hyperlink w:anchor="__RefHeading___Toc16074_4016492415" w:tooltip="Acompanhamento da Copa">
-            <w:r>
-              <w:rPr>
-                <w:rStyle w:val="IndexLink"/>
-              </w:rPr>
-              <w:t>Acompanhamento da Copa</w:t>
-              <w:tab/>
-              <w:t>7</w:t>
-            </w:r>
-          </w:hyperlink>
+          <w:r>
+            <w:rPr/>
+            <w:t>Acompanhamento da Copa</w:t>
+            <w:tab/>
+            <w:t>7</w:t>
+          </w:r>
         </w:p>
         <w:p>
           <w:pPr>
@@ -684,16 +621,12 @@
             </w:tabs>
             <w:rPr/>
           </w:pPr>
-          <w:hyperlink w:anchor="__RefHeading___Toc16076_4016492415" w:tooltip="Dados da Partida">
-            <w:r>
-              <w:rPr>
-                <w:rStyle w:val="IndexLink"/>
-              </w:rPr>
-              <w:t>Dados da Partida</w:t>
-              <w:tab/>
-              <w:t>8</w:t>
-            </w:r>
-          </w:hyperlink>
+          <w:r>
+            <w:rPr/>
+            <w:t>Dados da Partida</w:t>
+            <w:tab/>
+            <w:t>8</w:t>
+          </w:r>
         </w:p>
         <w:p>
           <w:pPr>
@@ -704,16 +637,12 @@
             </w:tabs>
             <w:rPr/>
           </w:pPr>
-          <w:hyperlink w:anchor="__RefHeading___Toc16078_4016492415" w:tooltip="Simulador">
-            <w:r>
-              <w:rPr>
-                <w:rStyle w:val="IndexLink"/>
-              </w:rPr>
-              <w:t>Simulador</w:t>
-              <w:tab/>
-              <w:t>9</w:t>
-            </w:r>
-          </w:hyperlink>
+          <w:r>
+            <w:rPr/>
+            <w:t>Simulador</w:t>
+            <w:tab/>
+            <w:t>9</w:t>
+          </w:r>
         </w:p>
         <w:p>
           <w:pPr>
@@ -724,16 +653,12 @@
             </w:tabs>
             <w:rPr/>
           </w:pPr>
-          <w:hyperlink w:anchor="__RefHeading___Toc16080_4016492415" w:tooltip="Requisitos não funcionais">
-            <w:r>
-              <w:rPr>
-                <w:rStyle w:val="IndexLink"/>
-              </w:rPr>
-              <w:t>Requisitos não funcionais</w:t>
-              <w:tab/>
-              <w:t>11</w:t>
-            </w:r>
-          </w:hyperlink>
+          <w:r>
+            <w:rPr/>
+            <w:t>Requisitos não funcionais</w:t>
+            <w:tab/>
+            <w:t>11</w:t>
+          </w:r>
         </w:p>
         <w:p>
           <w:pPr>
@@ -744,16 +669,12 @@
             </w:tabs>
             <w:rPr/>
           </w:pPr>
-          <w:hyperlink w:anchor="__RefHeading___Toc16082_4016492415" w:tooltip="Usabilidade">
-            <w:r>
-              <w:rPr>
-                <w:rStyle w:val="IndexLink"/>
-              </w:rPr>
-              <w:t>Usabilidade</w:t>
-              <w:tab/>
-              <w:t>11</w:t>
-            </w:r>
-          </w:hyperlink>
+          <w:r>
+            <w:rPr/>
+            <w:t>Usabilidade</w:t>
+            <w:tab/>
+            <w:t>11</w:t>
+          </w:r>
         </w:p>
         <w:p>
           <w:pPr>
@@ -764,16 +685,12 @@
             </w:tabs>
             <w:rPr/>
           </w:pPr>
-          <w:hyperlink w:anchor="__RefHeading___Toc16084_4016492415" w:tooltip="Confiabilidade">
-            <w:r>
-              <w:rPr>
-                <w:rStyle w:val="IndexLink"/>
-              </w:rPr>
-              <w:t>Confiabilidade</w:t>
-              <w:tab/>
-              <w:t>11</w:t>
-            </w:r>
-          </w:hyperlink>
+          <w:r>
+            <w:rPr/>
+            <w:t>Confiabilidade</w:t>
+            <w:tab/>
+            <w:t>11</w:t>
+          </w:r>
         </w:p>
         <w:p>
           <w:pPr>
@@ -784,16 +701,12 @@
             </w:tabs>
             <w:rPr/>
           </w:pPr>
-          <w:hyperlink w:anchor="__RefHeading___Toc16086_4016492415" w:tooltip="Desempenho">
-            <w:r>
-              <w:rPr>
-                <w:rStyle w:val="IndexLink"/>
-              </w:rPr>
-              <w:t>Desempenho</w:t>
-              <w:tab/>
-              <w:t>11</w:t>
-            </w:r>
-          </w:hyperlink>
+          <w:r>
+            <w:rPr/>
+            <w:t>Desempenho</w:t>
+            <w:tab/>
+            <w:t>11</w:t>
+          </w:r>
         </w:p>
         <w:p>
           <w:pPr>
@@ -804,16 +717,12 @@
             </w:tabs>
             <w:rPr/>
           </w:pPr>
-          <w:hyperlink w:anchor="__RefHeading___Toc16088_4016492415" w:tooltip="Segurança">
-            <w:r>
-              <w:rPr>
-                <w:rStyle w:val="IndexLink"/>
-              </w:rPr>
-              <w:t>Segurança</w:t>
-              <w:tab/>
-              <w:t>12</w:t>
-            </w:r>
-          </w:hyperlink>
+          <w:r>
+            <w:rPr/>
+            <w:t>Segurança</w:t>
+            <w:tab/>
+            <w:t>12</w:t>
+          </w:r>
         </w:p>
         <w:p>
           <w:pPr>
@@ -824,16 +733,12 @@
             </w:tabs>
             <w:rPr/>
           </w:pPr>
-          <w:hyperlink w:anchor="__RefHeading___Toc16090_4016492415" w:tooltip="Hardware e software">
-            <w:r>
-              <w:rPr>
-                <w:rStyle w:val="IndexLink"/>
-              </w:rPr>
-              <w:t>Hardware e software</w:t>
-              <w:tab/>
-              <w:t>12</w:t>
-            </w:r>
-          </w:hyperlink>
+          <w:r>
+            <w:rPr/>
+            <w:t>Hardware e software</w:t>
+            <w:tab/>
+            <w:t>12</w:t>
+          </w:r>
         </w:p>
         <w:p>
           <w:pPr>
@@ -844,16 +749,12 @@
             </w:tabs>
             <w:rPr/>
           </w:pPr>
-          <w:hyperlink w:anchor="__RefHeading___Toc21100_4016492415" w:tooltip="Descrição da interface com o usuário">
-            <w:r>
-              <w:rPr>
-                <w:rStyle w:val="IndexLink"/>
-              </w:rPr>
-              <w:t>Descrição da interface com o usuário</w:t>
-              <w:tab/>
-              <w:t>1</w:t>
-            </w:r>
-          </w:hyperlink>
+          <w:r>
+            <w:rPr/>
+            <w:t>Descrição da interface com o usuário</w:t>
+            <w:tab/>
+            <w:t>1</w:t>
+          </w:r>
         </w:p>
         <w:p>
           <w:pPr>
@@ -864,16 +765,12 @@
             </w:tabs>
             <w:rPr/>
           </w:pPr>
-          <w:hyperlink w:anchor="__RefHeading___Toc125110070" w:tooltip="PROTOTIPAÇÃO">
-            <w:r>
-              <w:rPr>
-                <w:rStyle w:val="IndexLink"/>
-              </w:rPr>
-              <w:t>PROTOTIPAÇÃO</w:t>
-              <w:tab/>
-              <w:t>1</w:t>
-            </w:r>
-          </w:hyperlink>
+          <w:r>
+            <w:rPr/>
+            <w:t>PROTOTIPAÇÃO</w:t>
+            <w:tab/>
+            <w:t>1</w:t>
+          </w:r>
         </w:p>
         <w:p>
           <w:pPr>
@@ -882,22 +779,17 @@
               <w:tab w:val="clear" w:pos="9029"/>
               <w:tab w:val="right" w:pos="8503" w:leader="dot"/>
             </w:tabs>
+            <w:spacing w:before="360" w:after="0"/>
             <w:rPr/>
           </w:pPr>
-          <w:hyperlink w:anchor="__RefHeading___Toc21102_4016492415" w:tooltip="Dicionário de Dados">
-            <w:r>
-              <w:rPr>
-                <w:rStyle w:val="IndexLink"/>
-              </w:rPr>
-              <w:t>Dicionário de Dados</w:t>
-              <w:tab/>
-              <w:t>2</w:t>
-            </w:r>
-          </w:hyperlink>
           <w:r>
-            <w:rPr>
-              <w:rStyle w:val="IndexLink"/>
-            </w:rPr>
+            <w:rPr/>
+            <w:t>Dicionário de Dados</w:t>
+            <w:tab/>
+            <w:t>2</w:t>
+          </w:r>
+          <w:r>
+            <w:rPr/>
             <w:fldChar w:fldCharType="end"/>
           </w:r>
         </w:p>
@@ -1260,7 +1152,6 @@
         <w:rPr>
           <w:b/>
           <w:i/>
-          <w:i/>
           <w:sz w:val="22"/>
           <w:szCs w:val="22"/>
         </w:rPr>
@@ -1287,7 +1178,6 @@
         <w:pStyle w:val="TextoNormal"/>
         <w:rPr>
           <w:b/>
-          <w:i/>
           <w:i/>
           <w:sz w:val="22"/>
           <w:szCs w:val="22"/>
@@ -1415,6 +1305,17 @@
     </w:p>
     <w:p>
       <w:pPr>
+        <w:pStyle w:val="Commarcadores"/>
+        <w:numPr>
+          <w:ilvl w:val="0"/>
+          <w:numId w:val="2"/>
+        </w:numPr>
+        <w:tabs>
+          <w:tab w:val="clear" w:pos="567"/>
+          <w:tab w:val="left" w:pos="360" w:leader="none"/>
+        </w:tabs>
+        <w:ind w:hanging="360" w:left="360" w:right="0"/>
+        <w:rPr/>
         <w:sectPr>
           <w:headerReference w:type="even" r:id="rId8"/>
           <w:headerReference w:type="default" r:id="rId9"/>
@@ -1430,17 +1331,6 @@
           <w:textDirection w:val="lrTb"/>
           <w:docGrid w:type="default" w:linePitch="360" w:charSpace="0"/>
         </w:sectPr>
-        <w:pStyle w:val="Commarcadores"/>
-        <w:numPr>
-          <w:ilvl w:val="0"/>
-          <w:numId w:val="2"/>
-        </w:numPr>
-        <w:tabs>
-          <w:tab w:val="clear" w:pos="567"/>
-          <w:tab w:val="left" w:pos="360" w:leader="none"/>
-        </w:tabs>
-        <w:ind w:hanging="360" w:left="360" w:right="0"/>
-        <w:rPr/>
       </w:pPr>
       <w:r>
         <w:rPr/>
@@ -1468,7 +1358,7 @@
         <mc:AlternateContent>
           <mc:Choice Requires="wps">
             <w:drawing>
-              <wp:anchor behindDoc="0" distT="0" distB="0" distL="109855" distR="114300" simplePos="0" locked="0" layoutInCell="0" allowOverlap="1" relativeHeight="2">
+              <wp:anchor distT="0" distB="0" distL="109220" distR="114300" simplePos="0" relativeHeight="2" behindDoc="0" locked="0" layoutInCell="0" allowOverlap="1">
                 <wp:simplePos x="0" y="0"/>
                 <wp:positionH relativeFrom="page">
                   <wp:posOffset>6309995</wp:posOffset>
@@ -1518,7 +1408,7 @@
                                 <w:color w:val="000000"/>
                               </w:rPr>
                               <w:object>
-                                <v:shapetype id="_x0000_tole_rId14" coordsize="21600,21600" o:spt="ole_rId14" o:preferrelative="t" path="m@4@5l@4@11@9@11@9@5xe" filled="f" stroked="f">
+                                <v:shapetype id="_x0000_tole_rId14" coordsize="21600,21600" o:spt="14" o:preferrelative="t" path="m@4@5l@4@11@9@11@9@5xe" filled="f" stroked="f">
                                   <v:stroke joinstyle="miter"/>
                                   <v:formulas>
                                     <v:f eqn="if lineDrawn pixelLineWidth 0"/>
@@ -1540,13 +1430,13 @@
                                 <v:shape id="ole_rId14" type="_x0000_tole_rId14" style="width:29.05pt;height:37pt;mso-wrap-distance-right:0pt;mso-wrap-distance-bottom:24pt" filled="f" o:ole="">
                                   <v:imagedata r:id="rId15" o:title=""/>
                                 </v:shape>
-                                <o:OLEObject Type="Embed" ProgID="" ShapeID="ole_rId14" DrawAspect="Content" ObjectID="_1226069245" r:id="rId14"/>
+                                <o:OLEObject Type="Embed" ProgID="" ShapeID="ole_rId14" DrawAspect="Content" ObjectID="_251519912" r:id="rId14"/>
                               </w:object>
                             </w:r>
                           </w:p>
                         </w:txbxContent>
                       </wps:txbx>
-                      <wps:bodyPr lIns="0" rIns="0" tIns="0" bIns="0" anchor="t">
+                      <wps:bodyPr lIns="0" tIns="0" rIns="0" bIns="0" anchor="t">
                         <a:noAutofit/>
                       </wps:bodyPr>
                     </wps:wsp>
@@ -1557,7 +1447,7 @@
           </mc:Choice>
           <mc:Fallback>
             <w:pict>
-              <v:rect id="shape_0" ID="Frame2" path="m0,0l-2147483645,0l-2147483645,-2147483646l0,-2147483646xe" stroked="f" o:allowincell="f" style="position:absolute;margin-left:496.85pt;margin-top:0.05pt;width:29pt;height:36.95pt;mso-wrap-style:none;v-text-anchor:middle;mso-position-horizontal-relative:page">
+              <v:rect id="shape_0" stroked="f" o:allowincell="f" style="position:absolute;margin-left:496.85pt;margin-top:0.05pt;width:29pt;height:36.95pt;mso-wrap-style:none;v-text-anchor:middle;mso-position-horizontal-relative:page">
                 <v:fill o:detectmouseclick="t" on="false"/>
                 <v:stroke color="#3465a4" joinstyle="round" endcap="flat"/>
                 <v:textbox>
@@ -1575,7 +1465,7 @@
                           <w:color w:val="000000"/>
                         </w:rPr>
                         <w:object>
-                          <v:shapetype id="_x0000_tole_rId16" coordsize="21600,21600" o:spt="ole_rId16" o:preferrelative="t" path="m@4@5l@4@11@9@11@9@5xe" filled="f" stroked="f">
+                          <v:shapetype id="_x0000_tole_rId16" coordsize="21600,21600" o:spt="16" o:preferrelative="t" path="m@4@5l@4@11@9@11@9@5xe" filled="f" stroked="f">
                             <v:stroke joinstyle="miter"/>
                             <v:formulas>
                               <v:f eqn="if lineDrawn pixelLineWidth 0"/>
@@ -1597,7 +1487,7 @@
                           <v:shape id="ole_rId16" type="_x0000_tole_rId16" style="width:29.05pt;height:37pt;mso-wrap-distance-right:0pt;mso-wrap-distance-bottom:24pt" filled="f" o:ole="">
                             <v:imagedata r:id="rId17" o:title=""/>
                           </v:shape>
-                          <o:OLEObject Type="Embed" ProgID="" ShapeID="ole_rId16" DrawAspect="Content" ObjectID="_1456951055" r:id="rId16"/>
+                          <o:OLEObject Type="Embed" ProgID="" ShapeID="ole_rId16" DrawAspect="Content" ObjectID="_383075524" r:id="rId16"/>
                         </w:object>
                       </w:r>
                     </w:p>
@@ -2538,7 +2428,7 @@
       <w:r>
         <w:rPr/>
         <w:drawing>
-          <wp:anchor behindDoc="0" distT="0" distB="0" distL="0" distR="0" simplePos="0" locked="0" layoutInCell="0" allowOverlap="1" relativeHeight="13">
+          <wp:anchor distT="0" distB="0" distL="0" distR="0" simplePos="0" relativeHeight="13" behindDoc="0" locked="0" layoutInCell="0" allowOverlap="1">
             <wp:simplePos x="0" y="0"/>
             <wp:positionH relativeFrom="column">
               <wp:align>center</wp:align>
@@ -2563,13 +2453,7 @@
                     </pic:cNvPicPr>
                   </pic:nvPicPr>
                   <pic:blipFill>
-                    <a:blip r:embed="rId18">
-                      <a:extLst>
-                        <a:ext uri="{96DAC541-7B7A-43D3-8B79-37D633B846F1}">
-                          <asvg:svgBlip xmlns:asvg="http://schemas.microsoft.com/office/drawing/2016/SVG/main" r:embed="rId19"/>
-                        </a:ext>
-                      </a:extLst>
-                    </a:blip>
+                    <a:blip r:embed="rId18"/>
                     <a:stretch>
                       <a:fillRect/>
                     </a:stretch>
@@ -2764,13 +2648,21 @@
     </w:p>
     <w:p>
       <w:pPr>
+        <w:pStyle w:val="TextoNormal"/>
+        <w:ind w:hanging="0" w:left="0" w:right="0"/>
+        <w:rPr>
+          <w:b/>
+          <w:bCs/>
+          <w:sz w:val="24"/>
+          <w:szCs w:val="24"/>
+        </w:rPr>
         <w:sectPr>
-          <w:headerReference w:type="even" r:id="rId22"/>
-          <w:headerReference w:type="default" r:id="rId23"/>
-          <w:headerReference w:type="first" r:id="rId24"/>
-          <w:footerReference w:type="even" r:id="rId25"/>
-          <w:footerReference w:type="default" r:id="rId26"/>
-          <w:footerReference w:type="first" r:id="rId27"/>
+          <w:headerReference w:type="even" r:id="rId20"/>
+          <w:headerReference w:type="default" r:id="rId21"/>
+          <w:headerReference w:type="first" r:id="rId22"/>
+          <w:footerReference w:type="even" r:id="rId23"/>
+          <w:footerReference w:type="default" r:id="rId24"/>
+          <w:footerReference w:type="first" r:id="rId25"/>
           <w:type w:val="nextPage"/>
           <w:pgSz w:w="11906" w:h="16838"/>
           <w:pgMar w:left="1440" w:right="1440" w:gutter="0" w:header="720" w:top="1440" w:footer="720" w:bottom="1440"/>
@@ -2779,26 +2671,18 @@
           <w:textDirection w:val="lrTb"/>
           <w:docGrid w:type="default" w:linePitch="360" w:charSpace="0"/>
         </w:sectPr>
-        <w:pStyle w:val="TextoNormal"/>
-        <w:ind w:hanging="0" w:left="0" w:right="0"/>
-        <w:rPr>
-          <w:b/>
-          <w:bCs/>
-          <w:sz w:val="24"/>
-          <w:szCs w:val="24"/>
-        </w:rPr>
       </w:pPr>
       <w:r>
         <w:drawing>
-          <wp:anchor behindDoc="0" distT="0" distB="0" distL="0" distR="0" simplePos="0" locked="0" layoutInCell="0" allowOverlap="1" relativeHeight="14">
+          <wp:anchor distT="0" distB="0" distL="0" distR="0" simplePos="0" relativeHeight="14" behindDoc="0" locked="0" layoutInCell="0" allowOverlap="1">
             <wp:simplePos x="0" y="0"/>
             <wp:positionH relativeFrom="column">
-              <wp:posOffset>519430</wp:posOffset>
+              <wp:posOffset>8890</wp:posOffset>
             </wp:positionH>
             <wp:positionV relativeFrom="paragraph">
               <wp:posOffset>315595</wp:posOffset>
             </wp:positionV>
-            <wp:extent cx="5688330" cy="6543675"/>
+            <wp:extent cx="6486525" cy="7461885"/>
             <wp:effectExtent l="0" t="0" r="0" b="0"/>
             <wp:wrapSquare wrapText="right"/>
             <wp:docPr id="4" name="Image2"/>
@@ -2815,13 +2699,7 @@
                     </pic:cNvPicPr>
                   </pic:nvPicPr>
                   <pic:blipFill>
-                    <a:blip r:embed="rId20">
-                      <a:extLst>
-                        <a:ext uri="{96DAC541-7B7A-43D3-8B79-37D633B846F1}">
-                          <asvg:svgBlip xmlns:asvg="http://schemas.microsoft.com/office/drawing/2016/SVG/main" r:embed="rId21"/>
-                        </a:ext>
-                      </a:extLst>
-                    </a:blip>
+                    <a:blip r:embed="rId19"/>
                     <a:stretch>
                       <a:fillRect/>
                     </a:stretch>
@@ -2829,7 +2707,7 @@
                   <pic:spPr bwMode="auto">
                     <a:xfrm>
                       <a:off x="0" y="0"/>
-                      <a:ext cx="5688330" cy="6543675"/>
+                      <a:ext cx="6486525" cy="7461885"/>
                     </a:xfrm>
                     <a:prstGeom prst="rect">
                       <a:avLst/>
@@ -2875,7 +2753,7 @@
         <mc:AlternateContent>
           <mc:Choice Requires="wps">
             <w:drawing>
-              <wp:anchor behindDoc="0" distT="0" distB="0" distL="109855" distR="114300" simplePos="0" locked="0" layoutInCell="0" allowOverlap="1" relativeHeight="4">
+              <wp:anchor distT="0" distB="0" distL="109220" distR="114300" simplePos="0" relativeHeight="4" behindDoc="0" locked="0" layoutInCell="0" allowOverlap="1">
                 <wp:simplePos x="0" y="0"/>
                 <wp:positionH relativeFrom="page">
                   <wp:posOffset>6309995</wp:posOffset>
@@ -2925,7 +2803,7 @@
                                 <w:color w:val="000000"/>
                               </w:rPr>
                               <w:object>
-                                <v:shapetype id="_x0000_tole_rId28" coordsize="21600,21600" o:spt="ole_rId28" o:preferrelative="t" path="m@4@5l@4@11@9@11@9@5xe" filled="f" stroked="f">
+                                <v:shapetype id="_x0000_tole_rId26" coordsize="21600,21600" o:spt="26" o:preferrelative="t" path="m@4@5l@4@11@9@11@9@5xe" filled="f" stroked="f">
                                   <v:stroke joinstyle="miter"/>
                                   <v:formulas>
                                     <v:f eqn="if lineDrawn pixelLineWidth 0"/>
@@ -2944,16 +2822,16 @@
                                   <v:path o:extrusionok="f" gradientshapeok="t" o:connecttype="rect"/>
                                   <o:lock v:ext="edit" aspectratio="t"/>
                                 </v:shapetype>
-                                <v:shape id="ole_rId28" type="_x0000_tole_rId28" style="width:29.05pt;height:37pt;mso-wrap-distance-right:0pt;mso-wrap-distance-bottom:24pt" filled="f" o:ole="">
-                                  <v:imagedata r:id="rId29" o:title=""/>
+                                <v:shape id="ole_rId26" type="_x0000_tole_rId26" style="width:29.05pt;height:37pt;mso-wrap-distance-right:0pt;mso-wrap-distance-bottom:24pt" filled="f" o:ole="">
+                                  <v:imagedata r:id="rId27" o:title=""/>
                                 </v:shape>
-                                <o:OLEObject Type="Embed" ProgID="" ShapeID="ole_rId28" DrawAspect="Content" ObjectID="_41368092" r:id="rId28"/>
+                                <o:OLEObject Type="Embed" ProgID="" ShapeID="ole_rId26" DrawAspect="Content" ObjectID="_2137100697" r:id="rId26"/>
                               </w:object>
                             </w:r>
                           </w:p>
                         </w:txbxContent>
                       </wps:txbx>
-                      <wps:bodyPr lIns="0" rIns="0" tIns="0" bIns="0" anchor="t">
+                      <wps:bodyPr lIns="0" tIns="0" rIns="0" bIns="0" anchor="t">
                         <a:noAutofit/>
                       </wps:bodyPr>
                     </wps:wsp>
@@ -2964,7 +2842,7 @@
           </mc:Choice>
           <mc:Fallback>
             <w:pict>
-              <v:rect id="shape_0" ID="Frame3" path="m0,0l-2147483645,0l-2147483645,-2147483646l0,-2147483646xe" stroked="f" o:allowincell="f" style="position:absolute;margin-left:496.85pt;margin-top:0.05pt;width:29pt;height:36.95pt;mso-wrap-style:none;v-text-anchor:middle;mso-position-horizontal-relative:page">
+              <v:rect id="shape_0" stroked="f" o:allowincell="f" style="position:absolute;margin-left:496.85pt;margin-top:0.05pt;width:29pt;height:36.95pt;mso-wrap-style:none;v-text-anchor:middle;mso-position-horizontal-relative:page">
                 <v:fill o:detectmouseclick="t" on="false"/>
                 <v:stroke color="#3465a4" joinstyle="round" endcap="flat"/>
                 <v:textbox>
@@ -2982,7 +2860,7 @@
                           <w:color w:val="000000"/>
                         </w:rPr>
                         <w:object>
-                          <v:shapetype id="_x0000_tole_rId30" coordsize="21600,21600" o:spt="ole_rId30" o:preferrelative="t" path="m@4@5l@4@11@9@11@9@5xe" filled="f" stroked="f">
+                          <v:shapetype id="_x0000_tole_rId28" coordsize="21600,21600" o:spt="28" o:preferrelative="t" path="m@4@5l@4@11@9@11@9@5xe" filled="f" stroked="f">
                             <v:stroke joinstyle="miter"/>
                             <v:formulas>
                               <v:f eqn="if lineDrawn pixelLineWidth 0"/>
@@ -3001,10 +2879,10 @@
                             <v:path o:extrusionok="f" gradientshapeok="t" o:connecttype="rect"/>
                             <o:lock v:ext="edit" aspectratio="t"/>
                           </v:shapetype>
-                          <v:shape id="ole_rId30" type="_x0000_tole_rId30" style="width:29.05pt;height:37pt;mso-wrap-distance-right:0pt;mso-wrap-distance-bottom:24pt" filled="f" o:ole="">
-                            <v:imagedata r:id="rId31" o:title=""/>
+                          <v:shape id="ole_rId28" type="_x0000_tole_rId28" style="width:29.05pt;height:37pt;mso-wrap-distance-right:0pt;mso-wrap-distance-bottom:24pt" filled="f" o:ole="">
+                            <v:imagedata r:id="rId29" o:title=""/>
                           </v:shape>
-                          <o:OLEObject Type="Embed" ProgID="" ShapeID="ole_rId30" DrawAspect="Content" ObjectID="_1221212610" r:id="rId30"/>
+                          <o:OLEObject Type="Embed" ProgID="" ShapeID="ole_rId28" DrawAspect="Content" ObjectID="_411935998" r:id="rId28"/>
                         </w:object>
                       </w:r>
                     </w:p>
@@ -5197,11 +5075,7 @@
       <w:bookmarkEnd w:id="23"/>
       <w:r>
         <w:rPr/>
-        <w:t xml:space="preserve">[RF004] Cadastrar </w:t>
-      </w:r>
-      <w:r>
-        <w:rPr/>
-        <w:t>Estádio</w:t>
+        <w:t>[RF004] Cadastrar Estádio</w:t>
       </w:r>
     </w:p>
     <w:tbl>
@@ -5905,11 +5779,7 @@
       <w:bookmarkEnd w:id="24"/>
       <w:r>
         <w:rPr/>
-        <w:t xml:space="preserve">[RF005] Consultar </w:t>
-      </w:r>
-      <w:r>
-        <w:rPr/>
-        <w:t>Estádio</w:t>
+        <w:t>[RF005] Consultar Estádio</w:t>
       </w:r>
     </w:p>
     <w:tbl>
@@ -6582,11 +6452,7 @@
       <w:bookmarkEnd w:id="25"/>
       <w:r>
         <w:rPr/>
-        <w:t xml:space="preserve">[RF006] Alterar </w:t>
-      </w:r>
-      <w:r>
-        <w:rPr/>
-        <w:t>Estádio</w:t>
+        <w:t>[RF006] Alterar Estádio</w:t>
       </w:r>
     </w:p>
     <w:tbl>
@@ -7290,11 +7156,7 @@
       <w:bookmarkEnd w:id="26"/>
       <w:r>
         <w:rPr/>
-        <w:t xml:space="preserve">[RF007] Excluir </w:t>
-      </w:r>
-      <w:r>
-        <w:rPr/>
-        <w:t>Estádio</w:t>
+        <w:t>[RF007] Excluir Estádio</w:t>
       </w:r>
     </w:p>
     <w:tbl>
@@ -17306,7 +17168,7 @@
         <mc:AlternateContent>
           <mc:Choice Requires="wps">
             <w:drawing>
-              <wp:anchor behindDoc="0" distT="0" distB="0" distL="109855" distR="114300" simplePos="0" locked="0" layoutInCell="0" allowOverlap="1" relativeHeight="6">
+              <wp:anchor distT="0" distB="0" distL="109220" distR="114300" simplePos="0" relativeHeight="6" behindDoc="0" locked="0" layoutInCell="0" allowOverlap="1">
                 <wp:simplePos x="0" y="0"/>
                 <wp:positionH relativeFrom="page">
                   <wp:posOffset>6309995</wp:posOffset>
@@ -17356,7 +17218,7 @@
                                 <w:color w:val="000000"/>
                               </w:rPr>
                               <w:object>
-                                <v:shapetype id="_x0000_tole_rId32" coordsize="21600,21600" o:spt="ole_rId32" o:preferrelative="t" path="m@4@5l@4@11@9@11@9@5xe" filled="f" stroked="f">
+                                <v:shapetype id="_x0000_tole_rId30" coordsize="21600,21600" o:spt="30" o:preferrelative="t" path="m@4@5l@4@11@9@11@9@5xe" filled="f" stroked="f">
                                   <v:stroke joinstyle="miter"/>
                                   <v:formulas>
                                     <v:f eqn="if lineDrawn pixelLineWidth 0"/>
@@ -17375,16 +17237,16 @@
                                   <v:path o:extrusionok="f" gradientshapeok="t" o:connecttype="rect"/>
                                   <o:lock v:ext="edit" aspectratio="t"/>
                                 </v:shapetype>
-                                <v:shape id="ole_rId32" type="_x0000_tole_rId32" style="width:29.05pt;height:37pt;mso-wrap-distance-right:0pt;mso-wrap-distance-bottom:24pt" filled="f" o:ole="">
-                                  <v:imagedata r:id="rId33" o:title=""/>
+                                <v:shape id="ole_rId30" type="_x0000_tole_rId30" style="width:29.05pt;height:37pt;mso-wrap-distance-right:0pt;mso-wrap-distance-bottom:24pt" filled="f" o:ole="">
+                                  <v:imagedata r:id="rId31" o:title=""/>
                                 </v:shape>
-                                <o:OLEObject Type="Embed" ProgID="" ShapeID="ole_rId32" DrawAspect="Content" ObjectID="_556873817" r:id="rId32"/>
+                                <o:OLEObject Type="Embed" ProgID="" ShapeID="ole_rId30" DrawAspect="Content" ObjectID="_1193892457" r:id="rId30"/>
                               </w:object>
                             </w:r>
                           </w:p>
                         </w:txbxContent>
                       </wps:txbx>
-                      <wps:bodyPr lIns="0" rIns="0" tIns="0" bIns="0" anchor="t">
+                      <wps:bodyPr lIns="0" tIns="0" rIns="0" bIns="0" anchor="t">
                         <a:noAutofit/>
                       </wps:bodyPr>
                     </wps:wsp>
@@ -17395,7 +17257,7 @@
           </mc:Choice>
           <mc:Fallback>
             <w:pict>
-              <v:rect id="shape_0" ID="Frame4" path="m0,0l-2147483645,0l-2147483645,-2147483646l0,-2147483646xe" stroked="f" o:allowincell="f" style="position:absolute;margin-left:496.85pt;margin-top:0.05pt;width:29pt;height:36.95pt;mso-wrap-style:none;v-text-anchor:middle;mso-position-horizontal-relative:page">
+              <v:rect id="shape_0" stroked="f" o:allowincell="f" style="position:absolute;margin-left:496.85pt;margin-top:0.05pt;width:29pt;height:36.95pt;mso-wrap-style:none;v-text-anchor:middle;mso-position-horizontal-relative:page">
                 <v:fill o:detectmouseclick="t" on="false"/>
                 <v:stroke color="#3465a4" joinstyle="round" endcap="flat"/>
                 <v:textbox>
@@ -17413,7 +17275,7 @@
                           <w:color w:val="000000"/>
                         </w:rPr>
                         <w:object>
-                          <v:shapetype id="_x0000_tole_rId34" coordsize="21600,21600" o:spt="ole_rId34" o:preferrelative="t" path="m@4@5l@4@11@9@11@9@5xe" filled="f" stroked="f">
+                          <v:shapetype id="_x0000_tole_rId32" coordsize="21600,21600" o:spt="32" o:preferrelative="t" path="m@4@5l@4@11@9@11@9@5xe" filled="f" stroked="f">
                             <v:stroke joinstyle="miter"/>
                             <v:formulas>
                               <v:f eqn="if lineDrawn pixelLineWidth 0"/>
@@ -17432,10 +17294,10 @@
                             <v:path o:extrusionok="f" gradientshapeok="t" o:connecttype="rect"/>
                             <o:lock v:ext="edit" aspectratio="t"/>
                           </v:shapetype>
-                          <v:shape id="ole_rId34" type="_x0000_tole_rId34" style="width:29.05pt;height:37pt;mso-wrap-distance-right:0pt;mso-wrap-distance-bottom:24pt" filled="f" o:ole="">
-                            <v:imagedata r:id="rId35" o:title=""/>
+                          <v:shape id="ole_rId32" type="_x0000_tole_rId32" style="width:29.05pt;height:37pt;mso-wrap-distance-right:0pt;mso-wrap-distance-bottom:24pt" filled="f" o:ole="">
+                            <v:imagedata r:id="rId33" o:title=""/>
                           </v:shape>
-                          <o:OLEObject Type="Embed" ProgID="" ShapeID="ole_rId34" DrawAspect="Content" ObjectID="_1325987769" r:id="rId34"/>
+                          <o:OLEObject Type="Embed" ProgID="" ShapeID="ole_rId32" DrawAspect="Content" ObjectID="_1706401125" r:id="rId32"/>
                         </w:object>
                       </w:r>
                     </w:p>
@@ -18883,12 +18745,12 @@
     <w:p>
       <w:pPr>
         <w:sectPr>
-          <w:headerReference w:type="even" r:id="rId36"/>
-          <w:headerReference w:type="default" r:id="rId37"/>
-          <w:headerReference w:type="first" r:id="rId38"/>
-          <w:footerReference w:type="even" r:id="rId39"/>
-          <w:footerReference w:type="default" r:id="rId40"/>
-          <w:footerReference w:type="first" r:id="rId41"/>
+          <w:headerReference w:type="even" r:id="rId34"/>
+          <w:headerReference w:type="default" r:id="rId35"/>
+          <w:headerReference w:type="first" r:id="rId36"/>
+          <w:footerReference w:type="even" r:id="rId37"/>
+          <w:footerReference w:type="default" r:id="rId38"/>
+          <w:footerReference w:type="first" r:id="rId39"/>
           <w:type w:val="nextPage"/>
           <w:pgSz w:w="11906" w:h="16838"/>
           <w:pgMar w:left="1440" w:right="1440" w:gutter="0" w:header="720" w:top="1440" w:footer="720" w:bottom="1440"/>
@@ -18915,7 +18777,7 @@
         <mc:AlternateContent>
           <mc:Choice Requires="wps">
             <w:drawing>
-              <wp:anchor behindDoc="0" distT="0" distB="0" distL="114300" distR="114300" simplePos="0" locked="0" layoutInCell="0" allowOverlap="1" relativeHeight="10" wp14:anchorId="3B645B6E">
+              <wp:anchor distT="0" distB="0" distL="114300" distR="114300" simplePos="0" relativeHeight="10" behindDoc="0" locked="0" layoutInCell="0" allowOverlap="1" wp14:anchorId="3B645B6E">
                 <wp:simplePos x="0" y="0"/>
                 <wp:positionH relativeFrom="page">
                   <wp:posOffset>6309995</wp:posOffset>
@@ -18970,7 +18832,7 @@
                                 <w:color w:val="000000"/>
                               </w:rPr>
                               <w:object>
-                                <v:shapetype id="_x0000_tole_rId42" coordsize="21600,21600" o:spt="ole_rId42" o:preferrelative="t" path="m@4@5l@4@11@9@11@9@5xe" filled="f" stroked="f">
+                                <v:shapetype id="_x0000_tole_rId40" coordsize="21600,21600" o:spt="40" o:preferrelative="t" path="m@4@5l@4@11@9@11@9@5xe" filled="f" stroked="f">
                                   <v:stroke joinstyle="miter"/>
                                   <v:formulas>
                                     <v:f eqn="if lineDrawn pixelLineWidth 0"/>
@@ -18989,16 +18851,16 @@
                                   <v:path o:extrusionok="f" gradientshapeok="t" o:connecttype="rect"/>
                                   <o:lock v:ext="edit" aspectratio="t"/>
                                 </v:shapetype>
-                                <v:shape id="ole_rId42" type="_x0000_tole_rId42" style="width:29.25pt;height:36.75pt;mso-wrap-distance-right:0pt;mso-wrap-distance-bottom:24pt" filled="t" fillcolor="#FFFFFF" o:ole="">
-                                  <v:imagedata r:id="rId43" o:title=""/>
+                                <v:shape id="ole_rId40" type="_x0000_tole_rId40" style="width:29.25pt;height:36.75pt;mso-wrap-distance-right:0pt;mso-wrap-distance-bottom:24pt" filled="t" fillcolor="#FFFFFF" o:ole="">
+                                  <v:imagedata r:id="rId41" o:title=""/>
                                 </v:shape>
-                                <o:OLEObject Type="Embed" ProgID="" ShapeID="ole_rId42" DrawAspect="Content" ObjectID="_111037457" r:id="rId42"/>
+                                <o:OLEObject Type="Embed" ProgID="" ShapeID="ole_rId40" DrawAspect="Content" ObjectID="_1514449963" r:id="rId40"/>
                               </w:object>
                             </w:r>
                           </w:p>
                         </w:txbxContent>
                       </wps:txbx>
-                      <wps:bodyPr lIns="0" rIns="0" tIns="0" bIns="0" anchor="t">
+                      <wps:bodyPr lIns="0" tIns="0" rIns="0" bIns="0" anchor="t">
                         <a:noAutofit/>
                       </wps:bodyPr>
                     </wps:wsp>
@@ -19009,7 +18871,7 @@
           </mc:Choice>
           <mc:Fallback>
             <w:pict>
-              <v:rect id="shape_0" ID="Frame5" path="m0,0l-2147483645,0l-2147483645,-2147483646l0,-2147483646xe" stroked="f" o:allowincell="f" style="position:absolute;margin-left:496.85pt;margin-top:0.05pt;width:28.95pt;height:36.9pt;mso-wrap-style:none;v-text-anchor:middle;mso-position-horizontal-relative:page" wp14:anchorId="3B645B6E">
+              <v:rect id="shape_0" stroked="f" o:allowincell="f" style="position:absolute;margin-left:496.85pt;margin-top:0.05pt;width:28.95pt;height:36.9pt;mso-wrap-style:none;v-text-anchor:middle;mso-position-horizontal-relative:page" wp14:anchorId="3B645B6E">
                 <v:fill o:detectmouseclick="t" on="false"/>
                 <v:stroke color="#3465a4" joinstyle="round" endcap="flat"/>
                 <v:textbox>
@@ -19032,7 +18894,7 @@
                           <w:color w:val="000000"/>
                         </w:rPr>
                         <w:object>
-                          <v:shapetype id="_x0000_tole_rId44" coordsize="21600,21600" o:spt="ole_rId44" o:preferrelative="t" path="m@4@5l@4@11@9@11@9@5xe" filled="f" stroked="f">
+                          <v:shapetype id="_x0000_tole_rId42" coordsize="21600,21600" o:spt="42" o:preferrelative="t" path="m@4@5l@4@11@9@11@9@5xe" filled="f" stroked="f">
                             <v:stroke joinstyle="miter"/>
                             <v:formulas>
                               <v:f eqn="if lineDrawn pixelLineWidth 0"/>
@@ -19051,10 +18913,10 @@
                             <v:path o:extrusionok="f" gradientshapeok="t" o:connecttype="rect"/>
                             <o:lock v:ext="edit" aspectratio="t"/>
                           </v:shapetype>
-                          <v:shape id="ole_rId44" type="_x0000_tole_rId44" style="width:29.25pt;height:36.75pt;mso-wrap-distance-right:0pt;mso-wrap-distance-bottom:24pt" filled="t" fillcolor="#FFFFFF" o:ole="">
-                            <v:imagedata r:id="rId45" o:title=""/>
+                          <v:shape id="ole_rId42" type="_x0000_tole_rId42" style="width:29.25pt;height:36.75pt;mso-wrap-distance-right:0pt;mso-wrap-distance-bottom:24pt" filled="t" fillcolor="#FFFFFF" o:ole="">
+                            <v:imagedata r:id="rId43" o:title=""/>
                           </v:shape>
-                          <o:OLEObject Type="Embed" ProgID="" ShapeID="ole_rId44" DrawAspect="Content" ObjectID="_749796616" r:id="rId44"/>
+                          <o:OLEObject Type="Embed" ProgID="" ShapeID="ole_rId42" DrawAspect="Content" ObjectID="_86460883" r:id="rId42"/>
                         </w:object>
                       </w:r>
                     </w:p>
@@ -19140,7 +19002,7 @@
         </w:rPr>
         <w:t xml:space="preserve">Prototipação da interface de usuário disponibilizada ferramenta Figma. Acesso pelo link: </w:t>
       </w:r>
-      <w:hyperlink r:id="rId46">
+      <w:hyperlink r:id="rId44">
         <w:r>
           <w:rPr>
             <w:rStyle w:val="Hyperlink"/>
@@ -19502,7 +19364,7 @@
       </w:pPr>
       <w:r>
         <w:drawing>
-          <wp:anchor behindDoc="0" distT="0" distB="0" distL="114300" distR="114300" simplePos="0" locked="0" layoutInCell="0" allowOverlap="1" relativeHeight="12">
+          <wp:anchor distT="0" distB="0" distL="114300" distR="114300" simplePos="0" relativeHeight="12" behindDoc="0" locked="0" layoutInCell="0" allowOverlap="1">
             <wp:simplePos x="0" y="0"/>
             <wp:positionH relativeFrom="column">
               <wp:posOffset>5375910</wp:posOffset>
@@ -19527,7 +19389,7 @@
                     </pic:cNvPicPr>
                   </pic:nvPicPr>
                   <pic:blipFill>
-                    <a:blip r:embed="rId47"/>
+                    <a:blip r:embed="rId45"/>
                     <a:srcRect l="-13" t="-9" r="-13" b="-9"/>
                     <a:stretch>
                       <a:fillRect/>
@@ -19542,7 +19404,7 @@
                       <a:avLst/>
                     </a:prstGeom>
                     <a:solidFill>
-                      <a:srgbClr val="ffffff"/>
+                      <a:srgbClr val="FFFFFF"/>
                     </a:solidFill>
                   </pic:spPr>
                 </pic:pic>
@@ -23830,8 +23692,8 @@
         </w:tblCellMar>
       </w:tblPr>
       <w:tblGrid>
-        <w:gridCol w:w="1696"/>
-        <w:gridCol w:w="3054"/>
+        <w:gridCol w:w="1695"/>
+        <w:gridCol w:w="3055"/>
         <w:gridCol w:w="1347"/>
         <w:gridCol w:w="899"/>
         <w:gridCol w:w="2030"/>
@@ -23840,7 +23702,7 @@
         <w:trPr/>
         <w:tc>
           <w:tcPr>
-            <w:tcW w:w="1696" w:type="dxa"/>
+            <w:tcW w:w="1695" w:type="dxa"/>
             <w:tcBorders>
               <w:top w:val="single" w:sz="4" w:space="0" w:color="BFBFBF"/>
               <w:left w:val="single" w:sz="4" w:space="0" w:color="BFBFBF"/>
@@ -23864,7 +23726,7 @@
         </w:tc>
         <w:tc>
           <w:tcPr>
-            <w:tcW w:w="3054" w:type="dxa"/>
+            <w:tcW w:w="3055" w:type="dxa"/>
             <w:tcBorders>
               <w:top w:val="single" w:sz="4" w:space="0" w:color="BFBFBF"/>
               <w:left w:val="single" w:sz="4" w:space="0" w:color="BFBFBF"/>
@@ -23963,7 +23825,7 @@
         <w:trPr/>
         <w:tc>
           <w:tcPr>
-            <w:tcW w:w="1696" w:type="dxa"/>
+            <w:tcW w:w="1695" w:type="dxa"/>
             <w:tcBorders>
               <w:top w:val="single" w:sz="4" w:space="0" w:color="BFBFBF"/>
               <w:left w:val="single" w:sz="4" w:space="0" w:color="BFBFBF"/>
@@ -23984,7 +23846,7 @@
         </w:tc>
         <w:tc>
           <w:tcPr>
-            <w:tcW w:w="3054" w:type="dxa"/>
+            <w:tcW w:w="3055" w:type="dxa"/>
             <w:tcBorders>
               <w:top w:val="single" w:sz="4" w:space="0" w:color="BFBFBF"/>
               <w:left w:val="single" w:sz="4" w:space="0" w:color="BFBFBF"/>
@@ -24071,7 +23933,7 @@
         <w:trPr/>
         <w:tc>
           <w:tcPr>
-            <w:tcW w:w="1696" w:type="dxa"/>
+            <w:tcW w:w="1695" w:type="dxa"/>
             <w:tcBorders>
               <w:top w:val="single" w:sz="4" w:space="0" w:color="BFBFBF"/>
               <w:left w:val="single" w:sz="4" w:space="0" w:color="BFBFBF"/>
@@ -24092,7 +23954,7 @@
         </w:tc>
         <w:tc>
           <w:tcPr>
-            <w:tcW w:w="3054" w:type="dxa"/>
+            <w:tcW w:w="3055" w:type="dxa"/>
             <w:tcBorders>
               <w:top w:val="single" w:sz="4" w:space="0" w:color="BFBFBF"/>
               <w:left w:val="single" w:sz="4" w:space="0" w:color="BFBFBF"/>
@@ -24179,7 +24041,7 @@
         <w:trPr/>
         <w:tc>
           <w:tcPr>
-            <w:tcW w:w="1696" w:type="dxa"/>
+            <w:tcW w:w="1695" w:type="dxa"/>
             <w:tcBorders>
               <w:top w:val="single" w:sz="4" w:space="0" w:color="BFBFBF"/>
               <w:left w:val="single" w:sz="4" w:space="0" w:color="BFBFBF"/>
@@ -24200,7 +24062,7 @@
         </w:tc>
         <w:tc>
           <w:tcPr>
-            <w:tcW w:w="3054" w:type="dxa"/>
+            <w:tcW w:w="3055" w:type="dxa"/>
             <w:tcBorders>
               <w:top w:val="single" w:sz="4" w:space="0" w:color="BFBFBF"/>
               <w:left w:val="single" w:sz="4" w:space="0" w:color="BFBFBF"/>
@@ -24287,7 +24149,7 @@
         <w:trPr/>
         <w:tc>
           <w:tcPr>
-            <w:tcW w:w="1696" w:type="dxa"/>
+            <w:tcW w:w="1695" w:type="dxa"/>
             <w:tcBorders>
               <w:top w:val="single" w:sz="4" w:space="0" w:color="BFBFBF"/>
               <w:left w:val="single" w:sz="4" w:space="0" w:color="BFBFBF"/>
@@ -24308,7 +24170,7 @@
         </w:tc>
         <w:tc>
           <w:tcPr>
-            <w:tcW w:w="3054" w:type="dxa"/>
+            <w:tcW w:w="3055" w:type="dxa"/>
             <w:tcBorders>
               <w:top w:val="single" w:sz="4" w:space="0" w:color="BFBFBF"/>
               <w:left w:val="single" w:sz="4" w:space="0" w:color="BFBFBF"/>
@@ -24395,7 +24257,7 @@
         <w:trPr/>
         <w:tc>
           <w:tcPr>
-            <w:tcW w:w="1696" w:type="dxa"/>
+            <w:tcW w:w="1695" w:type="dxa"/>
             <w:tcBorders>
               <w:top w:val="single" w:sz="4" w:space="0" w:color="BFBFBF"/>
               <w:left w:val="single" w:sz="4" w:space="0" w:color="BFBFBF"/>
@@ -24416,7 +24278,7 @@
         </w:tc>
         <w:tc>
           <w:tcPr>
-            <w:tcW w:w="3054" w:type="dxa"/>
+            <w:tcW w:w="3055" w:type="dxa"/>
             <w:tcBorders>
               <w:top w:val="single" w:sz="4" w:space="0" w:color="BFBFBF"/>
               <w:left w:val="single" w:sz="4" w:space="0" w:color="BFBFBF"/>
@@ -24511,12 +24373,12 @@
       </w:r>
     </w:p>
     <w:sectPr>
-      <w:headerReference w:type="even" r:id="rId48"/>
-      <w:headerReference w:type="default" r:id="rId49"/>
-      <w:headerReference w:type="first" r:id="rId50"/>
-      <w:footerReference w:type="even" r:id="rId51"/>
-      <w:footerReference w:type="default" r:id="rId52"/>
-      <w:footerReference w:type="first" r:id="rId53"/>
+      <w:headerReference w:type="even" r:id="rId46"/>
+      <w:headerReference w:type="default" r:id="rId47"/>
+      <w:headerReference w:type="first" r:id="rId48"/>
+      <w:footerReference w:type="even" r:id="rId49"/>
+      <w:footerReference w:type="default" r:id="rId50"/>
+      <w:footerReference w:type="first" r:id="rId51"/>
       <w:type w:val="nextPage"/>
       <w:pgSz w:w="11906" w:h="16838"/>
       <w:pgMar w:left="1440" w:right="1440" w:gutter="0" w:header="720" w:top="1440" w:footer="720" w:bottom="1440"/>
@@ -25435,7 +25297,7 @@
               <w:rStyle w:val="PageNumber"/>
               <w:lang w:eastAsia="en-US"/>
             </w:rPr>
-            <w:t>12</w:t>
+            <w:t>13</w:t>
           </w:r>
           <w:r>
             <w:rPr>
@@ -25477,7 +25339,7 @@
               <w:rStyle w:val="PageNumber"/>
               <w:lang w:eastAsia="en-US"/>
             </w:rPr>
-            <w:t>12</w:t>
+            <w:t>13</w:t>
           </w:r>
           <w:r>
             <w:rPr>
@@ -25588,7 +25450,7 @@
               <w:rStyle w:val="PageNumber"/>
               <w:lang w:eastAsia="en-US"/>
             </w:rPr>
-            <w:t>12</w:t>
+            <w:t>13</w:t>
           </w:r>
           <w:r>
             <w:rPr>
@@ -25630,7 +25492,7 @@
               <w:rStyle w:val="PageNumber"/>
               <w:lang w:eastAsia="en-US"/>
             </w:rPr>
-            <w:t>12</w:t>
+            <w:t>13</w:t>
           </w:r>
           <w:r>
             <w:rPr>
@@ -26660,8 +26522,8 @@
   <w:abstractNum w:abstractNumId="1">
     <w:lvl w:ilvl="0">
       <w:start w:val="1"/>
+      <w:numFmt w:val="none"/>
       <w:pStyle w:val="Heading1"/>
-      <w:numFmt w:val="none"/>
       <w:suff w:val="nothing"/>
       <w:lvlText w:val=""/>
       <w:lvlJc w:val="left"/>
@@ -26675,8 +26537,8 @@
     </w:lvl>
     <w:lvl w:ilvl="1">
       <w:start w:val="1"/>
+      <w:numFmt w:val="none"/>
       <w:pStyle w:val="Heading2"/>
-      <w:numFmt w:val="none"/>
       <w:suff w:val="nothing"/>
       <w:lvlText w:val=""/>
       <w:lvlJc w:val="left"/>
@@ -26690,8 +26552,8 @@
     </w:lvl>
     <w:lvl w:ilvl="2">
       <w:start w:val="1"/>
+      <w:numFmt w:val="bullet"/>
       <w:pStyle w:val="Heading3"/>
-      <w:numFmt w:val="bullet"/>
       <w:lvlText w:val=""/>
       <w:lvlJc w:val="left"/>
       <w:pPr>
@@ -26706,8 +26568,8 @@
     </w:lvl>
     <w:lvl w:ilvl="3">
       <w:start w:val="1"/>
+      <w:numFmt w:val="decimal"/>
       <w:pStyle w:val="Heading4"/>
-      <w:numFmt w:val="decimal"/>
       <w:lvlText w:val="%3.%4."/>
       <w:lvlJc w:val="left"/>
       <w:pPr>
@@ -26720,8 +26582,8 @@
     </w:lvl>
     <w:lvl w:ilvl="4">
       <w:start w:val="1"/>
+      <w:numFmt w:val="decimal"/>
       <w:pStyle w:val="Heading5"/>
-      <w:numFmt w:val="decimal"/>
       <w:lvlText w:val="%3.%4..%5"/>
       <w:lvlJc w:val="left"/>
       <w:pPr>
@@ -26734,8 +26596,8 @@
     </w:lvl>
     <w:lvl w:ilvl="5">
       <w:start w:val="1"/>
+      <w:numFmt w:val="decimal"/>
       <w:pStyle w:val="Heading6"/>
-      <w:numFmt w:val="decimal"/>
       <w:lvlText w:val="%3.%4..%5.%6"/>
       <w:lvlJc w:val="left"/>
       <w:pPr>
@@ -26748,8 +26610,8 @@
     </w:lvl>
     <w:lvl w:ilvl="6">
       <w:start w:val="1"/>
+      <w:numFmt w:val="decimal"/>
       <w:pStyle w:val="Heading7"/>
-      <w:numFmt w:val="decimal"/>
       <w:lvlText w:val="%3.%4..%5.%6.%7"/>
       <w:lvlJc w:val="left"/>
       <w:pPr>
@@ -26762,8 +26624,8 @@
     </w:lvl>
     <w:lvl w:ilvl="7">
       <w:start w:val="1"/>
+      <w:numFmt w:val="decimal"/>
       <w:pStyle w:val="Heading8"/>
-      <w:numFmt w:val="decimal"/>
       <w:lvlText w:val="%3.%4..%5.%6.%7.%8"/>
       <w:lvlJc w:val="left"/>
       <w:pPr>
@@ -26776,8 +26638,8 @@
     </w:lvl>
     <w:lvl w:ilvl="8">
       <w:start w:val="1"/>
+      <w:numFmt w:val="decimal"/>
       <w:pStyle w:val="Heading9"/>
-      <w:numFmt w:val="decimal"/>
       <w:lvlText w:val="%3.%4..%5.%6.%7.%8.%9"/>
       <w:lvlJc w:val="left"/>
       <w:pPr>
@@ -28467,8 +28329,8 @@
     <w:qFormat/>
     <w:rPr/>
   </w:style>
-  <w:style w:type="character" w:styleId="Bullets">
-    <w:name w:val="Bullets"/>
+  <w:style w:type="character" w:styleId="Bulletsuser">
+    <w:name w:val="Bullets (user)"/>
     <w:qFormat/>
     <w:rPr>
       <w:rFonts w:ascii="OpenSymbol" w:hAnsi="OpenSymbol" w:eastAsia="OpenSymbol" w:cs="OpenSymbol"/>
@@ -29262,8 +29124,8 @@
       <w:i/>
     </w:rPr>
   </w:style>
-  <w:style w:type="paragraph" w:styleId="FrameContentsuser">
-    <w:name w:val="Frame Contents (user)"/>
+  <w:style w:type="paragraph" w:styleId="FrameContents">
+    <w:name w:val="Frame Contents"/>
     <w:basedOn w:val="Normal"/>
     <w:qFormat/>
     <w:pPr/>
@@ -29292,8 +29154,8 @@
       <w:bCs/>
     </w:rPr>
   </w:style>
-  <w:style w:type="paragraph" w:styleId="FrameContents">
-    <w:name w:val="Frame Contents"/>
+  <w:style w:type="paragraph" w:styleId="FrameContentsuser">
+    <w:name w:val="Frame Contents (user)"/>
     <w:basedOn w:val="Normal"/>
     <w:qFormat/>
     <w:pPr/>
@@ -29438,37 +29300,37 @@
         <a:srgbClr val="000000"/>
       </a:dk1>
       <a:lt1>
-        <a:srgbClr val="ffffff"/>
+        <a:srgbClr val="FFFFFF"/>
       </a:lt1>
       <a:dk2>
         <a:srgbClr val="000000"/>
       </a:dk2>
       <a:lt2>
-        <a:srgbClr val="ffffff"/>
+        <a:srgbClr val="FFFFFF"/>
       </a:lt2>
       <a:accent1>
-        <a:srgbClr val="18a303"/>
+        <a:srgbClr val="18A303"/>
       </a:accent1>
       <a:accent2>
-        <a:srgbClr val="0369a3"/>
+        <a:srgbClr val="0369A3"/>
       </a:accent2>
       <a:accent3>
-        <a:srgbClr val="a33e03"/>
+        <a:srgbClr val="A33E03"/>
       </a:accent3>
       <a:accent4>
-        <a:srgbClr val="8e03a3"/>
+        <a:srgbClr val="8E03A3"/>
       </a:accent4>
       <a:accent5>
-        <a:srgbClr val="c99c00"/>
+        <a:srgbClr val="C99C00"/>
       </a:accent5>
       <a:accent6>
-        <a:srgbClr val="c9211e"/>
+        <a:srgbClr val="C9211E"/>
       </a:accent6>
       <a:hlink>
-        <a:srgbClr val="0000ee"/>
+        <a:srgbClr val="0000EE"/>
       </a:hlink>
       <a:folHlink>
-        <a:srgbClr val="551a8b"/>
+        <a:srgbClr val="551A8B"/>
       </a:folHlink>
     </a:clrScheme>
     <a:fontScheme name="Office">

</xml_diff>